<commit_message>
First Draft of Materials and Methods
</commit_message>
<xml_diff>
--- a/R/Thesis Draft - Geographic Variation in Echolocation Clicks of Risso's Dolphins in the California Current.docx
+++ b/R/Thesis Draft - Geographic Variation in Echolocation Clicks of Risso's Dolphins in the California Current.docx
@@ -55,13 +55,19 @@
         <w:t xml:space="preserve"> </w:t>
       </w:r>
       <w:r>
-        <w:t xml:space="preserve">(Grampus</w:t>
-      </w:r>
-      <w:r>
-        <w:t xml:space="preserve"> </w:t>
-      </w:r>
-      <w:r>
-        <w:t xml:space="preserve">griseus)</w:t>
+        <w:t xml:space="preserve">(</w:t>
+      </w:r>
+      <w:r>
+        <w:t xml:space="preserve">Grampus</w:t>
+      </w:r>
+      <w:r>
+        <w:t xml:space="preserve"> </w:t>
+      </w:r>
+      <w:r>
+        <w:t xml:space="preserve">griseus</w:t>
+      </w:r>
+      <w:r>
+        <w:t xml:space="preserve">)</w:t>
       </w:r>
       <w:r>
         <w:t xml:space="preserve"> </w:t>
@@ -106,26 +112,154 @@
         <w:pStyle w:val="FirstParagraph"/>
       </w:pPr>
       <w:r>
-        <w:t xml:space="preserve">Sarah M.S. Moseley, Anne Simonis, Ellen Hines, Marie A. Roch, Shannon Rankin</w:t>
+        <w:t xml:space="preserve">Sarah M.S. Moseley</w:t>
+      </w:r>
+      <w:r>
+        <w:rPr>
+          <w:vertAlign w:val="superscript"/>
+        </w:rPr>
+        <w:t xml:space="preserve">1</w:t>
+      </w:r>
+      <w:r>
+        <w:t xml:space="preserve">, Marie A. Roch</w:t>
+      </w:r>
+      <w:r>
+        <w:rPr>
+          <w:vertAlign w:val="superscript"/>
+        </w:rPr>
+        <w:t xml:space="preserve">2</w:t>
+      </w:r>
+      <w:r>
+        <w:t xml:space="preserve">, Shannon Rankin</w:t>
+      </w:r>
+      <w:r>
+        <w:rPr>
+          <w:vertAlign w:val="superscript"/>
+        </w:rPr>
+        <w:t xml:space="preserve">3</w:t>
+      </w:r>
+      <w:r>
+        <w:t xml:space="preserve">, Cory Hom-Weaver</w:t>
+      </w:r>
+      <w:r>
+        <w:rPr>
+          <w:vertAlign w:val="superscript"/>
+        </w:rPr>
+        <w:t xml:space="preserve">4</w:t>
+      </w:r>
+      <w:r>
+        <w:t xml:space="preserve">, Ellen Hines</w:t>
+      </w:r>
+      <w:r>
+        <w:rPr>
+          <w:vertAlign w:val="superscript"/>
+        </w:rPr>
+        <w:t xml:space="preserve">1</w:t>
+      </w:r>
+      <w:r>
+        <w:t xml:space="preserve">, Anne Simonis</w:t>
+      </w:r>
+      <w:r>
+        <w:rPr>
+          <w:vertAlign w:val="superscript"/>
+        </w:rPr>
+        <w:t xml:space="preserve">1</w:t>
+      </w:r>
+    </w:p>
+    <w:p>
+      <w:pPr>
+        <w:pStyle w:val="BodyText"/>
+      </w:pPr>
+      <w:r>
+        <w:rPr>
+          <w:vertAlign w:val="superscript"/>
+        </w:rPr>
+        <w:t xml:space="preserve">1</w:t>
+      </w:r>
+      <w:r>
+        <w:t xml:space="preserve"> </w:t>
+      </w:r>
+      <w:r>
+        <w:t xml:space="preserve">San Francisco State University</w:t>
+      </w:r>
+    </w:p>
+    <w:p>
+      <w:pPr>
+        <w:pStyle w:val="BodyText"/>
+      </w:pPr>
+      <w:r>
+        <w:rPr>
+          <w:vertAlign w:val="superscript"/>
+        </w:rPr>
+        <w:t xml:space="preserve">2</w:t>
+      </w:r>
+      <w:r>
+        <w:t xml:space="preserve"> </w:t>
+      </w:r>
+      <w:r>
+        <w:t xml:space="preserve">San Diego State University</w:t>
+      </w:r>
+    </w:p>
+    <w:p>
+      <w:pPr>
+        <w:pStyle w:val="BodyText"/>
+      </w:pPr>
+      <w:r>
+        <w:rPr>
+          <w:vertAlign w:val="superscript"/>
+        </w:rPr>
+        <w:t xml:space="preserve">3</w:t>
+      </w:r>
+      <w:r>
+        <w:t xml:space="preserve"> </w:t>
+      </w:r>
+      <w:r>
+        <w:t xml:space="preserve">NOAA SWFSC</w:t>
+      </w:r>
+    </w:p>
+    <w:p>
+      <w:pPr>
+        <w:pStyle w:val="BodyText"/>
+      </w:pPr>
+      <w:r>
+        <w:rPr>
+          <w:vertAlign w:val="superscript"/>
+        </w:rPr>
+        <w:t xml:space="preserve">4</w:t>
+      </w:r>
+      <w:r>
+        <w:t xml:space="preserve"> </w:t>
+      </w:r>
+      <w:r>
+        <w:t xml:space="preserve">Ocean Science Analytics</w:t>
       </w:r>
     </w:p>
     <w:bookmarkEnd w:id="20"/>
-    <w:bookmarkStart w:id="23" w:name="abstracts"/>
+    <w:bookmarkStart w:id="21" w:name="acknowledgements"/>
     <w:p>
       <w:pPr>
         <w:pStyle w:val="Heading1"/>
       </w:pPr>
       <w:r>
-        <w:t xml:space="preserve">Abstract(s)</w:t>
-      </w:r>
-    </w:p>
-    <w:bookmarkStart w:id="21" w:name="X713c334be73de46596c776d76b6f90d158ae479"/>
-    <w:p>
-      <w:pPr>
-        <w:pStyle w:val="Heading2"/>
-      </w:pPr>
-      <w:r>
-        <w:t xml:space="preserve">The following is the abstract used for submission to the ASA conference:</w:t>
+        <w:t xml:space="preserve">Acknowledgements</w:t>
+      </w:r>
+    </w:p>
+    <w:p>
+      <w:pPr>
+        <w:pStyle w:val="FirstParagraph"/>
+      </w:pPr>
+      <w:r>
+        <w:t xml:space="preserve">Committee, Co-authors, EOS Center, Simonis-Hines-Jahncke Lab, BOEM and NOAA for data collection, CSU COAST, ONR for graduate student support, Melissa Soldevilla, Soldevilla et al. 2017, Sara Keen</w:t>
+      </w:r>
+    </w:p>
+    <w:bookmarkEnd w:id="21"/>
+    <w:bookmarkStart w:id="22" w:name="i.-introduction"/>
+    <w:p>
+      <w:pPr>
+        <w:pStyle w:val="Heading1"/>
+      </w:pPr>
+      <w:r>
+        <w:t xml:space="preserve">I. Introduction</w:t>
       </w:r>
     </w:p>
     <w:p>
@@ -143,17 +277,375 @@
         <w:t xml:space="preserve">Grampus griseus</w:t>
       </w:r>
       <w:r>
-        <w:t xml:space="preserve">) produce broadband echolocation clicks that vary across regions, offering insight into population structure and habitat use. Two stocks are recognized in U.S. Pacific waters: the California–Oregon–Washington stock and the Hawaiian stock, but these designations may overlook finer-scale structure within the California Current Ecosystem (CCE). Building on evidence of geographic variation in Risso’s dolphin echolocation click types across the U.S. East Coast, Gulf of Mexico, Southern California Bight, and Hawaiian Islands, spectral peak and notch frequencies were measured from Risso’s dolphin echolocation clicks during three NOAA surveys between 2016 and 2023. Acoustic recordings were collected with drifting buoys, allowing broad coverage of the entire CCE region along the U.S. West Coast. Clustering of spectral features highlighted several different click types. We compared spatio-temporal variation in Risso’s click types across Oregon, Northern California, and Central California, including seasonal and diel variation. These results provide the first comprehensive assessment of Risso’s dolphin click characteristics across the CCE and enable comparison with other U.S. regions where click-type divergence has been observed. Fine-scale spatial, seasonal, and diel acoustic patterns can inform population assessment, ecological understanding, and ecosystem-based management.</w:t>
-      </w:r>
-    </w:p>
-    <w:bookmarkEnd w:id="21"/>
-    <w:bookmarkStart w:id="22" w:name="Xc7c64fbd841fff5ae32fad323b46f1a24f199a8"/>
+        <w:t xml:space="preserve">) are globally distributed, deep-diving odontocetes primarily found in temperate and tropical environments, where they are commonly associated with continental slope and offshore habitats</w:t>
+      </w:r>
+      <w:r>
+        <w:t xml:space="preserve"> </w:t>
+      </w:r>
+      <w:r>
+        <w:t xml:space="preserve">(Baird 2009)</w:t>
+      </w:r>
+      <w:r>
+        <w:t xml:space="preserve">. Despite their broad distribution, Risso’s ecology and population structure remain relatively unstudied</w:t>
+      </w:r>
+      <w:r>
+        <w:t xml:space="preserve"> </w:t>
+      </w:r>
+      <w:r>
+        <w:t xml:space="preserve">(Jefferson et al. 2017)</w:t>
+      </w:r>
+      <w:r>
+        <w:t xml:space="preserve">. As with many pelagic cetaceans, studying Risso’s dolphins presents challenges as animals occupy large and dynamic habitats, are difficult to observe consistently over time and space, and may exhibit biological structuring that is not readily apparent from visual surveys alone</w:t>
+      </w:r>
+      <w:r>
+        <w:t xml:space="preserve"> </w:t>
+      </w:r>
+      <w:r>
+        <w:t xml:space="preserve">(Forney and Barlow 1998; Smith et al. 2020)</w:t>
+      </w:r>
+      <w:r>
+        <w:t xml:space="preserve">. As a result, uncertainty introduced by these challenges complicates efforts to define biological population boundaries, yet such boundaries are pivotal to effective species management and conservation</w:t>
+      </w:r>
+      <w:r>
+        <w:t xml:space="preserve"> </w:t>
+      </w:r>
+      <w:r>
+        <w:t xml:space="preserve">(Carretta et al. 2024; Grech, Sheppard, and Marsh 2011)</w:t>
+      </w:r>
+      <w:r>
+        <w:t xml:space="preserve">.</w:t>
+      </w:r>
+    </w:p>
+    <w:p>
+      <w:pPr>
+        <w:pStyle w:val="BodyText"/>
+      </w:pPr>
+      <w:r>
+        <w:t xml:space="preserve">Along the United States West Coast within the United States Exclusive Economic Zone (US EEZ), Risso’s dolphins are managed within one, broad</w:t>
+      </w:r>
+      <w:r>
+        <w:t xml:space="preserve"> </w:t>
+      </w:r>
+      <w:r>
+        <w:t xml:space="preserve">“</w:t>
+      </w:r>
+      <w:r>
+        <w:t xml:space="preserve">stock</w:t>
+      </w:r>
+      <w:r>
+        <w:t xml:space="preserve">”</w:t>
+      </w:r>
+      <w:r>
+        <w:t xml:space="preserve"> </w:t>
+      </w:r>
+      <w:r>
+        <w:t xml:space="preserve">delineation defined for assessment and conservation purposes – the California-Oregon-Washington (CA-OR-WA) stock</w:t>
+      </w:r>
+      <w:r>
+        <w:t xml:space="preserve"> </w:t>
+      </w:r>
+      <w:r>
+        <w:t xml:space="preserve">(Carretta et al. 2024)</w:t>
+      </w:r>
+      <w:r>
+        <w:t xml:space="preserve">. The offshore extent of this stock’s boundaries are unknown, and the currently recognized management unit may overlook multiple independent populations</w:t>
+      </w:r>
+      <w:r>
+        <w:t xml:space="preserve"> </w:t>
+      </w:r>
+      <w:r>
+        <w:t xml:space="preserve">(Carretta et al. 2024)</w:t>
+      </w:r>
+      <w:r>
+        <w:t xml:space="preserve">. For this reason, any independent line of evidence that helps to evaluate spatial and temporal structuring within this broadly managed system is scientifically and practically valuable</w:t>
+      </w:r>
+      <w:r>
+        <w:t xml:space="preserve"> </w:t>
+      </w:r>
+      <w:r>
+        <w:t xml:space="preserve">(Martien et al. 2019)</w:t>
+      </w:r>
+      <w:r>
+        <w:t xml:space="preserve">.</w:t>
+      </w:r>
+    </w:p>
+    <w:p>
+      <w:pPr>
+        <w:pStyle w:val="BodyText"/>
+      </w:pPr>
+      <w:r>
+        <w:t xml:space="preserve">This exploration is especially relevant in the California Current Ecosystem (CCE) – a large, eastern boundary current characterized by strong gradients in bathymetry, productivity, oceanography, species diversity, anthropogenic impact, and prey availability</w:t>
+      </w:r>
+      <w:r>
+        <w:t xml:space="preserve"> </w:t>
+      </w:r>
+      <w:r>
+        <w:t xml:space="preserve">(McClatchie 2025)</w:t>
+      </w:r>
+      <w:r>
+        <w:t xml:space="preserve">. Such heterogeneity lends itself to shaping cetacean distribution, use of habitat, and foraging behavior across space and time</w:t>
+      </w:r>
+      <w:r>
+        <w:t xml:space="preserve"> </w:t>
+      </w:r>
+      <w:r>
+        <w:t xml:space="preserve">(Barlow and Forney 2007)</w:t>
+      </w:r>
+      <w:r>
+        <w:t xml:space="preserve">. As an offshore species associated with deep-water habitats, for Risso’s dolphins the CCE provides a biologically meaningful setting in which to explore temporal and geographic variation in the acoustic characteristics of the species within a single, dynamic ecosystem</w:t>
+      </w:r>
+      <w:r>
+        <w:t xml:space="preserve"> </w:t>
+      </w:r>
+      <w:r>
+        <w:t xml:space="preserve">(Barlow and Forney 2007; Forney and Barlow 1998)</w:t>
+      </w:r>
+      <w:r>
+        <w:t xml:space="preserve">.</w:t>
+      </w:r>
+    </w:p>
+    <w:p>
+      <w:pPr>
+        <w:pStyle w:val="BodyText"/>
+      </w:pPr>
+      <w:r>
+        <w:t xml:space="preserve">Passive Acoustic monitoring (PAM) is particularly well suited to address these questions as odontocetes rely heavily on sound for prey detection, navigation, and social interaction, and acoustic methods can identify and record animals in locations and conditions where visuals methods are unable to</w:t>
+      </w:r>
+      <w:r>
+        <w:t xml:space="preserve"> </w:t>
+      </w:r>
+      <w:r>
+        <w:t xml:space="preserve">(Mellinger and Barlow 2003)</w:t>
+      </w:r>
+      <w:r>
+        <w:t xml:space="preserve">. In this study, drifting passive acoustic monitoring was utilized to survey acoustic activity throughout the CCE. Drifting PAM is especially valuable because it provides an effective balance between the geographic resolution of towed systems and the temporal resolution of fixed seafloor recorders. With relatively low cost and flexible deployment, broader spatial coverage is achieved, making it especially well suited for surveying mobile and elusive species directly within the water column</w:t>
+      </w:r>
+      <w:r>
+        <w:t xml:space="preserve"> </w:t>
+      </w:r>
+      <w:r>
+        <w:t xml:space="preserve">(Rankin et al. 2025)</w:t>
+      </w:r>
+      <w:r>
+        <w:t xml:space="preserve">. In a system such as the CCE, drifting PAM allows fine-scale characterization of acoustic patterns that would otherwise be challenging to capture</w:t>
+      </w:r>
+      <w:r>
+        <w:t xml:space="preserve"> </w:t>
+      </w:r>
+      <w:r>
+        <w:t xml:space="preserve">(Rankin et al. 2025; Simonis et al. 2020)</w:t>
+      </w:r>
+      <w:r>
+        <w:t xml:space="preserve">.</w:t>
+      </w:r>
+    </w:p>
+    <w:p>
+      <w:pPr>
+        <w:pStyle w:val="BodyText"/>
+      </w:pPr>
+      <w:r>
+        <w:t xml:space="preserve">Risso’s dolphin echolocation clicks serve as valuable markers for this kind of analysis as they exhibit distinct spectral banding – specifically recurring peaks and notches in the shape of the spectra</w:t>
+      </w:r>
+      <w:r>
+        <w:t xml:space="preserve"> </w:t>
+      </w:r>
+      <w:r>
+        <w:t xml:space="preserve">(Soldevilla et al. 2008)</w:t>
+      </w:r>
+      <w:r>
+        <w:t xml:space="preserve">. These spectral features are hypothesized to reflect the impacts of morphological structures within the sound production and propagation process, and are stable enough to allow for species identification</w:t>
+      </w:r>
+      <w:r>
+        <w:t xml:space="preserve"> </w:t>
+      </w:r>
+      <w:r>
+        <w:t xml:space="preserve">(Cranford, Amundin, and Norris 1996; McKenna et al. 2012; Soldevilla et al. 2008; Soldevilla, Wiggins, and Hildebrand 2010)</w:t>
+      </w:r>
+      <w:r>
+        <w:t xml:space="preserve">. More importantly for this study, spectral banding in the echolocation clicks of Risso’s dolphins provides a measurable framework for comparison of click structure across encounters, regions, and time</w:t>
+      </w:r>
+      <w:r>
+        <w:t xml:space="preserve"> </w:t>
+      </w:r>
+      <w:r>
+        <w:t xml:space="preserve">(Soldevilla et al. 2017)</w:t>
+      </w:r>
+      <w:r>
+        <w:t xml:space="preserve">. If spectral characteristics vary systematically, such variation could indicate morphological, behavioral, ecological, or population differences</w:t>
+      </w:r>
+      <w:r>
+        <w:t xml:space="preserve"> </w:t>
+      </w:r>
+      <w:r>
+        <w:t xml:space="preserve">(Soldevilla et al. 2008, 2017)</w:t>
+      </w:r>
+      <w:r>
+        <w:t xml:space="preserve">.</w:t>
+      </w:r>
+    </w:p>
+    <w:p>
+      <w:pPr>
+        <w:pStyle w:val="BodyText"/>
+      </w:pPr>
+      <w:r>
+        <w:t xml:space="preserve">Beyond direct comparison of peak and notch frequencies, advances in unsupervised learning approaches provide an opportunity to examine variation at the echolocation click spectral-level. Dimensionality reduction and clustering techniques have been increasingly applied in bioacoustics to identify recurring signal types, characterize vocal repertoires, and explore structure within large spatial and temporal scale acoustic datatsets</w:t>
+      </w:r>
+      <w:r>
+        <w:t xml:space="preserve"> </w:t>
+      </w:r>
+      <w:r>
+        <w:t xml:space="preserve">(Best et al. 2023)</w:t>
+      </w:r>
+      <w:r>
+        <w:t xml:space="preserve">. In particular, dimensionality reduction approaches such as Uniform Manifold Approximation and Projection (UMAP) can be used to summarize highly complex, high-dimensional acoustic features and preserve biologically meaningful relationships among signals, while density-based clustering methods, such as Hierarchical Density-Based Spatial Clustering of Applications with Noise (HDBSCAN), provide a way to identify recurring signal types without requiring manual cluster number specification</w:t>
+      </w:r>
+      <w:r>
+        <w:t xml:space="preserve"> </w:t>
+      </w:r>
+      <w:r>
+        <w:t xml:space="preserve">(Alexander et al. 2025; Best et al. 2023; McInnes, Healy, and Astels 2017; McInnes, Healy, and Melville 2020)</w:t>
+      </w:r>
+      <w:r>
+        <w:t xml:space="preserve">. Together, these approaches provide a solid framework for investigation into spectral-temporal variation among echolocation clicks and identifying recurring click types within large PAM datasets.</w:t>
+      </w:r>
+    </w:p>
+    <w:p>
+      <w:pPr>
+        <w:pStyle w:val="BodyText"/>
+      </w:pPr>
+      <w:r>
+        <w:t xml:space="preserve">Previous studies by</w:t>
+      </w:r>
+      <w:r>
+        <w:t xml:space="preserve"> </w:t>
+      </w:r>
+      <w:r>
+        <w:t xml:space="preserve">Soldevilla et al. (2008)</w:t>
+      </w:r>
+      <w:r>
+        <w:t xml:space="preserve"> </w:t>
+      </w:r>
+      <w:r>
+        <w:t xml:space="preserve">and</w:t>
+      </w:r>
+      <w:r>
+        <w:t xml:space="preserve"> </w:t>
+      </w:r>
+      <w:r>
+        <w:t xml:space="preserve">Soldevilla et al. (2017)</w:t>
+      </w:r>
+      <w:r>
+        <w:t xml:space="preserve"> </w:t>
+      </w:r>
+      <w:r>
+        <w:t xml:space="preserve">have shown Risso’s echolocation clicks to consistently possess spectral banding structure across regions, with banding structure and associated frequency shifts suggesting geographic variation. This foundational work established an important baseline for species identification and raised the question as to the possible biological meaning behind click variation. However, while</w:t>
+      </w:r>
+      <w:r>
+        <w:t xml:space="preserve"> </w:t>
+      </w:r>
+      <w:r>
+        <w:t xml:space="preserve">Soldevilla et al. (2008)</w:t>
+      </w:r>
+      <w:r>
+        <w:t xml:space="preserve">,</w:t>
+      </w:r>
+      <w:r>
+        <w:t xml:space="preserve"> </w:t>
+      </w:r>
+      <w:r>
+        <w:t xml:space="preserve">Soldevilla et al. (2017)</w:t>
+      </w:r>
+      <w:r>
+        <w:t xml:space="preserve"> </w:t>
+      </w:r>
+      <w:r>
+        <w:t xml:space="preserve">characterize spectral characteristics and variation of Risso’s clicks in regions such as the U.S. East Coast, Gulf of Mexico, Hawaiian Islands, and the Southern California Bight, the CCE has not be studied as its own ecosystem-scale case</w:t>
+      </w:r>
+      <w:r>
+        <w:t xml:space="preserve"> </w:t>
+      </w:r>
+      <w:r>
+        <w:t xml:space="preserve">(Rankin et al. 2025)</w:t>
+      </w:r>
+      <w:r>
+        <w:t xml:space="preserve">. What remains unclear is how spectral structure varies within the CCE itself as an environmentally heterogeneous and ecologically important region</w:t>
+      </w:r>
+      <w:r>
+        <w:t xml:space="preserve"> </w:t>
+      </w:r>
+      <w:r>
+        <w:t xml:space="preserve">(McClatchie 2025; Soldevilla et al. 2017)</w:t>
+      </w:r>
+    </w:p>
+    <w:p>
+      <w:pPr>
+        <w:pStyle w:val="BodyText"/>
+      </w:pPr>
+      <w:r>
+        <w:t xml:space="preserve">Addressing this knowledge gap is relevant for both management and ecology. Characterization of Risso’s dolphin click spectra across the CCE can improve interpretation of PAM detection, assist in refining regional habitat use understanding, and provide additional context relevant to biological structuring within a broadly managed offshore environment</w:t>
+      </w:r>
+      <w:r>
+        <w:t xml:space="preserve"> </w:t>
+      </w:r>
+      <w:r>
+        <w:t xml:space="preserve">(Barlow and Forney 2007; Carretta et al. 2024; Forney and Barlow 1998; Soldevilla et al. 2017)</w:t>
+      </w:r>
+      <w:r>
+        <w:t xml:space="preserve">. It also places the CCE in the broader bio-geographic context of pre-existing population variation patterns while establishing the baseline needed to interpret acoustic trends within the ecosystem</w:t>
+      </w:r>
+      <w:r>
+        <w:t xml:space="preserve"> </w:t>
+      </w:r>
+      <w:r>
+        <w:t xml:space="preserve">(Soldevilla, Wiggins, and Hildebrand 2010; Soldevilla et al. 2017)</w:t>
+      </w:r>
+      <w:r>
+        <w:t xml:space="preserve">. In an era of increasing offshore anthropogenic impact, stronger foundational understanding is both scientifically and practically important across the CCE</w:t>
+      </w:r>
+      <w:r>
+        <w:t xml:space="preserve"> </w:t>
+      </w:r>
+      <w:r>
+        <w:t xml:space="preserve">(Andrews et al. 2015; Carretta et al. 2024; Van Parijs et al. 2023)</w:t>
+      </w:r>
+      <w:r>
+        <w:t xml:space="preserve">.</w:t>
+      </w:r>
+    </w:p>
+    <w:p>
+      <w:pPr>
+        <w:pStyle w:val="BodyText"/>
+      </w:pPr>
+      <w:r>
+        <w:t xml:space="preserve">This study examines the echolocation clicks of Risso’s dolphins within the CCE and serves as the first comprehensive assessment of Risso’s dolphin click characteristics across the CCE – enabling comparison with other US regions where click-type divergence has been observed. First, click events were screened for quality through manual inspection to exclude background noise and non-target signals, and spectra were smoothed to enhance consistent banding structure. Next, a spectral-temporal clustering framework incorporating principal component analysis (PCA), UMAP, and HDBSCAN was used to identify recurring click types across encounters. Finally, the geographic distribution and spectral characteristics of identified click types were evaluated throughout the CCE and compared with patterns previously described by</w:t>
+      </w:r>
+      <w:r>
+        <w:t xml:space="preserve"> </w:t>
+      </w:r>
+      <w:r>
+        <w:t xml:space="preserve">Soldevilla et al. (2017)</w:t>
+      </w:r>
+      <w:r>
+        <w:t xml:space="preserve">.</w:t>
+      </w:r>
+    </w:p>
+    <w:bookmarkEnd w:id="22"/>
+    <w:bookmarkStart w:id="29" w:name="ii.-materials-and-methods"/>
+    <w:p>
+      <w:pPr>
+        <w:pStyle w:val="Heading1"/>
+      </w:pPr>
+      <w:r>
+        <w:t xml:space="preserve">II. Materials and Methods</w:t>
+      </w:r>
+    </w:p>
+    <w:bookmarkStart w:id="23" w:name="Xb11bf955ab4723df6efc69c04c2bdf4ac91893c"/>
     <w:p>
       <w:pPr>
         <w:pStyle w:val="Heading2"/>
       </w:pPr>
       <w:r>
-        <w:t xml:space="preserve">The following is the abstract used for submission to the SMM conference:</w:t>
+        <w:t xml:space="preserve">A. Field Sites, Acoustic Survey Design, and Data Collection</w:t>
       </w:r>
     </w:p>
     <w:p>
@@ -161,27 +653,7 @@
         <w:pStyle w:val="FirstParagraph"/>
       </w:pPr>
       <w:r>
-        <w:rPr>
-          <w:b/>
-          <w:bCs/>
-        </w:rPr>
-        <w:t xml:space="preserve">Use of passive acoustic monitoring to assess population structure in Risso’s dolphins (</w:t>
-      </w:r>
-      <w:r>
-        <w:rPr>
-          <w:b/>
-          <w:bCs/>
-          <w:i/>
-          <w:iCs/>
-        </w:rPr>
-        <w:t xml:space="preserve">Grampus griseus</w:t>
-      </w:r>
-      <w:r>
-        <w:rPr>
-          <w:b/>
-          <w:bCs/>
-        </w:rPr>
-        <w:t xml:space="preserve">) across the California Current Ecosystem</w:t>
+        <w:t xml:space="preserve">The acoustic data used in this study were collected as part of three off-shore acoustic surveys conducted by National Oceanographic and Atmospheric Administration Southwest Fisheries Science Center (NOAA SWFSC) and the Bureau of Ocean Energy Management (BOEM). For this study, field data collection was not involved; instead, it makes use of the collected PAM datatsets generated during these coordinated inter-agency efforts.</w:t>
       </w:r>
     </w:p>
     <w:p>
@@ -189,346 +661,381 @@
         <w:pStyle w:val="BodyText"/>
       </w:pPr>
       <w:r>
-        <w:t xml:space="preserve">Risso’s dolphins (</w:t>
-      </w:r>
+        <w:t xml:space="preserve">The three surveys included in this study were the Passive Acoustic Survey of Cetacean Abundance Levels (PASCAL, 2016), the California Current Ecosystem Survey (CCES, 2018), and Adrift in the California Current (Adrift, 2020-2023)</w:t>
+      </w:r>
+      <w:r>
+        <w:t xml:space="preserve"> </w:t>
+      </w:r>
+      <w:r>
+        <w:t xml:space="preserve">(Keating et al. 2018; Simonis et al. 2020; Rankin et al. 2025)</w:t>
+      </w:r>
+      <w:r>
+        <w:t xml:space="preserve">. Together these surveys allow for broad-scale spatial and temporal coverage of the CCE, spanning from the south tip of the Baja California Peninsula to the Washington/Canadian border. In combining the three surveys, both near-shore and off-shore waters of the CCE were accounted for, including focal regions associated with proposed off-shore wind energy development along the U.S. West Coast; Morro Bay, off-shore San Francisco, and Humboldt Bay in California, and Brookings and Coos Bay in Oregon</w:t>
+      </w:r>
+      <w:r>
+        <w:t xml:space="preserve"> </w:t>
+      </w:r>
+      <w:r>
+        <w:t xml:space="preserve">(Rankin et al. 2025)</w:t>
+      </w:r>
+      <w:r>
+        <w:t xml:space="preserve">.</w:t>
+      </w:r>
+    </w:p>
+    <w:p>
+      <w:pPr>
+        <w:pStyle w:val="BodyText"/>
+      </w:pPr>
+      <w:r>
+        <w:t xml:space="preserve">The acoustic recordings used from these surveys were collected using drifting passive acoustic recorders made up of a buoy and satellite GPS at the surface, with a vertically suspended hydrophone array and autonomous recorder positioned at depth. The devices were designed to flow freely currents and weather patterns while continuously keeping the recording instruments deep enough to reduce surface noise contamination.</w:t>
+      </w:r>
+    </w:p>
+    <w:p>
+      <w:pPr>
+        <w:pStyle w:val="BodyText"/>
+      </w:pPr>
+      <w:r>
+        <w:t xml:space="preserve">The hydrophone array was deployed approximately 100 meters down in the water column and was composed of two vertically spaced hydrophones placed approximately 5 meters apart allowing for improved acoustic detections using triangulation. The recording components were programmed to sample at a minimum sampling rate of 288 kHz, allowing for broadband acoustic signals to be captured, with the Adrift survey sampling continuously and PASCAL and CCES utilizing duty cycling resulting in 2 minute acoustic files. To ensure comparability across deployments, this study is restricted to recordings collected using SoundTrap recorders equipped with a HTI-92WB hydrophone model. This works to minimize variability in factors that could otherwise negate comparisons of acoustic detections.</w:t>
+      </w:r>
+    </w:p>
+    <w:p>
+      <w:pPr>
+        <w:pStyle w:val="BodyText"/>
+      </w:pPr>
+      <w:r>
+        <w:t xml:space="preserve">The drifting acoustic recorders were tracked via the GPS surface buoys, allowing for the reconstruction, visualization, and analysis of the drift trajectories and spatial context. Recorders were deployed as individual drifts or as part of a cluster, dependent upon survey design, with the clustered deployments facilitating better spatial understanding of acoustic detections.</w:t>
+      </w:r>
+    </w:p>
+    <w:p>
+      <w:pPr>
+        <w:pStyle w:val="BodyText"/>
+      </w:pPr>
+      <w:r>
+        <w:t xml:space="preserve">Due to the off-shore nature of the acoustic surveys, environmental conditions, such as strong currents and surface motion, sometimes introduced self-noise (e.g. strumming of the array), and was considered during later data quality assessment and pre-processing by NOAA analysts.</w:t>
+      </w:r>
+    </w:p>
+    <w:p>
+      <w:pPr>
+        <w:pStyle w:val="BodyText"/>
+      </w:pPr>
+      <w:r>
+        <w:t xml:space="preserve">Comprehensive descriptions of survey objectives, deployment methodologies, instrumentation specifications, quality assurance procedures, and broader data processing workflows are provided in the corresponding PASCAL, CCES, and Adrift survey reports</w:t>
+      </w:r>
+      <w:r>
+        <w:t xml:space="preserve"> </w:t>
+      </w:r>
+      <w:r>
+        <w:t xml:space="preserve">(Keating et al. 2018; Rankin et al. 2025; Simonis et al. 2020)</w:t>
+      </w:r>
+      <w:r>
+        <w:t xml:space="preserve">.</w:t>
+      </w:r>
+    </w:p>
+    <w:bookmarkEnd w:id="23"/>
+    <w:bookmarkStart w:id="24" w:name="Xf8f607feced794e2d706b98caf34a6b8d085611"/>
+    <w:p>
+      <w:pPr>
+        <w:pStyle w:val="Heading2"/>
+      </w:pPr>
+      <w:r>
+        <w:t xml:space="preserve">B. Signal Processing and Click Feature Extraction</w:t>
+      </w:r>
+    </w:p>
+    <w:p>
+      <w:pPr>
+        <w:pStyle w:val="FirstParagraph"/>
+      </w:pPr>
+      <w:r>
+        <w:t xml:space="preserve">Acoustic recordings from the PASCAL, CCES, and Adrift surveys were initially pre-processed by NOAA analysts resulting in the identification of acoustic events of multiple species, including Risso’s dolphins</w:t>
+      </w:r>
+      <w:r>
+        <w:t xml:space="preserve"> </w:t>
+      </w:r>
+      <w:r>
+        <w:t xml:space="preserve">(Rankin et al. 2025)</w:t>
+      </w:r>
+      <w:r>
+        <w:t xml:space="preserve">. From these analyst-labelled events, broadband echolocation clicks were identified using a customized detection workflow within the PAMguard software [version 2.02.15;</w:t>
+      </w:r>
+      <w:r>
+        <w:t xml:space="preserve"> </w:t>
+      </w:r>
+      <w:r>
+        <w:t xml:space="preserve">Gillespie et al. (2008)</w:t>
+      </w:r>
+      <w:r>
+        <w:t xml:space="preserve">]. Click detection utilized a 15 dB signal-to-noise (SNR) threshold. Echolocation clicks were grouped into categories dependent upon click peak frequency, with each category identified by a symbol and shape, paralleling the systems used by</w:t>
+      </w:r>
+      <w:r>
+        <w:t xml:space="preserve"> </w:t>
+      </w:r>
+      <w:r>
+        <w:t xml:space="preserve">Simonis et al. (2020)</w:t>
+      </w:r>
+      <w:r>
+        <w:t xml:space="preserve"> </w:t>
+      </w:r>
+      <w:r>
+        <w:t xml:space="preserve">and</w:t>
+      </w:r>
+      <w:r>
+        <w:t xml:space="preserve"> </w:t>
+      </w:r>
+      <w:r>
+        <w:t xml:space="preserve">Keating et al. (2018)</w:t>
+      </w:r>
+      <w:r>
+        <w:t xml:space="preserve">. The categories for peak frequencies of the classification of clicks were 2-15, 15-30, 30-50, and 50-80 kHz. The workflow also estimated the received vertical angle of the identified echolocation clicks using the two hydrophones of the vertical array to determine the time-difference-of arrival of the clicks</w:t>
+      </w:r>
+      <w:r>
+        <w:t xml:space="preserve"> </w:t>
+      </w:r>
+      <w:r>
+        <w:t xml:space="preserve">(Keating et al. 2018; Simonis et al. 2020)</w:t>
+      </w:r>
+      <w:r>
+        <w:t xml:space="preserve">.</w:t>
+      </w:r>
+    </w:p>
+    <w:p>
+      <w:pPr>
+        <w:pStyle w:val="BodyText"/>
+      </w:pPr>
+      <w:r>
+        <w:t xml:space="preserve">Events were organized into event-level databases, binaries, and acoustic study files for subsequent review and analysis. From these events, concatenated spectrograms and mean spectra were generated in R in order to facilitate visual inspection and species confirmation.</w:t>
+      </w:r>
+    </w:p>
+    <w:p>
+      <w:pPr>
+        <w:pStyle w:val="BodyText"/>
+      </w:pPr>
+      <w:r>
+        <w:t xml:space="preserve">To limit the inclusion of non-target echolocation clicks, each candidate Risso’s event was manually reviewed through the comparison of concatenated spectrograms, spectra, and broader event context. Events were retained as usable events only when displaying the anticipated spectral banding signature of Risso’ dolphins, containing more than 100 echolocation clicks to ensure sufficient representation of spectra structure, and not overlapping with recorded detections of other cetacean species</w:t>
+      </w:r>
+      <w:r>
+        <w:t xml:space="preserve"> </w:t>
+      </w:r>
+      <w:r>
+        <w:t xml:space="preserve">(Soldevilla et al. 2017)</w:t>
+      </w:r>
+      <w:r>
+        <w:t xml:space="preserve">. Additionally, events occurring within 20 minutes before or after a non-target species detection were excluded and classified as potential multi-species encounters to reduce the likelihood of contaminated acoustic events. For all retained events, duplicated</w:t>
+      </w:r>
+      <w:r>
+        <w:t xml:space="preserve"> </w:t>
+      </w:r>
+      <w:r>
+        <w:t xml:space="preserve">“</w:t>
+      </w:r>
+      <w:r>
+        <w:t xml:space="preserve">clean</w:t>
+      </w:r>
+      <w:r>
+        <w:t xml:space="preserve">”</w:t>
+      </w:r>
+      <w:r>
+        <w:t xml:space="preserve"> </w:t>
+      </w:r>
+      <w:r>
+        <w:t xml:space="preserve">versions of the acoustic databases were created for further click-level processing and manual cleaning.</w:t>
+      </w:r>
+    </w:p>
+    <w:p>
+      <w:pPr>
+        <w:pStyle w:val="BodyText"/>
+      </w:pPr>
+      <w:r>
+        <w:t xml:space="preserve">Click-level processing was carried out via the PAMpal package in RStudio</w:t>
+      </w:r>
+      <w:r>
+        <w:t xml:space="preserve"> </w:t>
+      </w:r>
+      <w:r>
+        <w:t xml:space="preserve">(Sakai et al. 2026)</w:t>
+      </w:r>
+      <w:r>
+        <w:t xml:space="preserve">. From the cleaned acoustic study databases, echolocation clicks were automatically detected, and the related click-level metadata were extracted, including click features such as inter-click interval (ICI), amplitude, frequency values, spectral characteristics, and temporal information. Event start and end times, as well as associated metadata, were defined in R.</w:t>
+      </w:r>
+    </w:p>
+    <w:p>
+      <w:pPr>
+        <w:pStyle w:val="BodyText"/>
+      </w:pPr>
+      <w:r>
+        <w:t xml:space="preserve">Following the processing workflow in PAMGuard and R, all retained events underwent further processing through manual click-level cleaning of the clean copies of the database files in PAMGuard. For each event, the concatenated spectrograms and mean spectra were visually inspected to identify clicks lacking the characteristic spectral banding structure of Risso’s dolphin echolocation clicks. Suspect detections were then manually reviewed directly within PAMGuard and removed when determined to be inconsistent with the target click characteristics</w:t>
+      </w:r>
+      <w:r>
+        <w:t xml:space="preserve"> </w:t>
+      </w:r>
+      <w:r>
+        <w:t xml:space="preserve">(Soldevilla et al. 2017)</w:t>
+      </w:r>
+      <w:r>
+        <w:t xml:space="preserve">. This reiterative review process was conducted in order to maximize consistency of the echolocation click dataset, while also minimizing the influence of non-biological or non-meaningful acoustic signals.</w:t>
+      </w:r>
+    </w:p>
+    <w:p>
+      <w:pPr>
+        <w:pStyle w:val="BodyText"/>
+      </w:pPr>
+      <w:r>
+        <w:t xml:space="preserve">To reduce small-scale spectral fluctuations while preserving the broader peak and notch structure of echolocation clicks across events, click spectra were smoothed using a five-point Tukey smoothing approach prior to downstream analyses</w:t>
+      </w:r>
+      <w:r>
+        <w:t xml:space="preserve"> </w:t>
+      </w:r>
+      <w:r>
+        <w:t xml:space="preserve">(L. Rabiner, Sambur, and Schmidt 1975)</w:t>
+      </w:r>
+      <w:r>
+        <w:t xml:space="preserve">. Tukey smoothing was applied before spectral feature extraction, peak and notch identification, and clustering to improve the stability and consistency of spectral banding patterns across clicks and events.</w:t>
+      </w:r>
+    </w:p>
+    <w:p>
+      <w:pPr>
+        <w:pStyle w:val="BodyText"/>
+      </w:pPr>
+      <w:r>
+        <w:t xml:space="preserve">Cepstral liftering approaches as described in previous studies by Soldevilla et al. (2008, 2017) were also explored as a way of further emphasizing spectral banding within clicks during preliminary processing</w:t>
+      </w:r>
+      <w:r>
+        <w:t xml:space="preserve"> </w:t>
+      </w:r>
+      <w:r>
+        <w:t xml:space="preserve">(Lawrence Rabiner and Juang 1993)</w:t>
+      </w:r>
+      <w:r>
+        <w:t xml:space="preserve">. However, liftering produced minimal changes to the generated concatenated spectrograms and spectra, and ultimately did not improve the interpretability of examined spectral features. For this reason, all subsequent analyses were conducted using only the Tukey-smoothed spectra.</w:t>
+      </w:r>
+    </w:p>
+    <w:bookmarkEnd w:id="24"/>
+    <w:bookmarkStart w:id="27" w:name="X05c11d82f75fe162771995ec2f7d26cad316dd3"/>
+    <w:p>
+      <w:pPr>
+        <w:pStyle w:val="Heading2"/>
+      </w:pPr>
+      <w:r>
+        <w:t xml:space="preserve">C. Spectral Feature Clustering and Geographic Variation</w:t>
+      </w:r>
+    </w:p>
+    <w:bookmarkStart w:id="25" w:name="spectral-pre-processing"/>
+    <w:p>
+      <w:pPr>
+        <w:pStyle w:val="Heading3"/>
+      </w:pPr>
       <w:r>
         <w:rPr>
           <w:i/>
           <w:iCs/>
         </w:rPr>
-        <w:t xml:space="preserve">Grampus griseus</w:t>
-      </w:r>
-      <w:r>
-        <w:t xml:space="preserve">) are a widely distributed, primarily offshore species whose population structure within the California Current Ecosystem (CCE) remains relatively unstudied. In U.S. Pacific waters, two stocks are currently recognized — the California–Oregon–Washington stock and the Hawaiian stock — though these designations may overlook finer-scale spatial and temporal structure that is difficult to resolve using current stock assessment approaches alone. Passive acoustic monitoring (PAM) provides an alternative means of examining population-level structure by characterizing spatial and temporal variation in acoustic behavior across broad offshore regions. We used PAM data collected during three NOAA surveys between 2016 and 2023 to investigate spatial, seasonal, and diel variation in Risso’s dolphin acoustic signals across the CCE. Recordings from drifting acoustic recorders provided coverage spanning Oregon, Northern California, and Central California. Distinct acoustic signal types were identified, and their relative occurrence was examined across regions and time periods. Spatial and temporal differences in signal-type distributions were observed, indicating structured variation within the CCE. Building upon prior work demonstrating acoustic differentiation of Risso’s dolphins within other regions, these results further resolve how signal-type composition varies across regions and seasons. By revealing fine-scale spatial and temporal structure, PAM offers a valuable tool for informing population assessment, improving ecological understanding, and supporting ecosystem-based management of offshore cetaceans.</w:t>
-      </w:r>
-    </w:p>
-    <w:bookmarkEnd w:id="22"/>
-    <w:bookmarkEnd w:id="23"/>
-    <w:bookmarkStart w:id="27" w:name="i.-introduction"/>
-    <w:p>
-      <w:pPr>
-        <w:pStyle w:val="Heading1"/>
-      </w:pPr>
-      <w:r>
-        <w:t xml:space="preserve">I. Introduction</w:t>
-      </w:r>
-    </w:p>
-    <w:bookmarkStart w:id="24" w:name="X425fd2980049a94c5d43fb147e5741a4b9440f2"/>
-    <w:p>
-      <w:pPr>
-        <w:pStyle w:val="Heading2"/>
-      </w:pPr>
-      <w:r>
-        <w:t xml:space="preserve">Soldevilla et al. 2017 layout (with my notes):</w:t>
-      </w:r>
-    </w:p>
-    <w:p>
-      <w:pPr>
-        <w:numPr>
-          <w:ilvl w:val="0"/>
-          <w:numId w:val="1001"/>
-        </w:numPr>
-      </w:pPr>
-      <w:r>
-        <w:t xml:space="preserve">PAM (specifically drifting acoustic recorders - benefits)</w:t>
-      </w:r>
-    </w:p>
-    <w:p>
-      <w:pPr>
-        <w:numPr>
-          <w:ilvl w:val="0"/>
-          <w:numId w:val="1001"/>
-        </w:numPr>
-      </w:pPr>
-      <w:r>
-        <w:t xml:space="preserve">Use of acoustic variation in possible determination of population divergence</w:t>
-      </w:r>
-    </w:p>
-    <w:p>
-      <w:pPr>
-        <w:numPr>
-          <w:ilvl w:val="0"/>
-          <w:numId w:val="1001"/>
-        </w:numPr>
-      </w:pPr>
-      <w:r>
-        <w:t xml:space="preserve">Where does click variation come from? Morphological differences is the most likely hypothesis</w:t>
-      </w:r>
-    </w:p>
-    <w:p>
-      <w:pPr>
-        <w:numPr>
-          <w:ilvl w:val="0"/>
-          <w:numId w:val="1001"/>
-        </w:numPr>
-      </w:pPr>
-      <w:r>
-        <w:t xml:space="preserve">Introduction of specifics about Risso’s (distribution, diet, endangered status)</w:t>
-      </w:r>
-    </w:p>
-    <w:p>
-      <w:pPr>
-        <w:numPr>
-          <w:ilvl w:val="0"/>
-          <w:numId w:val="1001"/>
-        </w:numPr>
-      </w:pPr>
-      <w:r>
-        <w:t xml:space="preserve">Introduction of pre-established geographic variation in Soldevilla et al. 2017</w:t>
-      </w:r>
-    </w:p>
-    <w:p>
-      <w:pPr>
-        <w:numPr>
-          <w:ilvl w:val="0"/>
-          <w:numId w:val="1001"/>
-        </w:numPr>
-      </w:pPr>
-      <w:r>
-        <w:t xml:space="preserve">Why do we care about population structure specifically in the CCE? Two distinct stocks may overlook fine-scale population structure, anthropogentic impact (proposed off-shore wind energy ares)</w:t>
-      </w:r>
-    </w:p>
-    <w:p>
-      <w:pPr>
-        <w:numPr>
-          <w:ilvl w:val="0"/>
-          <w:numId w:val="1001"/>
-        </w:numPr>
-      </w:pPr>
-      <w:r>
-        <w:t xml:space="preserve">“</w:t>
-      </w:r>
-      <w:r>
-        <w:t xml:space="preserve">This study…</w:t>
-      </w:r>
-      <w:r>
-        <w:t xml:space="preserve">”</w:t>
-      </w:r>
-      <w:r>
-        <w:t xml:space="preserve"> </w:t>
-      </w:r>
-      <w:r>
-        <w:t xml:space="preserve">(first comprehensive comprehensive assessment of Risso’s dolphin click characteristics across the CCE and enable comparison with other U.S. regions where click-type divergence has been observed. Fine-scale spatial, seasonal, and diel acoustic patterns can inform population assessment, ecological understanding, and ecosystem-based management.)</w:t>
-      </w:r>
-    </w:p>
-    <w:p>
-      <w:pPr>
-        <w:numPr>
-          <w:ilvl w:val="0"/>
-          <w:numId w:val="1001"/>
-        </w:numPr>
-      </w:pPr>
-      <w:r>
-        <w:t xml:space="preserve">“</w:t>
-      </w:r>
-      <w:r>
-        <w:t xml:space="preserve">First… Then… Finally</w:t>
-      </w:r>
-      <w:r>
-        <w:t xml:space="preserve">”</w:t>
-      </w:r>
-      <w:r>
-        <w:t xml:space="preserve"> </w:t>
-      </w:r>
-      <w:r>
-        <w:t xml:space="preserve">(Soldevilla et al. 2017: click spectra are evaluated, k-means clustering, mean spectral peak and notch frequencies quantified for each encounter, regional variability)</w:t>
-      </w:r>
-    </w:p>
-    <w:bookmarkEnd w:id="24"/>
-    <w:bookmarkStart w:id="25" w:name="my-proposed-layout"/>
-    <w:p>
-      <w:pPr>
-        <w:pStyle w:val="Heading2"/>
-      </w:pPr>
-      <w:r>
-        <w:t xml:space="preserve">My (proposed) layout:</w:t>
-      </w:r>
-    </w:p>
-    <w:p>
-      <w:pPr>
-        <w:numPr>
-          <w:ilvl w:val="0"/>
-          <w:numId w:val="1002"/>
-        </w:numPr>
-      </w:pPr>
-      <w:r>
-        <w:t xml:space="preserve">Species and ecological context</w:t>
-      </w:r>
-    </w:p>
-    <w:p>
-      <w:pPr>
-        <w:numPr>
-          <w:ilvl w:val="0"/>
-          <w:numId w:val="1002"/>
-        </w:numPr>
-      </w:pPr>
-      <w:r>
-        <w:t xml:space="preserve">Population structure problem (NOAA Stock)</w:t>
-      </w:r>
-    </w:p>
-    <w:p>
-      <w:pPr>
-        <w:numPr>
-          <w:ilvl w:val="0"/>
-          <w:numId w:val="1002"/>
-        </w:numPr>
-      </w:pPr>
-      <w:r>
-        <w:t xml:space="preserve">Transition and introduction to PAM and acoustic identification</w:t>
-      </w:r>
-    </w:p>
-    <w:p>
-      <w:pPr>
-        <w:numPr>
-          <w:ilvl w:val="0"/>
-          <w:numId w:val="1002"/>
-        </w:numPr>
-      </w:pPr>
-      <w:r>
-        <w:t xml:space="preserve">Spectral banding</w:t>
-      </w:r>
-    </w:p>
-    <w:p>
-      <w:pPr>
-        <w:numPr>
-          <w:ilvl w:val="0"/>
-          <w:numId w:val="1002"/>
-        </w:numPr>
-      </w:pPr>
-      <w:r>
-        <w:t xml:space="preserve">Introducing Soldevilla et al. 2008 and 2017</w:t>
-      </w:r>
-    </w:p>
-    <w:p>
-      <w:pPr>
-        <w:numPr>
-          <w:ilvl w:val="0"/>
-          <w:numId w:val="1002"/>
-        </w:numPr>
-      </w:pPr>
-      <w:r>
-        <w:t xml:space="preserve">Knowledge gap /</w:t>
-      </w:r>
-      <w:r>
-        <w:t xml:space="preserve"> </w:t>
-      </w:r>
-      <w:r>
-        <w:t xml:space="preserve">“</w:t>
-      </w:r>
-      <w:r>
-        <w:t xml:space="preserve">that’s where my research comes in…</w:t>
-      </w:r>
-      <w:r>
-        <w:t xml:space="preserve">”</w:t>
-      </w:r>
-    </w:p>
-    <w:p>
-      <w:pPr>
-        <w:numPr>
-          <w:ilvl w:val="0"/>
-          <w:numId w:val="1002"/>
-        </w:numPr>
-      </w:pPr>
-      <w:r>
-        <w:t xml:space="preserve">Management context (revisited with special emphasis on CCES)</w:t>
-      </w:r>
-    </w:p>
-    <w:p>
-      <w:pPr>
-        <w:numPr>
-          <w:ilvl w:val="0"/>
-          <w:numId w:val="1002"/>
-        </w:numPr>
-      </w:pPr>
-      <w:r>
-        <w:t xml:space="preserve">“</w:t>
-      </w:r>
-      <w:r>
-        <w:t xml:space="preserve">This study…</w:t>
-      </w:r>
-      <w:r>
-        <w:t xml:space="preserve">”</w:t>
-      </w:r>
-    </w:p>
-    <w:p>
-      <w:pPr>
-        <w:numPr>
-          <w:ilvl w:val="0"/>
-          <w:numId w:val="1002"/>
-        </w:numPr>
-      </w:pPr>
-      <w:r>
-        <w:t xml:space="preserve">“</w:t>
-      </w:r>
-      <w:r>
-        <w:t xml:space="preserve">First… Then… Finally</w:t>
-      </w:r>
-      <w:r>
-        <w:t xml:space="preserve">”</w:t>
+        <w:t xml:space="preserve">1. Spectral Pre-processing</w:t>
+      </w:r>
+    </w:p>
+    <w:p>
+      <w:pPr>
+        <w:pStyle w:val="FirstParagraph"/>
+      </w:pPr>
+      <w:r>
+        <w:t xml:space="preserve">Prior to clustering analyses, all echolocation click spectra were standardized through a pre-processing workflow in order to ensure across event comparability. All processed spectra contained 512 frequency bins, although recordings originating from different surveys were represented on two distinct frequency grids. Some events were generated on a frequency grid with spacing between bins of approximately 375 Hz, while a second group of events used a finer scale frequency grid with spacing of approximately 281.25 Hz. For this reason, corresponding bin positions did not necessarily represent the same frequencies across all events. Because downstream clustering analyses compare spectra on a bin-by-bin basis, directly combining spectra from events with different frequency grids would result in comparison of values at different frequencies which could, in turn, bias clustering calculations. To remedy this difference and ensure that corresponding bins represented the same frequencies throughout the dataset, all spectra were linearly interpolated to a shared reference frequency grid with approximately 375 Hz spacing prior to further analyses.</w:t>
+      </w:r>
+    </w:p>
+    <w:p>
+      <w:pPr>
+        <w:pStyle w:val="BodyText"/>
+      </w:pPr>
+      <w:r>
+        <w:t xml:space="preserve">Following interpolation, the spectra were restricted to a range of 19-50 kHz. This frequency range encompasses the primary banding structure of Risso’s dolphin echolocation clicks, while removing lower and higher-frequency noises deemed non-pertinent to the present study. Furthermore, restricting the frequency range also allowed for direct comparison with previous literture exploring the spectral banding of Risso’s dolphins</w:t>
+      </w:r>
+      <w:r>
+        <w:t xml:space="preserve"> </w:t>
+      </w:r>
+      <w:r>
+        <w:t xml:space="preserve">(Soldevilla et al. 2008, 2017)</w:t>
+      </w:r>
+      <w:r>
+        <w:t xml:space="preserve">.</w:t>
+      </w:r>
+    </w:p>
+    <w:p>
+      <w:pPr>
+        <w:pStyle w:val="BodyText"/>
+      </w:pPr>
+      <w:r>
+        <w:t xml:space="preserve">To emphasize the spectral shape of the echolocation clicks, as opposed to absolute signal amplitude, each spectrum was min-max normalized across the 19-50 kHz frequency range</w:t>
+      </w:r>
+      <w:r>
+        <w:t xml:space="preserve"> </w:t>
+      </w:r>
+      <w:r>
+        <w:t xml:space="preserve">(Patro and Sahu 2015)</w:t>
+      </w:r>
+      <w:r>
+        <w:t xml:space="preserve">. Within each click, spectral values were scaled between 0 and 1, allowing for clustering analyses to focus on the relative peak and notch positions rather than received level among detections.</w:t>
+      </w:r>
+    </w:p>
+    <w:p>
+      <w:pPr>
+        <w:pStyle w:val="BodyText"/>
+      </w:pPr>
+      <w:r>
+        <w:t xml:space="preserve">ICI measurements were then joined to the spectral dataset using click-level metadata in order to be accounted for in the clustering process. To reduce the influence of buzz click sequences associated with extremely short ICIs, any clicks with an ICI below 0.01 seconds was removed from further analyses. Similarly, ICI values above 0.4 seconds were also removed as they likely indicate long temporal gaps and are unlikely to represent continuous echolocation behavior</w:t>
+      </w:r>
+      <w:r>
+        <w:t xml:space="preserve"> </w:t>
+      </w:r>
+      <w:r>
+        <w:t xml:space="preserve">(Madsen, Kerr, and Payne 2004)</w:t>
+      </w:r>
+      <w:r>
+        <w:t xml:space="preserve">.</w:t>
+      </w:r>
+    </w:p>
+    <w:p>
+      <w:pPr>
+        <w:pStyle w:val="BodyText"/>
+      </w:pPr>
+      <w:r>
+        <w:t xml:space="preserve">Finally, to minimize unequal representation among encounters, a maximum of 200 clicks were randomly sampled without replacement per event following ICI filtering</w:t>
+      </w:r>
+      <w:r>
+        <w:t xml:space="preserve"> </w:t>
+      </w:r>
+      <w:r>
+        <w:t xml:space="preserve">(Soldevilla et al. 2017)</w:t>
+      </w:r>
+      <w:r>
+        <w:t xml:space="preserve">. Events containing fewer clicks than the 200 click threshold retained all clicks. The resulting dataset was used for all subsequent dimensionality reduction and clustering analyses.</w:t>
       </w:r>
     </w:p>
     <w:bookmarkEnd w:id="25"/>
-    <w:bookmarkStart w:id="26" w:name="rough-draft"/>
-    <w:p>
-      <w:pPr>
-        <w:pStyle w:val="Heading2"/>
-      </w:pPr>
-      <w:r>
-        <w:t xml:space="preserve">Rough Draft:</w:t>
-      </w:r>
-    </w:p>
-    <w:p>
-      <w:pPr>
-        <w:pStyle w:val="FirstParagraph"/>
-      </w:pPr>
-      <w:r>
-        <w:t xml:space="preserve">Risso’s dolphins (</w:t>
-      </w:r>
+    <w:bookmarkStart w:id="26" w:name="dimensionality-reduction-and-clustering"/>
+    <w:p>
+      <w:pPr>
+        <w:pStyle w:val="Heading3"/>
+      </w:pPr>
       <w:r>
         <w:rPr>
           <w:i/>
           <w:iCs/>
         </w:rPr>
-        <w:t xml:space="preserve">Grampus griseus</w:t>
-      </w:r>
-      <w:r>
-        <w:t xml:space="preserve">) are globally distributed, deep-diving odontocetes primarily found in temperate and tropical environments, where they are commonly associated with continental slope and offshore habitats</w:t>
-      </w:r>
-      <w:r>
-        <w:t xml:space="preserve"> </w:t>
-      </w:r>
-      <w:r>
-        <w:t xml:space="preserve">(Baird 2009)</w:t>
-      </w:r>
-      <w:r>
-        <w:t xml:space="preserve">. Despite their broad distribution, Risso’s ecology and population structure remain relatively unstudied</w:t>
-      </w:r>
-      <w:r>
-        <w:t xml:space="preserve"> </w:t>
-      </w:r>
-      <w:r>
-        <w:t xml:space="preserve">(Jefferson et al. 2017)</w:t>
-      </w:r>
-      <w:r>
-        <w:t xml:space="preserve">. As with many pelagic cetaceans, studying Risso’s dolphins presents challenges as animals occupy large and dynamic habitats, are difficult to observe consistently over time and space, and may exhibit biological structuring that is not readily apparent from visual surveys alone</w:t>
-      </w:r>
-      <w:r>
-        <w:t xml:space="preserve"> </w:t>
-      </w:r>
-      <w:r>
-        <w:t xml:space="preserve">(Forney and Barlow 1998; Smith et al. 2020)</w:t>
-      </w:r>
-      <w:r>
-        <w:t xml:space="preserve">. As a result, uncertainty introduced by these challenges complicates efforts to define biological population boundaries, yet such boundaries are pivotal to effective species management and conservation</w:t>
-      </w:r>
-      <w:r>
-        <w:t xml:space="preserve"> </w:t>
-      </w:r>
-      <w:r>
-        <w:t xml:space="preserve">(Carretta et al. 2024; Grech, Sheppard, and Marsh 2011)</w:t>
-      </w:r>
-      <w:r>
-        <w:t xml:space="preserve">.</w:t>
+        <w:t xml:space="preserve">2. Dimensionality Reduction and Clustering</w:t>
+      </w:r>
+    </w:p>
+    <w:p>
+      <w:pPr>
+        <w:pStyle w:val="FirstParagraph"/>
+      </w:pPr>
+      <w:r>
+        <w:t xml:space="preserve">To identify recurring spectral-temporal click types, a clustering workflow integrating both spectral shape and ICI information was developed. Preliminary clustering approaches, including k-means clustering, k-shape clustering, and density-based full-spectra clustering, were evaluated during early stages of workflow development</w:t>
+      </w:r>
+      <w:r>
+        <w:t xml:space="preserve"> </w:t>
+      </w:r>
+      <w:r>
+        <w:t xml:space="preserve">(McInnes, Healy, and Astels 2017; Paparrizos and Gravano 2015)</w:t>
+      </w:r>
+      <w:r>
+        <w:t xml:space="preserve">. While these approaches identified broad patterns of spectral variation, they did not adequately resolve structure and instead suggested that the variation within the datatset revealed substantial continuity across clicks was as opposed to a small number of clearly separated groups. Consequently, a dimensionality reduction and density-based workflow was adopted to better characterize structure within the spectral-temporal feature space.</w:t>
       </w:r>
     </w:p>
     <w:p>
@@ -536,52 +1043,19 @@
         <w:pStyle w:val="BodyText"/>
       </w:pPr>
       <w:r>
-        <w:t xml:space="preserve">Along the United States West Coast within the United States Exclusive Economic Zone, Risso’s dolphins are managed within one, broad</w:t>
-      </w:r>
-      <w:r>
-        <w:t xml:space="preserve"> </w:t>
-      </w:r>
-      <w:r>
-        <w:t xml:space="preserve">“</w:t>
-      </w:r>
-      <w:r>
-        <w:t xml:space="preserve">stock</w:t>
-      </w:r>
-      <w:r>
-        <w:t xml:space="preserve">”</w:t>
-      </w:r>
-      <w:r>
-        <w:t xml:space="preserve"> </w:t>
-      </w:r>
-      <w:r>
-        <w:t xml:space="preserve">delineation defined for assessment and conservation purposes – the California-Oregon-Washington (CA-OR-WA) stock</w:t>
-      </w:r>
-      <w:r>
-        <w:t xml:space="preserve"> </w:t>
-      </w:r>
-      <w:r>
-        <w:t xml:space="preserve">(Carretta et al. 2024)</w:t>
-      </w:r>
-      <w:r>
-        <w:t xml:space="preserve">. The offshore extent of this stock’s boundaries are unknown, and the currently recognized management unit may overlook multiple independent populations</w:t>
-      </w:r>
-      <w:r>
-        <w:t xml:space="preserve"> </w:t>
-      </w:r>
-      <w:r>
-        <w:t xml:space="preserve">(Carretta et al. 2024)</w:t>
-      </w:r>
-      <w:r>
-        <w:t xml:space="preserve">. For this reason, any independent line of evidence that helps to evaluate spatial and temporal structuring within this broadly managed system is scientifically and practically valuable</w:t>
-      </w:r>
-      <w:r>
-        <w:t xml:space="preserve"> </w:t>
-      </w:r>
-      <w:r>
-        <w:t xml:space="preserve">(Martien et al. 2019)</w:t>
-      </w:r>
-      <w:r>
-        <w:t xml:space="preserve">.</w:t>
+        <w:t xml:space="preserve">PCA was applied to the min-max normalized spectra to reduce dimensionality while preserving dominant patterns of spectral variation</w:t>
+      </w:r>
+      <w:r>
+        <w:t xml:space="preserve"> </w:t>
+      </w:r>
+      <w:r>
+        <w:t xml:space="preserve">(Jolliffe 2002)</w:t>
+      </w:r>
+      <w:r>
+        <w:t xml:space="preserve"> </w:t>
+      </w:r>
+      <w:r>
+        <w:t xml:space="preserve">. Direct clustering of the full spectral datatset would require comparisons across dozens of highly correlated frequency bins, potentially taking away from boarder patterns of variation. In using PCA, a better representation of spectral shape was retained, along with a majority of the information contained within the original spectra. Because each spectrum had already been normalized during pre-processing, PCA was applied using centered, but unscaled, spectral values. Principal components (PC) accounting for 90% of the cumulative spectral variance of the datatset were preserved for the remained of the clustering workflow.</w:t>
       </w:r>
     </w:p>
     <w:p>
@@ -589,34 +1063,7 @@
         <w:pStyle w:val="BodyText"/>
       </w:pPr>
       <w:r>
-        <w:t xml:space="preserve">This exploration is especially relevant in the California Current Ecosystem – a large, eastern boundary current characterized by strong gradients in bathymetry, productivity, oceanography, species diversity, anthropogenic impact, and prey availability</w:t>
-      </w:r>
-      <w:r>
-        <w:t xml:space="preserve"> </w:t>
-      </w:r>
-      <w:r>
-        <w:t xml:space="preserve">(McClatchie 2025)</w:t>
-      </w:r>
-      <w:r>
-        <w:t xml:space="preserve">. Such heterogeneity lends itself to shaping cetacean distribution, use of habitat, and foraging behavior across space and time</w:t>
-      </w:r>
-      <w:r>
-        <w:t xml:space="preserve"> </w:t>
-      </w:r>
-      <w:r>
-        <w:t xml:space="preserve">(Barlow and Forney 2007)</w:t>
-      </w:r>
-      <w:r>
-        <w:t xml:space="preserve">. As an offshore species associated with deep-water habitats, for Risso’s dolphins the CCE provides a biologically meaningful setting in which to explore temporal and geographic variation in the acoustic characteristics of the species within a single, dynamic ecosystem</w:t>
-      </w:r>
-      <w:r>
-        <w:t xml:space="preserve"> </w:t>
-      </w:r>
-      <w:r>
-        <w:t xml:space="preserve">(Barlow and Forney 2007; Forney and Barlow 1998)</w:t>
-      </w:r>
-      <w:r>
-        <w:t xml:space="preserve">.</w:t>
+        <w:t xml:space="preserve">To incorporate the temporal components of clicks to the clustering analyses, ICI were transformed using a log10 transformation and standardized to zero mean and unit variance. The standardized ICI values were combined with the retained PC to create a joint spectral-temporal feature space. Multiple ICI weights were evaluated throughout workflow development to determine the influence of temporal information on clustering outcomes. Ultimately, the final workflow maintained the fully weighted standardized ICI feature (1x) as it best preserved the contribution of click timing within the spectral-temporal framework.</w:t>
       </w:r>
     </w:p>
     <w:p>
@@ -624,34 +1071,16 @@
         <w:pStyle w:val="BodyText"/>
       </w:pPr>
       <w:r>
-        <w:t xml:space="preserve">Passive Acoustic monitoring (PAM) is particularly well suiting to address these questions as odontocetes rely heavily on sound for prey detection, navigation, and social interaction, and acoustic methods can identify and record animals in locations and conditions where visuals methods are unable to</w:t>
-      </w:r>
-      <w:r>
-        <w:t xml:space="preserve"> </w:t>
-      </w:r>
-      <w:r>
-        <w:t xml:space="preserve">(Mellinger and Barlow 2003)</w:t>
-      </w:r>
-      <w:r>
-        <w:t xml:space="preserve">. In this study, drifting passive acoustic monitoring was utilized to survey acoustic activity throughout the CCE. Drifting PAM is especially valuable because it provides an effective balance between the geographic resolution of towed systems and the temporal resolution of fixed seafloor recorders. With relatively low cost and flexible deployment, broader spatial coverage is achieved, making it especially well suited for surveying mobile and elusive species directly within the water column</w:t>
-      </w:r>
-      <w:r>
-        <w:t xml:space="preserve"> </w:t>
-      </w:r>
-      <w:r>
-        <w:t xml:space="preserve">(Rankin et al. 2025)</w:t>
-      </w:r>
-      <w:r>
-        <w:t xml:space="preserve">. In a system such as the CCE, drifting PAM allows fine-scale characterization of acoustic patterns that would otherwise be challenging to capture</w:t>
-      </w:r>
-      <w:r>
-        <w:t xml:space="preserve"> </w:t>
-      </w:r>
-      <w:r>
-        <w:t xml:space="preserve">(Rankin et al. 2025; Simonis et al. 2020)</w:t>
-      </w:r>
-      <w:r>
-        <w:t xml:space="preserve">.</w:t>
+        <w:t xml:space="preserve">UMAP was applied to the combined spectral-temporal feature space. While PCA reduced the dimensionality of the spectral data, the joint PCA and ICI feature space remained multidimensional and potentially contained a complex nonlinear structure. For this reason, UMAP was used to generate a two-dimensional embedding that worked to preserve local relationships while also providing a lower-dimensional representation of the dataset suitable for further visualization and density-based clustering</w:t>
+      </w:r>
+      <w:r>
+        <w:t xml:space="preserve"> </w:t>
+      </w:r>
+      <w:r>
+        <w:t xml:space="preserve">(Best et al. 2023; McInnes, Healy, and Melville 2020)</w:t>
+      </w:r>
+      <w:r>
+        <w:t xml:space="preserve">. UMAP was implemented using 30 nearest neighbors, a minimum distance of 0.1, Euclidean distance metrics, and a fixed random seed in order to ensure reproducibility. These parameters were selected in order to balance the broader organization of the spectral-temporal feature space with the preservation of local neighborhood, all while aiming to maintain usable density patterns.</w:t>
       </w:r>
     </w:p>
     <w:p>
@@ -659,183 +1088,42 @@
         <w:pStyle w:val="BodyText"/>
       </w:pPr>
       <w:r>
-        <w:t xml:space="preserve">Risso’s dolphin echolocation clicks serve as valuable markers for this kind of analysis as they exhibit distinct spectral banding – specifically recurring peaks and notches in the frequency of the spectra</w:t>
-      </w:r>
-      <w:r>
-        <w:t xml:space="preserve"> </w:t>
-      </w:r>
-      <w:r>
-        <w:t xml:space="preserve">(Soldevilla et al. 2008)</w:t>
-      </w:r>
-      <w:r>
-        <w:t xml:space="preserve">. These spectral features are hypothesized to reflect the impacts of morphological structures within the sound production and propagation process, and are stable enough to allow for species identification</w:t>
-      </w:r>
-      <w:r>
-        <w:t xml:space="preserve"> </w:t>
-      </w:r>
-      <w:r>
-        <w:t xml:space="preserve">(Cranford, Amundin, and Norris 1996; McKenna et al. 2012; Soldevilla et al. 2008; Soldevilla, Wiggins, and Hildebrand 2010)</w:t>
-      </w:r>
-      <w:r>
-        <w:t xml:space="preserve">. More importantly for this study, spectral banding in the echolocation clicks of Risso’s dolphins provides a measurable framework for comparison of click structure across encounters, regions, and time</w:t>
-      </w:r>
-      <w:r>
-        <w:t xml:space="preserve"> </w:t>
-      </w:r>
-      <w:r>
-        <w:t xml:space="preserve">(Soldevilla et al. 2017)</w:t>
-      </w:r>
-      <w:r>
-        <w:t xml:space="preserve">. If spectral characteristics vary systematically, such variation could indicate morphological, behavioral, ecological, or population differences</w:t>
-      </w:r>
-      <w:r>
-        <w:t xml:space="preserve"> </w:t>
-      </w:r>
-      <w:r>
-        <w:t xml:space="preserve">(Soldevilla et al. 2008, 2017)</w:t>
-      </w:r>
-      <w:r>
-        <w:t xml:space="preserve">.</w:t>
-      </w:r>
-    </w:p>
-    <w:p>
-      <w:pPr>
-        <w:pStyle w:val="BodyText"/>
-      </w:pPr>
-      <w:r>
-        <w:t xml:space="preserve">Previous studies by</w:t>
-      </w:r>
-      <w:r>
-        <w:t xml:space="preserve"> </w:t>
-      </w:r>
-      <w:r>
-        <w:t xml:space="preserve">Soldevilla et al. (2008)</w:t>
-      </w:r>
-      <w:r>
-        <w:t xml:space="preserve">,</w:t>
-      </w:r>
-      <w:r>
-        <w:t xml:space="preserve"> </w:t>
-      </w:r>
-      <w:r>
-        <w:t xml:space="preserve">Soldevilla et al. (2017)</w:t>
-      </w:r>
-      <w:r>
-        <w:t xml:space="preserve"> </w:t>
-      </w:r>
-      <w:r>
-        <w:t xml:space="preserve">have shown Risso’s echolocation clicks to consistently possess spectral banding structure across regions, with frequency value differences suggesting geographic variation. This foundational work established an important baseline for species identification and raised the question as to the possible biological meaning behind click variation. However, while</w:t>
-      </w:r>
-      <w:r>
-        <w:t xml:space="preserve"> </w:t>
-      </w:r>
-      <w:r>
-        <w:t xml:space="preserve">Soldevilla et al. (2008)</w:t>
-      </w:r>
-      <w:r>
-        <w:t xml:space="preserve">,</w:t>
-      </w:r>
-      <w:r>
-        <w:t xml:space="preserve"> </w:t>
-      </w:r>
-      <w:r>
-        <w:t xml:space="preserve">Soldevilla et al. (2017)</w:t>
-      </w:r>
-      <w:r>
-        <w:t xml:space="preserve"> </w:t>
-      </w:r>
-      <w:r>
-        <w:t xml:space="preserve">characterize spectral characteristics and variation of Risso’s clicks in regions such as the U.S. East Coast, Gulf of Mexico, Hawaiian Islands, and the Southern California Bight, the CCE has not be studied as its own ecosystem-scale case</w:t>
-      </w:r>
-      <w:r>
-        <w:t xml:space="preserve"> </w:t>
-      </w:r>
-      <w:r>
-        <w:t xml:space="preserve">(Rankin et al. 2025)</w:t>
-      </w:r>
-      <w:r>
-        <w:t xml:space="preserve">. What remains unclear is how spectral structure varies within the CCE itself as an environmentally heterogeneous and ecologically important region</w:t>
-      </w:r>
-      <w:r>
-        <w:t xml:space="preserve"> </w:t>
-      </w:r>
-      <w:r>
-        <w:t xml:space="preserve">(McClatchie 2025; Soldevilla et al. 2017)</w:t>
-      </w:r>
-      <w:r>
-        <w:t xml:space="preserve">.</w:t>
-      </w:r>
-    </w:p>
-    <w:p>
-      <w:pPr>
-        <w:pStyle w:val="BodyText"/>
-      </w:pPr>
-      <w:r>
-        <w:t xml:space="preserve">Addressing this knowledge gap is relevant for both management and ecology. Characterization of Risso;s dolphin click spectra across the CCE can improve interpretation of PAM detection, assist in refining regional habitat use understanding, and provide additional context relevant to biological structuring within a broadly managed offshore environment</w:t>
-      </w:r>
-      <w:r>
-        <w:t xml:space="preserve"> </w:t>
-      </w:r>
-      <w:r>
-        <w:t xml:space="preserve">(Barlow and Forney 2007; Carretta et al. 2024; Forney and Barlow 1998; Soldevilla et al. 2017)</w:t>
-      </w:r>
-      <w:r>
-        <w:t xml:space="preserve">. It also places the CCE in the broader bio-geographic context of pre-existing population variation patterns while establishing the baseline needed to interpret acoustic trends within the ecosystem</w:t>
-      </w:r>
-      <w:r>
-        <w:t xml:space="preserve"> </w:t>
-      </w:r>
-      <w:r>
-        <w:t xml:space="preserve">(Soldevilla, Wiggins, and Hildebrand 2010; Soldevilla et al. 2017)</w:t>
-      </w:r>
-      <w:r>
-        <w:t xml:space="preserve">. In an era of increasing offshore anthropogenic impact, stronger foundational understanding is both scientifically and practically important across the CCE</w:t>
-      </w:r>
-      <w:r>
-        <w:t xml:space="preserve"> </w:t>
-      </w:r>
-      <w:r>
-        <w:t xml:space="preserve">(Andrews et al. 2015; Carretta et al. 2024; Van Parijs et al. 2023)</w:t>
-      </w:r>
-      <w:r>
-        <w:t xml:space="preserve">.</w:t>
-      </w:r>
-    </w:p>
-    <w:p>
-      <w:pPr>
-        <w:pStyle w:val="BodyText"/>
-      </w:pPr>
-      <w:r>
-        <w:t xml:space="preserve">This study examines the echolocation clicks of Risso’s dolphins within the CCE and serves as the first comprehensive assessment of Risso’s dolphin click characteristics across the CCE – enabling comparison with other U.S. regions where click-type divergence has been observed. First, spectral peaks and notches were identified from a broad dataset to characterize banding in the spectra of recorded clicks. Next, clustering analyses were applied to identify recurring spectral structure across encounters. Finally, spectral characteristic were temporally and spatiall evaluated within the CCE and compared with patterns previously described by</w:t>
-      </w:r>
-      <w:r>
-        <w:t xml:space="preserve"> </w:t>
-      </w:r>
-      <w:r>
-        <w:t xml:space="preserve">Soldevilla et al. (2017)</w:t>
-      </w:r>
-      <w:r>
-        <w:t xml:space="preserve">.</w:t>
+        <w:t xml:space="preserve">HDBSCAN was applied to the resulting two-dimensional UMAP embedding</w:t>
+      </w:r>
+      <w:r>
+        <w:t xml:space="preserve"> </w:t>
+      </w:r>
+      <w:r>
+        <w:t xml:space="preserve">(Alexander et al. 2025; Best et al. 2023)</w:t>
+      </w:r>
+      <w:r>
+        <w:t xml:space="preserve"> </w:t>
+      </w:r>
+      <w:r>
+        <w:t xml:space="preserve">. HDBSCAN was selected as the clustering algorithm as it identifies clusters based upon local point density, does not require specification of the number of clusters, and allows for detections that do not belong to a well-defined cluster to remain unassigned</w:t>
+      </w:r>
+      <w:r>
+        <w:t xml:space="preserve"> </w:t>
+      </w:r>
+      <w:r>
+        <w:t xml:space="preserve">(Best et al. 2023; McInnes, Healy, and Astels 2017)</w:t>
+      </w:r>
+      <w:r>
+        <w:t xml:space="preserve"> </w:t>
+      </w:r>
+      <w:r>
+        <w:t xml:space="preserve">. Multiple point thresholds were explored during workflow development to assess clustering sensitivity and flexibility across a range of density requirements. A minimum point threshold of 50 was determined for the final analysis as it emphasized robust recurring density structure while also limiting fragmentation into small local clusters. The resulting cluster assignments were used for all following analyses of spectral and geographic variation.</w:t>
       </w:r>
     </w:p>
     <w:bookmarkEnd w:id="26"/>
     <w:bookmarkEnd w:id="27"/>
-    <w:bookmarkStart w:id="34" w:name="ii.-materials-and-methods"/>
-    <w:p>
-      <w:pPr>
-        <w:pStyle w:val="Heading1"/>
-      </w:pPr>
-      <w:r>
-        <w:t xml:space="preserve">II. Materials and Methods</w:t>
-      </w:r>
-    </w:p>
-    <w:bookmarkStart w:id="28" w:name="Xb2028f00b68c8175449fe0faf36c2f742c233a3"/>
+    <w:bookmarkStart w:id="28" w:name="X5246065a8c05b299f48d51dd914dec13dc57641"/>
     <w:p>
       <w:pPr>
         <w:pStyle w:val="Heading2"/>
       </w:pPr>
       <w:r>
-        <w:t xml:space="preserve">A. Field Sites and Acoustic Survey Design</w:t>
+        <w:t xml:space="preserve">D. Testing Geographic Structure in Echolocation Click Types Against Pre-existing Regional Variation</w:t>
       </w:r>
     </w:p>
     <w:p>
@@ -843,7 +1131,28 @@
         <w:pStyle w:val="FirstParagraph"/>
       </w:pPr>
       <w:r>
-        <w:t xml:space="preserve">Recordings of Risso’s dolphins were collected via floating passive acoustic monitoring recorders deployed throughout the California Current Ecosystem (CCE) during three NOAA surveys; Passive Acoustic Survey of Cetaceans Abundance Levels (PASCAL-2016), California Current Ecosystem Survey (CCES-2018), and Adrift in the California Current (ADRIFT-2020-2023).</w:t>
+        <w:t xml:space="preserve">In order to evaluate whether Risso’s dolphin echolocation clicks recorded within this CCE dataset exhibited spectral characteristics to those reported from other regions, spectral peak and notch frequencies were quantified and compared with values found by</w:t>
+      </w:r>
+      <w:r>
+        <w:t xml:space="preserve"> </w:t>
+      </w:r>
+      <w:r>
+        <w:t xml:space="preserve">Soldevilla et al. (2017)</w:t>
+      </w:r>
+      <w:r>
+        <w:t xml:space="preserve">. Rather than comparing individual cluster types, all events from the CCE dataset were treated collectively as a regional datatset, paralleling methodlogy by</w:t>
+      </w:r>
+      <w:r>
+        <w:t xml:space="preserve"> </w:t>
+      </w:r>
+      <w:r>
+        <w:t xml:space="preserve">Soldevilla et al. (2017)</w:t>
+      </w:r>
+      <w:r>
+        <w:t xml:space="preserve"> </w:t>
+      </w:r>
+      <w:r>
+        <w:t xml:space="preserve">and allowing for direct comparison with previously described geographic regions.</w:t>
       </w:r>
     </w:p>
     <w:p>
@@ -851,31 +1160,7 @@
         <w:pStyle w:val="BodyText"/>
       </w:pPr>
       <w:r>
-        <w:t xml:space="preserve">Detailed information can be found in the ADRIFT report</w:t>
-      </w:r>
-      <w:r>
-        <w:t xml:space="preserve"> </w:t>
-      </w:r>
-      <w:r>
-        <w:t xml:space="preserve">Rankin et al. (2025)</w:t>
-      </w:r>
-    </w:p>
-    <w:bookmarkEnd w:id="28"/>
-    <w:bookmarkStart w:id="29" w:name="Xf8f607feced794e2d706b98caf34a6b8d085611"/>
-    <w:p>
-      <w:pPr>
-        <w:pStyle w:val="Heading2"/>
-      </w:pPr>
-      <w:r>
-        <w:t xml:space="preserve">B. Signal Processing and Click Feature Extraction</w:t>
-      </w:r>
-    </w:p>
-    <w:p>
-      <w:pPr>
-        <w:pStyle w:val="FirstParagraph"/>
-      </w:pPr>
-      <w:r>
-        <w:t xml:space="preserve">MATLAB click detectors (specific parameters?) creating databases and binaries</w:t>
+        <w:t xml:space="preserve">For each retained event, an event-level mean spectrum was calculated from the sampled min-max normalized spectra. Because HDBSCAN cluster 0 represents unassigned detections, event-level mean spectra were generated both with and without cluster 0 included. The unassigned detection excluded event-level mean spectra were used as the primary comparison datatset, while the unassigned detection included spectra were retained as a sensitivity check.</w:t>
       </w:r>
     </w:p>
     <w:p>
@@ -883,106 +1168,105 @@
         <w:pStyle w:val="BodyText"/>
       </w:pPr>
       <w:r>
-        <w:t xml:space="preserve">Generation of concatenated spectrograms and spectra via R</w:t>
-      </w:r>
-    </w:p>
-    <w:p>
-      <w:pPr>
-        <w:pStyle w:val="BodyText"/>
-      </w:pPr>
-      <w:r>
-        <w:t xml:space="preserve">Visual confirmation of single-species events based upon generated spectrograms and cross comparison between events with Risso’s detected and other specie encounters. Removal of any events that overlapped with other species within 20 minutes before and after the Risso’s event.</w:t>
-      </w:r>
-    </w:p>
-    <w:p>
-      <w:pPr>
-        <w:pStyle w:val="BodyText"/>
-      </w:pPr>
-      <w:r>
-        <w:t xml:space="preserve">Copy of each usable database created (</w:t>
-      </w:r>
-      <w:r>
-        <w:t xml:space="preserve">“</w:t>
-      </w:r>
-      <w:r>
-        <w:t xml:space="preserve">-clean</w:t>
-      </w:r>
-      <w:r>
-        <w:t xml:space="preserve">”</w:t>
-      </w:r>
-      <w:r>
-        <w:t xml:space="preserve">)</w:t>
-      </w:r>
-    </w:p>
-    <w:p>
-      <w:pPr>
-        <w:pStyle w:val="BodyText"/>
-      </w:pPr>
-      <w:r>
-        <w:t xml:space="preserve">Manual click cleaning removing clicks that were not Risso’s</w:t>
-      </w:r>
-    </w:p>
-    <w:p>
-      <w:pPr>
-        <w:pStyle w:val="BodyText"/>
-      </w:pPr>
-      <w:r>
-        <w:t xml:space="preserve">Regeneration of concatenated spectrograms and spectra via R with the newly cleaned databases</w:t>
-      </w:r>
-    </w:p>
-    <w:p>
-      <w:pPr>
-        <w:pStyle w:val="BodyText"/>
-      </w:pPr>
-      <w:r>
-        <w:t xml:space="preserve">Liftering (?) explored but didn’t make an impact so chose not to use</w:t>
-      </w:r>
-    </w:p>
-    <w:p>
-      <w:pPr>
-        <w:pStyle w:val="BodyText"/>
-      </w:pPr>
-      <w:r>
-        <w:t xml:space="preserve">Smoothing using Tukey and generated Tukey spectra for each event</w:t>
-      </w:r>
-    </w:p>
-    <w:p>
-      <w:pPr>
-        <w:pStyle w:val="BodyText"/>
-      </w:pPr>
-      <w:r>
-        <w:t xml:space="preserve">Histograms were created for each event showing prevalence of peaks and notches</w:t>
-      </w:r>
-    </w:p>
-    <w:p>
-      <w:pPr>
-        <w:pStyle w:val="BodyText"/>
-      </w:pPr>
-      <w:r>
-        <w:t xml:space="preserve">Data files also created with the values of the peaks and notches per click in each event</w:t>
-      </w:r>
-    </w:p>
-    <w:bookmarkEnd w:id="29"/>
-    <w:bookmarkStart w:id="33" w:name="Xec05586587ca41dab5fd102754a08599b06ad89"/>
-    <w:p>
-      <w:pPr>
-        <w:pStyle w:val="Heading2"/>
-      </w:pPr>
-      <w:r>
-        <w:t xml:space="preserve">C. Spatial Patterns in Click Feature Distribution</w:t>
-      </w:r>
-    </w:p>
-    <w:bookmarkStart w:id="30" w:name="prevalence-of-spectral-banding"/>
-    <w:p>
-      <w:pPr>
-        <w:pStyle w:val="Heading3"/>
-      </w:pPr>
+        <w:t xml:space="preserve">To identify spectral peaks and notches, the findpeaks function in the R package</w:t>
+      </w:r>
+      <w:r>
+        <w:t xml:space="preserve"> </w:t>
+      </w:r>
       <w:r>
         <w:rPr>
           <w:i/>
           <w:iCs/>
         </w:rPr>
-        <w:t xml:space="preserve">1. Prevalence of Spectral Banding</w:t>
+        <w:t xml:space="preserve">pracma</w:t>
+      </w:r>
+      <w:r>
+        <w:t xml:space="preserve"> </w:t>
+      </w:r>
+      <w:r>
+        <w:t xml:space="preserve">was used for each event-level mean spectrum</w:t>
+      </w:r>
+      <w:r>
+        <w:t xml:space="preserve"> </w:t>
+      </w:r>
+      <w:r>
+        <w:t xml:space="preserve">(Borchers 2011)</w:t>
+      </w:r>
+      <w:r>
+        <w:t xml:space="preserve">. Peak frequencies were identified as local maxima within the spectra, while notch frequencies were identified by inverting the spectra and applying the same procedure. Detected peak and notch frequencies were ordering by increasing frequency, with the first four peaks and first three notches retained for later analyses</w:t>
+      </w:r>
+      <w:r>
+        <w:t xml:space="preserve"> </w:t>
+      </w:r>
+      <w:r>
+        <w:t xml:space="preserve">(Soldevilla et al. 2008, 2017)</w:t>
+      </w:r>
+      <w:r>
+        <w:t xml:space="preserve">. Peak detection was performed using a minimum peak height of 0.15, a minimum peak distance of three frequency bins, and a requirement of two ascending and two descending points surrounding each peak. Equivalent parameters were used during notch identification.</w:t>
+      </w:r>
+    </w:p>
+    <w:p>
+      <w:pPr>
+        <w:pStyle w:val="BodyText"/>
+      </w:pPr>
+      <w:r>
+        <w:t xml:space="preserve">In addition to the event-level spectral feature analyses, peaks and notches were also quantified from the mean spectrum of each identified click type generated through the spectral-temporal clustering workflow</w:t>
+      </w:r>
+      <w:r>
+        <w:t xml:space="preserve"> </w:t>
+      </w:r>
+      <w:r>
+        <w:t xml:space="preserve">(Soldevilla et al. 2017)</w:t>
+      </w:r>
+      <w:r>
+        <w:t xml:space="preserve">. The same peak and notch picking procedure was applied to cluster mean spectra, allowing spectral banding characteristics to be summarized among recurring click types within the dataset.</w:t>
+      </w:r>
+    </w:p>
+    <w:p>
+      <w:pPr>
+        <w:pStyle w:val="BodyText"/>
+      </w:pPr>
+      <w:r>
+        <w:t xml:space="preserve">Following all feature extraction, the frequencies of each peak and notch position were summarized across all retained events by calculating the mean and standard deviation of the CCE. These summary statistics were then compared with published regional values reported by</w:t>
+      </w:r>
+      <w:r>
+        <w:t xml:space="preserve"> </w:t>
+      </w:r>
+      <w:r>
+        <w:t xml:space="preserve">Soldevilla et al. (2017)</w:t>
+      </w:r>
+      <w:r>
+        <w:t xml:space="preserve">, including the Southest U.S. Continental Shelf, Northeast U.S. Continental Shelf, Gulf of Mexico, Pelagic Pacific, and California Current Southern California Bight.</w:t>
+      </w:r>
+    </w:p>
+    <w:bookmarkEnd w:id="28"/>
+    <w:bookmarkEnd w:id="29"/>
+    <w:bookmarkStart w:id="33" w:name="iii.-results"/>
+    <w:p>
+      <w:pPr>
+        <w:pStyle w:val="Heading1"/>
+      </w:pPr>
+      <w:r>
+        <w:t xml:space="preserve">III. Results</w:t>
+      </w:r>
+    </w:p>
+    <w:bookmarkStart w:id="30" w:name="a.-prevalence-of-spectral-banding"/>
+    <w:p>
+      <w:pPr>
+        <w:pStyle w:val="Heading2"/>
+      </w:pPr>
+      <w:r>
+        <w:t xml:space="preserve">A. Prevalence of Spectral Banding</w:t>
+      </w:r>
+    </w:p>
+    <w:bookmarkEnd w:id="30"/>
+    <w:bookmarkStart w:id="31" w:name="X5e2fa6465b7490eea1741d0acaa8cfa9499838a"/>
+    <w:p>
+      <w:pPr>
+        <w:pStyle w:val="Heading2"/>
+      </w:pPr>
+      <w:r>
+        <w:t xml:space="preserve">B. Spectral Feature Clustering and Geographic Variation</w:t>
       </w:r>
     </w:p>
     <w:p>
@@ -990,240 +1274,87 @@
         <w:pStyle w:val="FirstParagraph"/>
       </w:pPr>
       <w:r>
-        <w:t xml:space="preserve">Events that did not display spectral banding were removed</w:t>
-      </w:r>
-    </w:p>
-    <w:p>
-      <w:pPr>
-        <w:pStyle w:val="BodyText"/>
-      </w:pPr>
-      <w:r>
-        <w:t xml:space="preserve">Events with less than ___ clicks exhibiting spectral banding were removed from further analysis</w:t>
-      </w:r>
-    </w:p>
-    <w:bookmarkEnd w:id="30"/>
-    <w:bookmarkStart w:id="31" w:name="X493854820b21638615f85811eb6253a7e1f50cf"/>
-    <w:p>
-      <w:pPr>
-        <w:pStyle w:val="Heading3"/>
-      </w:pPr>
-      <w:r>
-        <w:rPr>
-          <w:i/>
-          <w:iCs/>
-        </w:rPr>
-        <w:t xml:space="preserve">2. Spectral Feature Clustering and Geographic Variation</w:t>
-      </w:r>
-    </w:p>
-    <w:p>
-      <w:pPr>
-        <w:pStyle w:val="FirstParagraph"/>
-      </w:pPr>
-      <w:r>
-        <w:t xml:space="preserve">Explored 6 different</w:t>
-      </w:r>
-      <w:r>
-        <w:t xml:space="preserve"> </w:t>
-      </w:r>
-      <w:r>
-        <w:t xml:space="preserve">“</w:t>
-      </w:r>
-      <w:r>
-        <w:t xml:space="preserve">types of clustering</w:t>
-      </w:r>
-      <w:r>
-        <w:t xml:space="preserve">”</w:t>
-      </w:r>
-      <w:r>
-        <w:t xml:space="preserve">:</w:t>
-      </w:r>
-    </w:p>
-    <w:p>
-      <w:pPr>
-        <w:pStyle w:val="Compact"/>
-        <w:numPr>
-          <w:ilvl w:val="0"/>
-          <w:numId w:val="1003"/>
-        </w:numPr>
-      </w:pPr>
-      <w:r>
-        <w:t xml:space="preserve">Clustering of whole Tukey spectra</w:t>
-      </w:r>
-    </w:p>
-    <w:p>
-      <w:pPr>
-        <w:numPr>
-          <w:ilvl w:val="1"/>
-          <w:numId w:val="1004"/>
-        </w:numPr>
-      </w:pPr>
-      <w:r>
-        <w:t xml:space="preserve">K-means: k=2 provided best results, hard to see distinction between the centroids of the two clusters</w:t>
-      </w:r>
-    </w:p>
-    <w:p>
-      <w:pPr>
-        <w:numPr>
-          <w:ilvl w:val="1"/>
-          <w:numId w:val="1004"/>
-        </w:numPr>
-      </w:pPr>
-      <w:r>
-        <w:t xml:space="preserve">K-shape: k-2 provided best results, higher mean silhouette score than k-means, much better distinction between the two clusters</w:t>
-      </w:r>
-    </w:p>
-    <w:p>
-      <w:pPr>
-        <w:numPr>
-          <w:ilvl w:val="1"/>
-          <w:numId w:val="1004"/>
-        </w:numPr>
-      </w:pPr>
-      <w:r>
-        <w:t xml:space="preserve">HDBSCAN: Still in progress</w:t>
-      </w:r>
-    </w:p>
-    <w:p>
-      <w:pPr>
-        <w:pStyle w:val="Compact"/>
-        <w:numPr>
-          <w:ilvl w:val="0"/>
-          <w:numId w:val="1003"/>
-        </w:numPr>
-      </w:pPr>
-      <w:r>
-        <w:t xml:space="preserve">Clustering on selected peaks and notches - not sure if we will need to do this / want to</w:t>
-      </w:r>
-    </w:p>
-    <w:p>
-      <w:pPr>
-        <w:numPr>
-          <w:ilvl w:val="1"/>
-          <w:numId w:val="1005"/>
-        </w:numPr>
-      </w:pPr>
-      <w:r>
-        <w:t xml:space="preserve">K-means:</w:t>
-      </w:r>
-    </w:p>
-    <w:p>
-      <w:pPr>
-        <w:numPr>
-          <w:ilvl w:val="1"/>
-          <w:numId w:val="1005"/>
-        </w:numPr>
-      </w:pPr>
-      <w:r>
-        <w:t xml:space="preserve">K-shape:</w:t>
-      </w:r>
-    </w:p>
-    <w:p>
-      <w:pPr>
-        <w:numPr>
-          <w:ilvl w:val="1"/>
-          <w:numId w:val="1005"/>
-        </w:numPr>
-      </w:pPr>
-      <w:r>
-        <w:t xml:space="preserve">HDBSCAN:</w:t>
+        <w:t xml:space="preserve">After filtering from 0.01-0.4 ICI clicks out we retain 214,944 clicks (about 62.5% of the dataset) and remove 111,570 likely buzz/very short ICI clicks (about 32.4%)</w:t>
       </w:r>
     </w:p>
     <w:bookmarkEnd w:id="31"/>
-    <w:bookmarkStart w:id="32" w:name="Xb5955d0d0ccf2df60a45634f442c6cc99a787d1"/>
-    <w:p>
-      <w:pPr>
-        <w:pStyle w:val="Heading3"/>
-      </w:pPr>
-      <w:r>
-        <w:rPr>
-          <w:i/>
-          <w:iCs/>
-        </w:rPr>
-        <w:t xml:space="preserve">3. Testing Geographic Structure in Echolocation Click Types Against Pre-existing Regional Variation</w:t>
+    <w:bookmarkStart w:id="32" w:name="X05b0b16a679f494a5fdb1ab670857f1bfad35a7"/>
+    <w:p>
+      <w:pPr>
+        <w:pStyle w:val="Heading2"/>
+      </w:pPr>
+      <w:r>
+        <w:t xml:space="preserve">C. Testing Geographic Structure in Echolocation Click Types Against Pre-existing Regional Variation</w:t>
       </w:r>
     </w:p>
     <w:bookmarkEnd w:id="32"/>
     <w:bookmarkEnd w:id="33"/>
+    <w:bookmarkStart w:id="34" w:name="iv.-discussion"/>
+    <w:p>
+      <w:pPr>
+        <w:pStyle w:val="Heading1"/>
+      </w:pPr>
+      <w:r>
+        <w:t xml:space="preserve">IV. Discussion</w:t>
+      </w:r>
+    </w:p>
+    <w:p>
+      <w:pPr>
+        <w:pStyle w:val="FirstParagraph"/>
+      </w:pPr>
+      <w:r>
+        <w:t xml:space="preserve">Soldevilla et al. 2017 used the following sections: Species Identification, Geographic Variation, Within-encounter variability, Geographical variation and seasonal movements, Automated extraction and classification)</w:t>
+      </w:r>
+    </w:p>
     <w:bookmarkEnd w:id="34"/>
-    <w:bookmarkStart w:id="38" w:name="iii.-results"/>
+    <w:bookmarkStart w:id="35" w:name="v.-conclusions"/>
     <w:p>
       <w:pPr>
         <w:pStyle w:val="Heading1"/>
       </w:pPr>
       <w:r>
-        <w:t xml:space="preserve">III. Results</w:t>
-      </w:r>
-    </w:p>
-    <w:bookmarkStart w:id="35" w:name="a.-prevalence-of-spectral-banding"/>
-    <w:p>
-      <w:pPr>
-        <w:pStyle w:val="Heading2"/>
-      </w:pPr>
-      <w:r>
-        <w:t xml:space="preserve">A. Prevalence of Spectral Banding</w:t>
+        <w:t xml:space="preserve">V. Conclusions</w:t>
       </w:r>
     </w:p>
     <w:bookmarkEnd w:id="35"/>
-    <w:bookmarkStart w:id="36" w:name="X5e2fa6465b7490eea1741d0acaa8cfa9499838a"/>
-    <w:p>
-      <w:pPr>
-        <w:pStyle w:val="Heading2"/>
-      </w:pPr>
-      <w:r>
-        <w:t xml:space="preserve">B. Spectral Feature Clustering and Geographic Variation</w:t>
-      </w:r>
-    </w:p>
-    <w:bookmarkEnd w:id="36"/>
-    <w:bookmarkStart w:id="37" w:name="X05b0b16a679f494a5fdb1ab670857f1bfad35a7"/>
-    <w:p>
-      <w:pPr>
-        <w:pStyle w:val="Heading2"/>
-      </w:pPr>
-      <w:r>
-        <w:t xml:space="preserve">C. Testing Geographic Structure in Echolocation Click Types Against Pre-existing Regional Variation</w:t>
+    <w:bookmarkStart w:id="98" w:name="section"/>
+    <w:p>
+      <w:pPr>
+        <w:pStyle w:val="Heading1"/>
+      </w:pPr>
+    </w:p>
+    <w:bookmarkStart w:id="97" w:name="refs"/>
+    <w:bookmarkStart w:id="37" w:name="ref-alexander2025"/>
+    <w:p>
+      <w:pPr>
+        <w:pStyle w:val="Bibliography"/>
+      </w:pPr>
+      <w:r>
+        <w:t xml:space="preserve">Alexander, Callan, Robert Clemens, Paul Roe, and Susan Fuller. 2025.</w:t>
+      </w:r>
+      <w:r>
+        <w:t xml:space="preserve"> </w:t>
+      </w:r>
+      <w:r>
+        <w:t xml:space="preserve">“Automated Note Annotation After Bioacoustic Classification: Unsupervised Clustering of Extracted Acoustic Features Improves Detection of a Cryptic Owl.”</w:t>
+      </w:r>
+      <w:r>
+        <w:t xml:space="preserve"> </w:t>
+      </w:r>
+      <w:hyperlink r:id="rId36">
+        <w:r>
+          <w:rPr>
+            <w:rStyle w:val="Hyperlink"/>
+          </w:rPr>
+          <w:t xml:space="preserve">https://doi.org/10.2139/ssrn.5099945</w:t>
+        </w:r>
+      </w:hyperlink>
+      <w:r>
+        <w:t xml:space="preserve">.</w:t>
       </w:r>
     </w:p>
     <w:bookmarkEnd w:id="37"/>
-    <w:bookmarkEnd w:id="38"/>
-    <w:bookmarkStart w:id="39" w:name="iv.-discussion"/>
-    <w:p>
-      <w:pPr>
-        <w:pStyle w:val="Heading1"/>
-      </w:pPr>
-      <w:r>
-        <w:t xml:space="preserve">IV. Discussion</w:t>
-      </w:r>
-    </w:p>
-    <w:p>
-      <w:pPr>
-        <w:pStyle w:val="FirstParagraph"/>
-      </w:pPr>
-      <w:r>
-        <w:t xml:space="preserve">Soldevilla et al. 2017 used the following sections: Species Identification, Geographic Variation, Within-encounter variability, Geographical variation and seasonal movements, Automated extraction and classification)</w:t>
-      </w:r>
-    </w:p>
-    <w:bookmarkEnd w:id="39"/>
-    <w:bookmarkStart w:id="40" w:name="v.-conclusions"/>
-    <w:p>
-      <w:pPr>
-        <w:pStyle w:val="Heading1"/>
-      </w:pPr>
-      <w:r>
-        <w:t xml:space="preserve">V. Conclusions</w:t>
-      </w:r>
-    </w:p>
-    <w:bookmarkEnd w:id="40"/>
-    <w:bookmarkStart w:id="76" w:name="acknowledgements"/>
-    <w:p>
-      <w:pPr>
-        <w:pStyle w:val="Heading1"/>
-      </w:pPr>
-      <w:r>
-        <w:t xml:space="preserve">Acknowledgements</w:t>
-      </w:r>
-    </w:p>
-    <w:bookmarkStart w:id="75" w:name="refs"/>
-    <w:bookmarkStart w:id="42" w:name="ref-andrews2015"/>
+    <w:bookmarkStart w:id="39" w:name="ref-andrews2015"/>
     <w:p>
       <w:pPr>
         <w:pStyle w:val="Bibliography"/>
@@ -1256,7 +1387,7 @@
       <w:r>
         <w:t xml:space="preserve"> </w:t>
       </w:r>
-      <w:hyperlink r:id="rId41">
+      <w:hyperlink r:id="rId38">
         <w:r>
           <w:rPr>
             <w:rStyle w:val="Hyperlink"/>
@@ -1268,8 +1399,8 @@
         <w:t xml:space="preserve">.</w:t>
       </w:r>
     </w:p>
-    <w:bookmarkEnd w:id="42"/>
-    <w:bookmarkStart w:id="44" w:name="ref-baird2009"/>
+    <w:bookmarkEnd w:id="39"/>
+    <w:bookmarkStart w:id="41" w:name="ref-baird2009"/>
     <w:p>
       <w:pPr>
         <w:pStyle w:val="Bibliography"/>
@@ -1292,7 +1423,7 @@
       <w:r>
         <w:t xml:space="preserve"> </w:t>
       </w:r>
-      <w:hyperlink r:id="rId43">
+      <w:hyperlink r:id="rId40">
         <w:r>
           <w:rPr>
             <w:rStyle w:val="Hyperlink"/>
@@ -1304,8 +1435,8 @@
         <w:t xml:space="preserve">.</w:t>
       </w:r>
     </w:p>
-    <w:bookmarkEnd w:id="44"/>
-    <w:bookmarkStart w:id="45" w:name="ref-barlow2007"/>
+    <w:bookmarkEnd w:id="41"/>
+    <w:bookmarkStart w:id="42" w:name="ref-barlow2007"/>
     <w:p>
       <w:pPr>
         <w:pStyle w:val="Bibliography"/>
@@ -1357,13 +1488,96 @@
         <w:t xml:space="preserve">105 (October).</w:t>
       </w:r>
     </w:p>
-    <w:bookmarkEnd w:id="45"/>
-    <w:bookmarkStart w:id="47" w:name="ref-carretta2024"/>
+    <w:bookmarkEnd w:id="42"/>
+    <w:bookmarkStart w:id="44" w:name="ref-best2023"/>
     <w:p>
       <w:pPr>
         <w:pStyle w:val="Bibliography"/>
       </w:pPr>
       <w:r>
+        <w:t xml:space="preserve">Best, Paul, Sébastien Paris, Hervé Glotin, and Ricard Marxer. 2023.</w:t>
+      </w:r>
+      <w:r>
+        <w:t xml:space="preserve"> </w:t>
+      </w:r>
+      <w:r>
+        <w:t xml:space="preserve">“Deep Audio Embeddings for Vocalisation Clustering.”</w:t>
+      </w:r>
+      <w:r>
+        <w:t xml:space="preserve"> </w:t>
+      </w:r>
+      <w:r>
+        <w:rPr>
+          <w:i/>
+          <w:iCs/>
+        </w:rPr>
+        <w:t xml:space="preserve">PLOS ONE</w:t>
+      </w:r>
+      <w:r>
+        <w:t xml:space="preserve"> </w:t>
+      </w:r>
+      <w:r>
+        <w:t xml:space="preserve">18 (7): e0283396.</w:t>
+      </w:r>
+      <w:r>
+        <w:t xml:space="preserve"> </w:t>
+      </w:r>
+      <w:hyperlink r:id="rId43">
+        <w:r>
+          <w:rPr>
+            <w:rStyle w:val="Hyperlink"/>
+          </w:rPr>
+          <w:t xml:space="preserve">https://doi.org/10.1371/journal.pone.0283396</w:t>
+        </w:r>
+      </w:hyperlink>
+      <w:r>
+        <w:t xml:space="preserve">.</w:t>
+      </w:r>
+    </w:p>
+    <w:bookmarkEnd w:id="44"/>
+    <w:bookmarkStart w:id="46" w:name="ref-borchers2011"/>
+    <w:p>
+      <w:pPr>
+        <w:pStyle w:val="Bibliography"/>
+      </w:pPr>
+      <w:r>
+        <w:t xml:space="preserve">Borchers, Hans W. 2011.</w:t>
+      </w:r>
+      <w:r>
+        <w:t xml:space="preserve"> </w:t>
+      </w:r>
+      <w:r>
+        <w:rPr>
+          <w:i/>
+          <w:iCs/>
+        </w:rPr>
+        <w:t xml:space="preserve">Pracma: Practical Numerical Math Functions</w:t>
+      </w:r>
+      <w:r>
+        <w:t xml:space="preserve">.</w:t>
+      </w:r>
+      <w:r>
+        <w:t xml:space="preserve"> </w:t>
+      </w:r>
+      <w:hyperlink r:id="rId45">
+        <w:r>
+          <w:rPr>
+            <w:rStyle w:val="Hyperlink"/>
+          </w:rPr>
+          <w:t xml:space="preserve">https://doi.org/10.32614/CRAN.package.pracma</w:t>
+        </w:r>
+      </w:hyperlink>
+      <w:r>
+        <w:t xml:space="preserve">.</w:t>
+      </w:r>
+    </w:p>
+    <w:bookmarkEnd w:id="46"/>
+    <w:bookmarkStart w:id="48" w:name="ref-carretta2024"/>
+    <w:p>
+      <w:pPr>
+        <w:pStyle w:val="Bibliography"/>
+      </w:pPr>
+      <w:r>
         <w:t xml:space="preserve">Carretta, James V., Erin M. Oleson, Karin A. Forney, Amanda L. Bradford, Kym Yano, David W. Weller, Aimee R. Lang, et al. 2024.</w:t>
       </w:r>
       <w:r>
@@ -1375,7 +1589,7 @@
       <w:r>
         <w:t xml:space="preserve"> </w:t>
       </w:r>
-      <w:hyperlink r:id="rId46">
+      <w:hyperlink r:id="rId47">
         <w:r>
           <w:rPr>
             <w:rStyle w:val="Hyperlink"/>
@@ -1387,8 +1601,8 @@
         <w:t xml:space="preserve">.</w:t>
       </w:r>
     </w:p>
-    <w:bookmarkEnd w:id="47"/>
-    <w:bookmarkStart w:id="49" w:name="ref-cranford1996"/>
+    <w:bookmarkEnd w:id="48"/>
+    <w:bookmarkStart w:id="50" w:name="ref-cranford1996"/>
     <w:p>
       <w:pPr>
         <w:pStyle w:val="Bibliography"/>
@@ -1421,7 +1635,7 @@
       <w:r>
         <w:t xml:space="preserve"> </w:t>
       </w:r>
-      <w:hyperlink r:id="rId48">
+      <w:hyperlink r:id="rId49">
         <w:r>
           <w:rPr>
             <w:rStyle w:val="Hyperlink"/>
@@ -1433,8 +1647,8 @@
         <w:t xml:space="preserve">.</w:t>
       </w:r>
     </w:p>
-    <w:bookmarkEnd w:id="49"/>
-    <w:bookmarkStart w:id="51" w:name="ref-forney1998"/>
+    <w:bookmarkEnd w:id="50"/>
+    <w:bookmarkStart w:id="52" w:name="ref-forney1998"/>
     <w:p>
       <w:pPr>
         <w:pStyle w:val="Bibliography"/>
@@ -1470,7 +1684,7 @@
       <w:r>
         <w:t xml:space="preserve"> </w:t>
       </w:r>
-      <w:hyperlink r:id="rId50">
+      <w:hyperlink r:id="rId51">
         <w:r>
           <w:rPr>
             <w:rStyle w:val="Hyperlink"/>
@@ -1482,8 +1696,44 @@
         <w:t xml:space="preserve">.</w:t>
       </w:r>
     </w:p>
-    <w:bookmarkEnd w:id="51"/>
-    <w:bookmarkStart w:id="53" w:name="ref-grech2011"/>
+    <w:bookmarkEnd w:id="52"/>
+    <w:bookmarkStart w:id="54" w:name="ref-gillespie2008"/>
+    <w:p>
+      <w:pPr>
+        <w:pStyle w:val="Bibliography"/>
+      </w:pPr>
+      <w:r>
+        <w:t xml:space="preserve">Gillespie, D., D. K. Mellinger, J. Gordon, D. McLaren, P. Redmond, Ronald McHugh, P. W. Trinder, X. Y. Deng, and A. Thode. 2008.</w:t>
+      </w:r>
+      <w:r>
+        <w:t xml:space="preserve"> </w:t>
+      </w:r>
+      <w:r>
+        <w:t xml:space="preserve">“PAMGUARD: Semiautomated, Open Source Software for Real- Time Acoustic Detection and Localisation of Cetaceans.”</w:t>
+      </w:r>
+      <w:r>
+        <w:t xml:space="preserve"> </w:t>
+      </w:r>
+      <w:r>
+        <w:t xml:space="preserve">In, 30:54–62. Red Hook, NY, USA: Curran Associates.</w:t>
+      </w:r>
+      <w:r>
+        <w:t xml:space="preserve"> </w:t>
+      </w:r>
+      <w:hyperlink r:id="rId53">
+        <w:r>
+          <w:rPr>
+            <w:rStyle w:val="Hyperlink"/>
+          </w:rPr>
+          <w:t xml:space="preserve">http://toc.proceedings.com/04143webtoc.pdf</w:t>
+        </w:r>
+      </w:hyperlink>
+      <w:r>
+        <w:t xml:space="preserve">.</w:t>
+      </w:r>
+    </w:p>
+    <w:bookmarkEnd w:id="54"/>
+    <w:bookmarkStart w:id="56" w:name="ref-grech2011"/>
     <w:p>
       <w:pPr>
         <w:pStyle w:val="Bibliography"/>
@@ -1516,7 +1766,7 @@
       <w:r>
         <w:t xml:space="preserve"> </w:t>
       </w:r>
-      <w:hyperlink r:id="rId52">
+      <w:hyperlink r:id="rId55">
         <w:r>
           <w:rPr>
             <w:rStyle w:val="Hyperlink"/>
@@ -1528,8 +1778,8 @@
         <w:t xml:space="preserve">.</w:t>
       </w:r>
     </w:p>
-    <w:bookmarkEnd w:id="53"/>
-    <w:bookmarkStart w:id="55" w:name="ref-jefferson2017"/>
+    <w:bookmarkEnd w:id="56"/>
+    <w:bookmarkStart w:id="58" w:name="ref-jefferson2017"/>
     <w:p>
       <w:pPr>
         <w:pStyle w:val="Bibliography"/>
@@ -1552,7 +1802,7 @@
       <w:r>
         <w:t xml:space="preserve"> </w:t>
       </w:r>
-      <w:hyperlink r:id="rId54">
+      <w:hyperlink r:id="rId57">
         <w:r>
           <w:rPr>
             <w:rStyle w:val="Hyperlink"/>
@@ -1564,13 +1814,132 @@
         <w:t xml:space="preserve">.</w:t>
       </w:r>
     </w:p>
-    <w:bookmarkEnd w:id="55"/>
-    <w:bookmarkStart w:id="57" w:name="ref-martien2019"/>
+    <w:bookmarkEnd w:id="58"/>
+    <w:bookmarkStart w:id="60" w:name="ref-jolliffe2002"/>
     <w:p>
       <w:pPr>
         <w:pStyle w:val="Bibliography"/>
       </w:pPr>
       <w:r>
+        <w:t xml:space="preserve">Jolliffe, I. T. 2002.</w:t>
+      </w:r>
+      <w:r>
+        <w:t xml:space="preserve"> </w:t>
+      </w:r>
+      <w:r>
+        <w:rPr>
+          <w:i/>
+          <w:iCs/>
+        </w:rPr>
+        <w:t xml:space="preserve">Principal Component Analysis</w:t>
+      </w:r>
+      <w:r>
+        <w:t xml:space="preserve">. Springer Series in Statistics. New York: Springer-Verlag.</w:t>
+      </w:r>
+      <w:r>
+        <w:t xml:space="preserve"> </w:t>
+      </w:r>
+      <w:hyperlink r:id="rId59">
+        <w:r>
+          <w:rPr>
+            <w:rStyle w:val="Hyperlink"/>
+          </w:rPr>
+          <w:t xml:space="preserve">https://doi.org/10.1007/b98835</w:t>
+        </w:r>
+      </w:hyperlink>
+      <w:r>
+        <w:t xml:space="preserve">.</w:t>
+      </w:r>
+    </w:p>
+    <w:bookmarkEnd w:id="60"/>
+    <w:bookmarkStart w:id="62" w:name="ref-keating2018"/>
+    <w:p>
+      <w:pPr>
+        <w:pStyle w:val="Bibliography"/>
+      </w:pPr>
+      <w:r>
+        <w:t xml:space="preserve">Keating, Jennifer L., Jay Barlow, Emily T. Griffiths, and Jeffrey E. Moore. 2018.</w:t>
+      </w:r>
+      <w:r>
+        <w:t xml:space="preserve"> </w:t>
+      </w:r>
+      <w:r>
+        <w:t xml:space="preserve">“Passive Acoustics Survey of Cetacean Abundance Levels (Pascal-2016),”</w:t>
+      </w:r>
+      <w:r>
+        <w:t xml:space="preserve"> </w:t>
+      </w:r>
+      <w:r>
+        <w:t xml:space="preserve">January.</w:t>
+      </w:r>
+      <w:r>
+        <w:t xml:space="preserve"> </w:t>
+      </w:r>
+      <w:hyperlink r:id="rId61">
+        <w:r>
+          <w:rPr>
+            <w:rStyle w:val="Hyperlink"/>
+          </w:rPr>
+          <w:t xml:space="preserve">https://www.govinfo.gov/app/details/GOVPUB-I-c2c6df79245c80e225dd2833b782e363</w:t>
+        </w:r>
+      </w:hyperlink>
+      <w:r>
+        <w:t xml:space="preserve">.</w:t>
+      </w:r>
+    </w:p>
+    <w:bookmarkEnd w:id="62"/>
+    <w:bookmarkStart w:id="64" w:name="ref-madsen2004"/>
+    <w:p>
+      <w:pPr>
+        <w:pStyle w:val="Bibliography"/>
+      </w:pPr>
+      <w:r>
+        <w:t xml:space="preserve">Madsen, P. T., I. Kerr, and R. Payne. 2004.</w:t>
+      </w:r>
+      <w:r>
+        <w:t xml:space="preserve"> </w:t>
+      </w:r>
+      <w:r>
+        <w:t xml:space="preserve">“Echolocation Clicks of Two Free-Ranging, Oceanic Delphinids with Different Food Preferences: False Killer Whales Pseudorca Crassidensand Risso’s Dolphins Grampus Griseus.”</w:t>
+      </w:r>
+      <w:r>
+        <w:t xml:space="preserve"> </w:t>
+      </w:r>
+      <w:r>
+        <w:rPr>
+          <w:i/>
+          <w:iCs/>
+        </w:rPr>
+        <w:t xml:space="preserve">Journal of Experimental Biology</w:t>
+      </w:r>
+      <w:r>
+        <w:t xml:space="preserve"> </w:t>
+      </w:r>
+      <w:r>
+        <w:t xml:space="preserve">207 (11): 1811–23.</w:t>
+      </w:r>
+      <w:r>
+        <w:t xml:space="preserve"> </w:t>
+      </w:r>
+      <w:hyperlink r:id="rId63">
+        <w:r>
+          <w:rPr>
+            <w:rStyle w:val="Hyperlink"/>
+          </w:rPr>
+          <w:t xml:space="preserve">https://doi.org/10.1242/jeb.00966</w:t>
+        </w:r>
+      </w:hyperlink>
+      <w:r>
+        <w:t xml:space="preserve">.</w:t>
+      </w:r>
+    </w:p>
+    <w:bookmarkEnd w:id="64"/>
+    <w:bookmarkStart w:id="66" w:name="ref-martien2019"/>
+    <w:p>
+      <w:pPr>
+        <w:pStyle w:val="Bibliography"/>
+      </w:pPr>
+      <w:r>
         <w:t xml:space="preserve">Martien, Karen K., Aimee R. Lang, Barbara L. Taylor, Patricia E. Rosel, Samantha E. Simmons, Erin M. Oleson, Peter L. Boveng, and M. Bradley Hanson. 2019.</w:t>
       </w:r>
       <w:r>
@@ -1588,7 +1957,7 @@
       <w:r>
         <w:t xml:space="preserve"> </w:t>
       </w:r>
-      <w:hyperlink r:id="rId56">
+      <w:hyperlink r:id="rId65">
         <w:r>
           <w:rPr>
             <w:rStyle w:val="Hyperlink"/>
@@ -1600,8 +1969,8 @@
         <w:t xml:space="preserve">.</w:t>
       </w:r>
     </w:p>
-    <w:bookmarkEnd w:id="57"/>
-    <w:bookmarkStart w:id="59" w:name="ref-mcclatchie2025"/>
+    <w:bookmarkEnd w:id="66"/>
+    <w:bookmarkStart w:id="68" w:name="ref-mcclatchie2025"/>
     <w:p>
       <w:pPr>
         <w:pStyle w:val="Bibliography"/>
@@ -1625,7 +1994,7 @@
       <w:r>
         <w:t xml:space="preserve"> </w:t>
       </w:r>
-      <w:hyperlink r:id="rId58">
+      <w:hyperlink r:id="rId67">
         <w:r>
           <w:rPr>
             <w:rStyle w:val="Hyperlink"/>
@@ -1637,8 +2006,84 @@
         <w:t xml:space="preserve">.</w:t>
       </w:r>
     </w:p>
-    <w:bookmarkEnd w:id="59"/>
-    <w:bookmarkStart w:id="61" w:name="ref-mckenna2012"/>
+    <w:bookmarkEnd w:id="68"/>
+    <w:bookmarkStart w:id="70" w:name="ref-mcinnes2017"/>
+    <w:p>
+      <w:pPr>
+        <w:pStyle w:val="Bibliography"/>
+      </w:pPr>
+      <w:r>
+        <w:t xml:space="preserve">McInnes, Leland, John Healy, and Steve Astels. 2017.</w:t>
+      </w:r>
+      <w:r>
+        <w:t xml:space="preserve"> </w:t>
+      </w:r>
+      <w:r>
+        <w:t xml:space="preserve">“Hdbscan: Hierarchical Density Based Clustering.”</w:t>
+      </w:r>
+      <w:r>
+        <w:t xml:space="preserve"> </w:t>
+      </w:r>
+      <w:r>
+        <w:rPr>
+          <w:i/>
+          <w:iCs/>
+        </w:rPr>
+        <w:t xml:space="preserve">The Journal of Open Source Software</w:t>
+      </w:r>
+      <w:r>
+        <w:t xml:space="preserve"> </w:t>
+      </w:r>
+      <w:r>
+        <w:t xml:space="preserve">2 (11): 205.</w:t>
+      </w:r>
+      <w:r>
+        <w:t xml:space="preserve"> </w:t>
+      </w:r>
+      <w:hyperlink r:id="rId69">
+        <w:r>
+          <w:rPr>
+            <w:rStyle w:val="Hyperlink"/>
+          </w:rPr>
+          <w:t xml:space="preserve">https://doi.org/10.21105/joss.00205</w:t>
+        </w:r>
+      </w:hyperlink>
+      <w:r>
+        <w:t xml:space="preserve">.</w:t>
+      </w:r>
+    </w:p>
+    <w:bookmarkEnd w:id="70"/>
+    <w:bookmarkStart w:id="72" w:name="ref-mcinnes2020"/>
+    <w:p>
+      <w:pPr>
+        <w:pStyle w:val="Bibliography"/>
+      </w:pPr>
+      <w:r>
+        <w:t xml:space="preserve">McInnes, Leland, John Healy, and James Melville. 2020.</w:t>
+      </w:r>
+      <w:r>
+        <w:t xml:space="preserve"> </w:t>
+      </w:r>
+      <w:r>
+        <w:t xml:space="preserve">“UMAP: Uniform Manifold Approximation and Projection for Dimension Reduction.”</w:t>
+      </w:r>
+      <w:r>
+        <w:t xml:space="preserve"> </w:t>
+      </w:r>
+      <w:hyperlink r:id="rId71">
+        <w:r>
+          <w:rPr>
+            <w:rStyle w:val="Hyperlink"/>
+          </w:rPr>
+          <w:t xml:space="preserve">https://doi.org/10.48550/arXiv.1802.03426</w:t>
+        </w:r>
+      </w:hyperlink>
+      <w:r>
+        <w:t xml:space="preserve">.</w:t>
+      </w:r>
+    </w:p>
+    <w:bookmarkEnd w:id="72"/>
+    <w:bookmarkStart w:id="74" w:name="ref-mckenna2012"/>
     <w:p>
       <w:pPr>
         <w:pStyle w:val="Bibliography"/>
@@ -1671,7 +2116,7 @@
       <w:r>
         <w:t xml:space="preserve"> </w:t>
       </w:r>
-      <w:hyperlink r:id="rId60">
+      <w:hyperlink r:id="rId73">
         <w:r>
           <w:rPr>
             <w:rStyle w:val="Hyperlink"/>
@@ -1683,8 +2128,8 @@
         <w:t xml:space="preserve">.</w:t>
       </w:r>
     </w:p>
-    <w:bookmarkEnd w:id="61"/>
-    <w:bookmarkStart w:id="62" w:name="ref-mellinger2003"/>
+    <w:bookmarkEnd w:id="74"/>
+    <w:bookmarkStart w:id="75" w:name="ref-mellinger2003"/>
     <w:p>
       <w:pPr>
         <w:pStyle w:val="Bibliography"/>
@@ -1699,13 +2144,147 @@
         <w:t xml:space="preserve">“Future Directions for Acoustic Marine Mammal Surveys: Stock Assessment and Habitat Use.”</w:t>
       </w:r>
     </w:p>
-    <w:bookmarkEnd w:id="62"/>
-    <w:bookmarkStart w:id="63" w:name="ref-rankin2025"/>
+    <w:bookmarkEnd w:id="75"/>
+    <w:bookmarkStart w:id="77" w:name="ref-paparrizos2015"/>
     <w:p>
       <w:pPr>
         <w:pStyle w:val="Bibliography"/>
       </w:pPr>
       <w:r>
+        <w:t xml:space="preserve">Paparrizos, John, and Luis Gravano. 2015.</w:t>
+      </w:r>
+      <w:r>
+        <w:t xml:space="preserve"> </w:t>
+      </w:r>
+      <w:r>
+        <w:t xml:space="preserve">“K-Shape: Efficient and Accurate Clustering of Time Series.”</w:t>
+      </w:r>
+      <w:r>
+        <w:t xml:space="preserve"> </w:t>
+      </w:r>
+      <w:r>
+        <w:t xml:space="preserve">In, 18551870. SIGMOD ’15. New York, NY, USA: Association for Computing Machinery.</w:t>
+      </w:r>
+      <w:r>
+        <w:t xml:space="preserve"> </w:t>
+      </w:r>
+      <w:hyperlink r:id="rId76">
+        <w:r>
+          <w:rPr>
+            <w:rStyle w:val="Hyperlink"/>
+          </w:rPr>
+          <w:t xml:space="preserve">https://doi.org/10.1145/2723372.2737793</w:t>
+        </w:r>
+      </w:hyperlink>
+      <w:r>
+        <w:t xml:space="preserve">.</w:t>
+      </w:r>
+    </w:p>
+    <w:bookmarkEnd w:id="77"/>
+    <w:bookmarkStart w:id="78" w:name="ref-patro2015"/>
+    <w:p>
+      <w:pPr>
+        <w:pStyle w:val="Bibliography"/>
+      </w:pPr>
+      <w:r>
+        <w:t xml:space="preserve">Patro, S.Gopal Krishna, and Kishore Kumar Sahu. 2015.</w:t>
+      </w:r>
+      <w:r>
+        <w:t xml:space="preserve"> </w:t>
+      </w:r>
+      <w:r>
+        <w:t xml:space="preserve">“Normalization: A Preprocessing Stage.”</w:t>
+      </w:r>
+    </w:p>
+    <w:bookmarkEnd w:id="78"/>
+    <w:bookmarkStart w:id="80" w:name="ref-rabiner1993"/>
+    <w:p>
+      <w:pPr>
+        <w:pStyle w:val="Bibliography"/>
+      </w:pPr>
+      <w:r>
+        <w:t xml:space="preserve">Rabiner, Lawrence, and Biing Hwang Juang. 1993.</w:t>
+      </w:r>
+      <w:r>
+        <w:t xml:space="preserve"> </w:t>
+      </w:r>
+      <w:r>
+        <w:t xml:space="preserve">“Fundamentals of Speech Recognition,”</w:t>
+      </w:r>
+      <w:r>
+        <w:t xml:space="preserve"> </w:t>
+      </w:r>
+      <w:r>
+        <w:t xml:space="preserve">507.</w:t>
+      </w:r>
+      <w:r>
+        <w:t xml:space="preserve"> </w:t>
+      </w:r>
+      <w:hyperlink r:id="rId79">
+        <w:r>
+          <w:rPr>
+            <w:rStyle w:val="Hyperlink"/>
+          </w:rPr>
+          <w:t xml:space="preserve">https://www.academia.edu/4924307/Fundamental_of_Speech_Recognition_Lawrence_Rabiner_Biing_Hwang_Juang_</w:t>
+        </w:r>
+      </w:hyperlink>
+      <w:r>
+        <w:t xml:space="preserve">.</w:t>
+      </w:r>
+    </w:p>
+    <w:bookmarkEnd w:id="80"/>
+    <w:bookmarkStart w:id="82" w:name="ref-rabiner1975"/>
+    <w:p>
+      <w:pPr>
+        <w:pStyle w:val="Bibliography"/>
+      </w:pPr>
+      <w:r>
+        <w:t xml:space="preserve">Rabiner, L., M. Sambur, and C. Schmidt. 1975.</w:t>
+      </w:r>
+      <w:r>
+        <w:t xml:space="preserve"> </w:t>
+      </w:r>
+      <w:r>
+        <w:t xml:space="preserve">“Applications of a Nonlinear Smoothing Algorithm to Speech Processing.”</w:t>
+      </w:r>
+      <w:r>
+        <w:t xml:space="preserve"> </w:t>
+      </w:r>
+      <w:r>
+        <w:rPr>
+          <w:i/>
+          <w:iCs/>
+        </w:rPr>
+        <w:t xml:space="preserve">IEEE Transactions on Acoustics, Speech, and Signal Processing</w:t>
+      </w:r>
+      <w:r>
+        <w:t xml:space="preserve"> </w:t>
+      </w:r>
+      <w:r>
+        <w:t xml:space="preserve">23 (6): 552–57.</w:t>
+      </w:r>
+      <w:r>
+        <w:t xml:space="preserve"> </w:t>
+      </w:r>
+      <w:hyperlink r:id="rId81">
+        <w:r>
+          <w:rPr>
+            <w:rStyle w:val="Hyperlink"/>
+          </w:rPr>
+          <w:t xml:space="preserve">https://doi.org/10.1109/TASSP.1975.1162749</w:t>
+        </w:r>
+      </w:hyperlink>
+      <w:r>
+        <w:t xml:space="preserve">.</w:t>
+      </w:r>
+    </w:p>
+    <w:bookmarkEnd w:id="82"/>
+    <w:bookmarkStart w:id="83" w:name="ref-rankin2025"/>
+    <w:p>
+      <w:pPr>
+        <w:pStyle w:val="Bibliography"/>
+      </w:pPr>
+      <w:r>
         <w:t xml:space="preserve">Rankin, Shannon, Kourtney Burger, Cory Hom-Weaver, Kaitlin Palmer, Taiki Sakai, and Anne Simonis. 2025.</w:t>
       </w:r>
       <w:r>
@@ -1715,13 +2294,50 @@
         <w:t xml:space="preserve">“Adrift in the California Current Survey: Passive Acoustic Monitoring in the California Current Using Drifting Recorders.”</w:t>
       </w:r>
     </w:p>
-    <w:bookmarkEnd w:id="63"/>
-    <w:bookmarkStart w:id="64" w:name="ref-simonis2020"/>
+    <w:bookmarkEnd w:id="83"/>
+    <w:bookmarkStart w:id="85" w:name="ref-sakai2026"/>
     <w:p>
       <w:pPr>
         <w:pStyle w:val="Bibliography"/>
       </w:pPr>
       <w:r>
+        <w:t xml:space="preserve">Sakai, Taiki, Jay Barlow, Emily Griffiths, Michael Oswald, Simone Baumann-Pickering, and Julie Oswald. 2026.</w:t>
+      </w:r>
+      <w:r>
+        <w:t xml:space="preserve"> </w:t>
+      </w:r>
+      <w:r>
+        <w:rPr>
+          <w:i/>
+          <w:iCs/>
+        </w:rPr>
+        <w:t xml:space="preserve">PAMpal: Load and Process Passive Acoustic Data</w:t>
+      </w:r>
+      <w:r>
+        <w:t xml:space="preserve">.</w:t>
+      </w:r>
+      <w:r>
+        <w:t xml:space="preserve"> </w:t>
+      </w:r>
+      <w:hyperlink r:id="rId84">
+        <w:r>
+          <w:rPr>
+            <w:rStyle w:val="Hyperlink"/>
+          </w:rPr>
+          <w:t xml:space="preserve">https://cran.r-project.org/web/packages/PAMpal/index.html</w:t>
+        </w:r>
+      </w:hyperlink>
+      <w:r>
+        <w:t xml:space="preserve">.</w:t>
+      </w:r>
+    </w:p>
+    <w:bookmarkEnd w:id="85"/>
+    <w:bookmarkStart w:id="86" w:name="ref-simonis2020"/>
+    <w:p>
+      <w:pPr>
+        <w:pStyle w:val="Bibliography"/>
+      </w:pPr>
+      <w:r>
         <w:t xml:space="preserve">Simonis, Anne E, Jennifer S Trickey, Jay Barlow, Shannon Rankin, Jorge Urbán, Lorenzo Rojas-Bracho, and Jeffrey E Moore. 2020.</w:t>
       </w:r>
       <w:r>
@@ -1737,8 +2353,8 @@
         <w:t xml:space="preserve">NOAA-TM-NMFS-SWFSC-630,.</w:t>
       </w:r>
     </w:p>
-    <w:bookmarkEnd w:id="64"/>
-    <w:bookmarkStart w:id="66" w:name="ref-smith2020"/>
+    <w:bookmarkEnd w:id="86"/>
+    <w:bookmarkStart w:id="88" w:name="ref-smith2020"/>
     <w:p>
       <w:pPr>
         <w:pStyle w:val="Bibliography"/>
@@ -1771,7 +2387,7 @@
       <w:r>
         <w:t xml:space="preserve"> </w:t>
       </w:r>
-      <w:hyperlink r:id="rId65">
+      <w:hyperlink r:id="rId87">
         <w:r>
           <w:rPr>
             <w:rStyle w:val="Hyperlink"/>
@@ -1783,8 +2399,8 @@
         <w:t xml:space="preserve">.</w:t>
       </w:r>
     </w:p>
-    <w:bookmarkEnd w:id="66"/>
-    <w:bookmarkStart w:id="68" w:name="ref-soldevilla2017"/>
+    <w:bookmarkEnd w:id="88"/>
+    <w:bookmarkStart w:id="90" w:name="ref-soldevilla2017"/>
     <w:p>
       <w:pPr>
         <w:pStyle w:val="Bibliography"/>
@@ -1817,7 +2433,7 @@
       <w:r>
         <w:t xml:space="preserve"> </w:t>
       </w:r>
-      <w:hyperlink r:id="rId67">
+      <w:hyperlink r:id="rId89">
         <w:r>
           <w:rPr>
             <w:rStyle w:val="Hyperlink"/>
@@ -1829,8 +2445,8 @@
         <w:t xml:space="preserve">.</w:t>
       </w:r>
     </w:p>
-    <w:bookmarkEnd w:id="68"/>
-    <w:bookmarkStart w:id="70" w:name="ref-soldevilla2008"/>
+    <w:bookmarkEnd w:id="90"/>
+    <w:bookmarkStart w:id="92" w:name="ref-soldevilla2008"/>
     <w:p>
       <w:pPr>
         <w:pStyle w:val="Bibliography"/>
@@ -1869,7 +2485,7 @@
       <w:r>
         <w:t xml:space="preserve"> </w:t>
       </w:r>
-      <w:hyperlink r:id="rId69">
+      <w:hyperlink r:id="rId91">
         <w:r>
           <w:rPr>
             <w:rStyle w:val="Hyperlink"/>
@@ -1881,8 +2497,8 @@
         <w:t xml:space="preserve">.</w:t>
       </w:r>
     </w:p>
-    <w:bookmarkEnd w:id="70"/>
-    <w:bookmarkStart w:id="72" w:name="ref-soldevilla2010"/>
+    <w:bookmarkEnd w:id="92"/>
+    <w:bookmarkStart w:id="94" w:name="ref-soldevilla2010"/>
     <w:p>
       <w:pPr>
         <w:pStyle w:val="Bibliography"/>
@@ -1915,7 +2531,7 @@
       <w:r>
         <w:t xml:space="preserve"> </w:t>
       </w:r>
-      <w:hyperlink r:id="rId71">
+      <w:hyperlink r:id="rId93">
         <w:r>
           <w:rPr>
             <w:rStyle w:val="Hyperlink"/>
@@ -1927,8 +2543,8 @@
         <w:t xml:space="preserve">.</w:t>
       </w:r>
     </w:p>
-    <w:bookmarkEnd w:id="72"/>
-    <w:bookmarkStart w:id="74" w:name="ref-vanparijs2023"/>
+    <w:bookmarkEnd w:id="94"/>
+    <w:bookmarkStart w:id="96" w:name="ref-vanparijs2023"/>
     <w:p>
       <w:pPr>
         <w:pStyle w:val="Bibliography"/>
@@ -1958,7 +2574,7 @@
       <w:r>
         <w:t xml:space="preserve"> </w:t>
       </w:r>
-      <w:hyperlink r:id="rId73">
+      <w:hyperlink r:id="rId95">
         <w:r>
           <w:rPr>
             <w:rStyle w:val="Hyperlink"/>
@@ -1970,9 +2586,9 @@
         <w:t xml:space="preserve">.</w:t>
       </w:r>
     </w:p>
-    <w:bookmarkEnd w:id="74"/>
-    <w:bookmarkEnd w:id="75"/>
-    <w:bookmarkEnd w:id="76"/>
+    <w:bookmarkEnd w:id="96"/>
+    <w:bookmarkEnd w:id="97"/>
+    <w:bookmarkEnd w:id="98"/>
     <w:sectPr/>
   </w:body>
 </w:document>
@@ -2079,238 +2695,8 @@
       </w:pPr>
     </w:lvl>
   </w:abstractNum>
-  <w:abstractNum w:abstractNumId="991">
-    <w:nsid w:val="0000A991"/>
-    <w:multiLevelType w:val="multilevel"/>
-    <w:lvl w:ilvl="0">
-      <w:numFmt w:val="bullet"/>
-      <w:lvlText w:val=""/>
-      <w:lvlJc w:val="left"/>
-      <w:pPr>
-        <w:ind w:left="720" w:hanging="360"/>
-      </w:pPr>
-      <w:rPr>
-        <w:rFonts w:ascii="Symbol" w:hAnsi="Symbol" w:cs="Symbol" w:hint="default"/>
-      </w:rPr>
-    </w:lvl>
-    <w:lvl w:ilvl="1">
-      <w:numFmt w:val="bullet"/>
-      <w:lvlText w:val="o"/>
-      <w:lvlJc w:val="left"/>
-      <w:pPr>
-        <w:ind w:left="1440" w:hanging="360"/>
-      </w:pPr>
-      <w:rPr>
-        <w:rFonts w:ascii="Courier New" w:hAnsi="Courier New" w:cs="Courier New" w:hint="default"/>
-      </w:rPr>
-    </w:lvl>
-    <w:lvl w:ilvl="2">
-      <w:numFmt w:val="bullet"/>
-      <w:lvlText w:val=""/>
-      <w:lvlJc w:val="left"/>
-      <w:pPr>
-        <w:ind w:left="2160" w:hanging="360"/>
-      </w:pPr>
-      <w:rPr>
-        <w:rFonts w:ascii="Wingdings" w:hAnsi="Wingdings" w:cs="Wingdings" w:hint="default"/>
-      </w:rPr>
-    </w:lvl>
-    <w:lvl w:ilvl="3">
-      <w:numFmt w:val="bullet"/>
-      <w:lvlText w:val=""/>
-      <w:lvlJc w:val="left"/>
-      <w:pPr>
-        <w:ind w:left="2880" w:hanging="360"/>
-      </w:pPr>
-      <w:rPr>
-        <w:rFonts w:ascii="Symbol" w:hAnsi="Symbol" w:cs="Symbol" w:hint="default"/>
-      </w:rPr>
-    </w:lvl>
-    <w:lvl w:ilvl="4">
-      <w:numFmt w:val="bullet"/>
-      <w:lvlText w:val="o"/>
-      <w:lvlJc w:val="left"/>
-      <w:pPr>
-        <w:ind w:left="3600" w:hanging="360"/>
-      </w:pPr>
-      <w:rPr>
-        <w:rFonts w:ascii="Courier New" w:hAnsi="Courier New" w:cs="Courier New" w:hint="default"/>
-      </w:rPr>
-    </w:lvl>
-    <w:lvl w:ilvl="5">
-      <w:numFmt w:val="bullet"/>
-      <w:lvlText w:val=""/>
-      <w:lvlJc w:val="left"/>
-      <w:pPr>
-        <w:ind w:left="4320" w:hanging="360"/>
-      </w:pPr>
-      <w:rPr>
-        <w:rFonts w:ascii="Wingdings" w:hAnsi="Wingdings" w:cs="Wingdings" w:hint="default"/>
-      </w:rPr>
-    </w:lvl>
-    <w:lvl w:ilvl="6">
-      <w:numFmt w:val="bullet"/>
-      <w:lvlText w:val=""/>
-      <w:lvlJc w:val="left"/>
-      <w:pPr>
-        <w:ind w:left="5040" w:hanging="360"/>
-      </w:pPr>
-      <w:rPr>
-        <w:rFonts w:ascii="Symbol" w:hAnsi="Symbol" w:cs="Symbol" w:hint="default"/>
-      </w:rPr>
-    </w:lvl>
-    <w:lvl w:ilvl="7">
-      <w:numFmt w:val="bullet"/>
-      <w:lvlText w:val="o"/>
-      <w:lvlJc w:val="left"/>
-      <w:pPr>
-        <w:ind w:left="5760" w:hanging="360"/>
-      </w:pPr>
-      <w:rPr>
-        <w:rFonts w:ascii="Courier New" w:hAnsi="Courier New" w:cs="Courier New" w:hint="default"/>
-      </w:rPr>
-    </w:lvl>
-    <w:lvl w:ilvl="8">
-      <w:numFmt w:val="bullet"/>
-      <w:lvlText w:val=""/>
-      <w:lvlJc w:val="left"/>
-      <w:pPr>
-        <w:ind w:left="6480" w:hanging="360"/>
-      </w:pPr>
-      <w:rPr>
-        <w:rFonts w:ascii="Wingdings" w:hAnsi="Wingdings" w:cs="Wingdings" w:hint="default"/>
-      </w:rPr>
-    </w:lvl>
-  </w:abstractNum>
-  <w:abstractNum w:abstractNumId="99411">
-    <w:nsid w:val="00A99411"/>
-    <w:multiLevelType w:val="multilevel"/>
-    <w:lvl w:ilvl="0">
-      <w:start w:val="1"/>
-      <w:numFmt w:val="decimal"/>
-      <w:lvlText w:val="%1."/>
-      <w:lvlJc w:val="left"/>
-      <w:pPr>
-        <w:ind w:left="720" w:hanging="360"/>
-      </w:pPr>
-    </w:lvl>
-    <w:lvl w:ilvl="1">
-      <w:start w:val="1"/>
-      <w:numFmt w:val="decimal"/>
-      <w:lvlText w:val="%2."/>
-      <w:lvlJc w:val="left"/>
-      <w:pPr>
-        <w:ind w:left="1440" w:hanging="360"/>
-      </w:pPr>
-    </w:lvl>
-    <w:lvl w:ilvl="2">
-      <w:start w:val="1"/>
-      <w:numFmt w:val="decimal"/>
-      <w:lvlText w:val="%3."/>
-      <w:lvlJc w:val="left"/>
-      <w:pPr>
-        <w:ind w:left="2160" w:hanging="360"/>
-      </w:pPr>
-    </w:lvl>
-    <w:lvl w:ilvl="3">
-      <w:start w:val="1"/>
-      <w:numFmt w:val="decimal"/>
-      <w:lvlText w:val="%4."/>
-      <w:lvlJc w:val="left"/>
-      <w:pPr>
-        <w:ind w:left="2880" w:hanging="360"/>
-      </w:pPr>
-    </w:lvl>
-    <w:lvl w:ilvl="4">
-      <w:start w:val="1"/>
-      <w:numFmt w:val="decimal"/>
-      <w:lvlText w:val="%5."/>
-      <w:lvlJc w:val="left"/>
-      <w:pPr>
-        <w:ind w:left="3600" w:hanging="360"/>
-      </w:pPr>
-    </w:lvl>
-    <w:lvl w:ilvl="5">
-      <w:start w:val="1"/>
-      <w:numFmt w:val="decimal"/>
-      <w:lvlText w:val="%6."/>
-      <w:lvlJc w:val="left"/>
-      <w:pPr>
-        <w:ind w:left="4320" w:hanging="360"/>
-      </w:pPr>
-    </w:lvl>
-    <w:lvl w:ilvl="6">
-      <w:start w:val="1"/>
-      <w:numFmt w:val="decimal"/>
-      <w:lvlText w:val="%7."/>
-      <w:lvlJc w:val="left"/>
-      <w:pPr>
-        <w:ind w:left="5040" w:hanging="360"/>
-      </w:pPr>
-    </w:lvl>
-    <w:lvl w:ilvl="7">
-      <w:start w:val="1"/>
-      <w:numFmt w:val="decimal"/>
-      <w:lvlText w:val="%8."/>
-      <w:lvlJc w:val="left"/>
-      <w:pPr>
-        <w:ind w:left="5760" w:hanging="360"/>
-      </w:pPr>
-    </w:lvl>
-    <w:lvl w:ilvl="8">
-      <w:start w:val="1"/>
-      <w:numFmt w:val="decimal"/>
-      <w:lvlText w:val="%9."/>
-      <w:lvlJc w:val="left"/>
-      <w:pPr>
-        <w:ind w:left="6480" w:hanging="360"/>
-      </w:pPr>
-    </w:lvl>
-  </w:abstractNum>
   <w:num w:numId="1000">
     <w:abstractNumId w:val="990"/>
-  </w:num>
-  <w:num w:numId="1001">
-    <w:abstractNumId w:val="991"/>
-  </w:num>
-  <w:num w:numId="1002">
-    <w:abstractNumId w:val="991"/>
-  </w:num>
-  <w:num w:numId="1003">
-    <w:abstractNumId w:val="99411"/>
-    <w:lvlOverride w:ilvl="0">
-      <w:startOverride w:val="1"/>
-    </w:lvlOverride>
-    <w:lvlOverride w:ilvl="1">
-      <w:startOverride w:val="1"/>
-    </w:lvlOverride>
-    <w:lvlOverride w:ilvl="2">
-      <w:startOverride w:val="1"/>
-    </w:lvlOverride>
-    <w:lvlOverride w:ilvl="3">
-      <w:startOverride w:val="1"/>
-    </w:lvlOverride>
-    <w:lvlOverride w:ilvl="4">
-      <w:startOverride w:val="1"/>
-    </w:lvlOverride>
-    <w:lvlOverride w:ilvl="5">
-      <w:startOverride w:val="1"/>
-    </w:lvlOverride>
-    <w:lvlOverride w:ilvl="6">
-      <w:startOverride w:val="1"/>
-    </w:lvlOverride>
-    <w:lvlOverride w:ilvl="7">
-      <w:startOverride w:val="1"/>
-    </w:lvlOverride>
-    <w:lvlOverride w:ilvl="8">
-      <w:startOverride w:val="1"/>
-    </w:lvlOverride>
-  </w:num>
-  <w:num w:numId="1004">
-    <w:abstractNumId w:val="991"/>
-  </w:num>
-  <w:num w:numId="1005">
-    <w:abstractNumId w:val="991"/>
   </w:num>
 </w:numbering>
 </file>

</xml_diff>

<commit_message>
First Draft of Thesis Results
</commit_message>
<xml_diff>
--- a/R/Thesis Draft - Geographic Variation in Echolocation Clicks of Risso's Dolphins in the California Current.docx
+++ b/R/Thesis Draft - Geographic Variation in Echolocation Clicks of Risso's Dolphins in the California Current.docx
@@ -94,7 +94,7 @@
         <w:t xml:space="preserve">Current</w:t>
       </w:r>
     </w:p>
-    <w:bookmarkStart w:id="20" w:name="authors"/>
+    <w:bookmarkStart w:id="21" w:name="authors"/>
     <w:p>
       <w:pPr>
         <w:pStyle w:val="Heading2"/>
@@ -114,6 +114,31 @@
       <w:r>
         <w:t xml:space="preserve">Sarah M.S. Moseley</w:t>
       </w:r>
+    </w:p>
+    <w:p>
+      <w:pPr>
+        <w:pStyle w:val="BodyText"/>
+      </w:pPr>
+      <w:r>
+        <w:t xml:space="preserve">San Francisco State University’s Estuary and Ocean Science Center</w:t>
+      </w:r>
+    </w:p>
+    <w:bookmarkStart w:id="20" w:name="for-manuscript"/>
+    <w:p>
+      <w:pPr>
+        <w:pStyle w:val="Heading3"/>
+      </w:pPr>
+      <w:r>
+        <w:t xml:space="preserve">For Manuscript</w:t>
+      </w:r>
+    </w:p>
+    <w:p>
+      <w:pPr>
+        <w:pStyle w:val="FirstParagraph"/>
+      </w:pPr>
+      <w:r>
+        <w:t xml:space="preserve">Sarah M.S. Moseley</w:t>
+      </w:r>
       <w:r>
         <w:rPr>
           <w:vertAlign w:val="superscript"/>
@@ -171,6 +196,14 @@
         <w:pStyle w:val="BodyText"/>
       </w:pPr>
       <w:r>
+        <w:t xml:space="preserve">*Add Jeff and Jay</w:t>
+      </w:r>
+    </w:p>
+    <w:p>
+      <w:pPr>
+        <w:pStyle w:val="BodyText"/>
+      </w:pPr>
+      <w:r>
         <w:rPr>
           <w:vertAlign w:val="superscript"/>
         </w:rPr>
@@ -180,7 +213,7 @@
         <w:t xml:space="preserve"> </w:t>
       </w:r>
       <w:r>
-        <w:t xml:space="preserve">San Francisco State University</w:t>
+        <w:t xml:space="preserve">San Francisco State University’s Estuary and Ocean Science Center</w:t>
       </w:r>
     </w:p>
     <w:p>
@@ -235,7 +268,8 @@
       </w:r>
     </w:p>
     <w:bookmarkEnd w:id="20"/>
-    <w:bookmarkStart w:id="21" w:name="acknowledgements"/>
+    <w:bookmarkEnd w:id="21"/>
+    <w:bookmarkStart w:id="22" w:name="acknowledgements"/>
     <w:p>
       <w:pPr>
         <w:pStyle w:val="Heading1"/>
@@ -252,8 +286,8 @@
         <w:t xml:space="preserve">Committee, Co-authors, EOS Center, Simonis-Hines-Jahncke Lab, BOEM and NOAA for data collection, CSU COAST, ONR for graduate student support, Melissa Soldevilla, Soldevilla et al. 2017, Sara Keen</w:t>
       </w:r>
     </w:p>
-    <w:bookmarkEnd w:id="21"/>
-    <w:bookmarkStart w:id="22" w:name="i.-introduction"/>
+    <w:bookmarkEnd w:id="22"/>
+    <w:bookmarkStart w:id="23" w:name="i.-introduction"/>
     <w:p>
       <w:pPr>
         <w:pStyle w:val="Heading1"/>
@@ -488,7 +522,7 @@
         <w:pStyle w:val="BodyText"/>
       </w:pPr>
       <w:r>
-        <w:t xml:space="preserve">Beyond direct comparison of peak and notch frequencies, advances in unsupervised learning approaches provide an opportunity to examine variation at the echolocation click spectral-level. Dimensionality reduction and clustering techniques have been increasingly applied in bioacoustics to identify recurring signal types, characterize vocal repertoires, and explore structure within large spatial and temporal scale acoustic datatsets</w:t>
+        <w:t xml:space="preserve">Beyond direct comparison of peak and notch frequencies, advances in unsupervised learning approaches provide an opportunity to examine variation at the echolocation click spectral-level. Dimensionality reduction and clustering techniques have been increasingly applied in bioacoustics to identify recurring signal types, characterize vocal repertoires, and explore structure within large spatial and temporal scale acoustic datasets</w:t>
       </w:r>
       <w:r>
         <w:t xml:space="preserve"> </w:t>
@@ -547,7 +581,10 @@
         <w:t xml:space="preserve">Soldevilla et al. (2008)</w:t>
       </w:r>
       <w:r>
-        <w:t xml:space="preserve">,</w:t>
+        <w:t xml:space="preserve"> </w:t>
+      </w:r>
+      <w:r>
+        <w:t xml:space="preserve">and</w:t>
       </w:r>
       <w:r>
         <w:t xml:space="preserve"> </w:t>
@@ -559,7 +596,7 @@
         <w:t xml:space="preserve"> </w:t>
       </w:r>
       <w:r>
-        <w:t xml:space="preserve">characterize spectral characteristics and variation of Risso’s clicks in regions such as the U.S. East Coast, Gulf of Mexico, Hawaiian Islands, and the Southern California Bight, the CCE has not be studied as its own ecosystem-scale case</w:t>
+        <w:t xml:space="preserve">characterize spectral characteristics and variation of Risso’s clicks in regions such as the U.S. East Coast, Gulf of Mexico, Hawaiian Islands, and the California Current’s Southern California Bight, the CCE has not be studied as its own ecosystem-scale case</w:t>
       </w:r>
       <w:r>
         <w:t xml:space="preserve"> </w:t>
@@ -617,7 +654,7 @@
         <w:pStyle w:val="BodyText"/>
       </w:pPr>
       <w:r>
-        <w:t xml:space="preserve">This study examines the echolocation clicks of Risso’s dolphins within the CCE and serves as the first comprehensive assessment of Risso’s dolphin click characteristics across the CCE – enabling comparison with other US regions where click-type divergence has been observed. First, click events were screened for quality through manual inspection to exclude background noise and non-target signals, and spectra were smoothed to enhance consistent banding structure. Next, a spectral-temporal clustering framework incorporating principal component analysis (PCA), UMAP, and HDBSCAN was used to identify recurring click types across encounters. Finally, the geographic distribution and spectral characteristics of identified click types were evaluated throughout the CCE and compared with patterns previously described by</w:t>
+        <w:t xml:space="preserve">This study examines the echolocation clicks of Risso’s dolphins within the CCE and serves as the first comprehensive assessment of Risso’s dolphin click characteristics across the CCE – enabling comparison with other US regions where click type divergence has been observed. First, click events were screened for quality through manual inspection to exclude background noise and non-target signals, and spectra were smoothed to enhance consistent banding structure. Next, a spectral-temporal clustering framework incorporating principal component analysis (PCA), UMAP, and HDBSCAN was used to identify recurring click types across encounters. Finally, the geographic distribution and spectral characteristics of identified click types were evaluated throughout the CCE and compared with patterns previously described by</w:t>
       </w:r>
       <w:r>
         <w:t xml:space="preserve"> </w:t>
@@ -629,8 +666,8 @@
         <w:t xml:space="preserve">.</w:t>
       </w:r>
     </w:p>
-    <w:bookmarkEnd w:id="22"/>
-    <w:bookmarkStart w:id="29" w:name="ii.-materials-and-methods"/>
+    <w:bookmarkEnd w:id="23"/>
+    <w:bookmarkStart w:id="31" w:name="ii.-materials-and-methods"/>
     <w:p>
       <w:pPr>
         <w:pStyle w:val="Heading1"/>
@@ -639,7 +676,7 @@
         <w:t xml:space="preserve">II. Materials and Methods</w:t>
       </w:r>
     </w:p>
-    <w:bookmarkStart w:id="23" w:name="Xb11bf955ab4723df6efc69c04c2bdf4ac91893c"/>
+    <w:bookmarkStart w:id="24" w:name="Xb11bf955ab4723df6efc69c04c2bdf4ac91893c"/>
     <w:p>
       <w:pPr>
         <w:pStyle w:val="Heading2"/>
@@ -653,7 +690,7 @@
         <w:pStyle w:val="FirstParagraph"/>
       </w:pPr>
       <w:r>
-        <w:t xml:space="preserve">The acoustic data used in this study were collected as part of three off-shore acoustic surveys conducted by National Oceanographic and Atmospheric Administration Southwest Fisheries Science Center (NOAA SWFSC) and the Bureau of Ocean Energy Management (BOEM). For this study, field data collection was not involved; instead, it makes use of the collected PAM datatsets generated during these coordinated inter-agency efforts.</w:t>
+        <w:t xml:space="preserve">The acoustic data used in this study were collected as part of three off-shore acoustic surveys conducted by National Oceanographic and Atmospheric Administration Southwest Fisheries Science Center (NOAA SWFSC) and the Bureau of Ocean Energy Management (BOEM). For this study, field data collection was not involved; instead, it makes use of the collected PAM datasets generated during these coordinated inter-agency efforts.</w:t>
       </w:r>
     </w:p>
     <w:p>
@@ -661,16 +698,7 @@
         <w:pStyle w:val="BodyText"/>
       </w:pPr>
       <w:r>
-        <w:t xml:space="preserve">The three surveys included in this study were the Passive Acoustic Survey of Cetacean Abundance Levels (PASCAL, 2016), the California Current Ecosystem Survey (CCES, 2018), and Adrift in the California Current (Adrift, 2020-2023)</w:t>
-      </w:r>
-      <w:r>
-        <w:t xml:space="preserve"> </w:t>
-      </w:r>
-      <w:r>
-        <w:t xml:space="preserve">(Keating et al. 2018; Simonis et al. 2020; Rankin et al. 2025)</w:t>
-      </w:r>
-      <w:r>
-        <w:t xml:space="preserve">. Together these surveys allow for broad-scale spatial and temporal coverage of the CCE, spanning from the south tip of the Baja California Peninsula to the Washington/Canadian border. In combining the three surveys, both near-shore and off-shore waters of the CCE were accounted for, including focal regions associated with proposed off-shore wind energy development along the U.S. West Coast; Morro Bay, off-shore San Francisco, and Humboldt Bay in California, and Brookings and Coos Bay in Oregon</w:t>
+        <w:t xml:space="preserve">The three surveys included in this study were the Passive Acoustic Survey of Cetacean Abundance Levels (PASCAL, 2016; Keating et al. 2018), the California Current Ecosystem Survey (CCES, 2018; Simonis et al. 2020), and Adrift in the California Current (Adrift, 2020-2023; Rankin et al. 2025). Together these surveys allow for broad-scale spatial and temporal coverage of the CCE, spanning from the south tip of the Baja California Peninsula to the Washington/Canadian border and the United States West Coast. Additionally, this dataset accounts for focal regions associated with proposed off-shore wind energy development along the U.S. West Coast; Morro Bay, off-shore San Francisco, and Humboldt Bay in California, and Brookings and Coos Bay in Oregon</w:t>
       </w:r>
       <w:r>
         <w:t xml:space="preserve"> </w:t>
@@ -687,7 +715,7 @@
         <w:pStyle w:val="BodyText"/>
       </w:pPr>
       <w:r>
-        <w:t xml:space="preserve">The acoustic recordings used from these surveys were collected using drifting passive acoustic recorders made up of a buoy and satellite GPS at the surface, with a vertically suspended hydrophone array and autonomous recorder positioned at depth. The devices were designed to flow freely currents and weather patterns while continuously keeping the recording instruments deep enough to reduce surface noise contamination.</w:t>
+        <w:t xml:space="preserve">The acoustic recordings used from these surveys were collected using drifting passive acoustic recorders made up of a buoy and satellite GPS at the surface, with a vertically suspended hydrophone array and autonomous recorder positioned at depth. The devices were designed to flow freely with currents while continuously keeping the recording instruments deep enough to reduce surface noise contamination.</w:t>
       </w:r>
     </w:p>
     <w:p>
@@ -695,7 +723,16 @@
         <w:pStyle w:val="BodyText"/>
       </w:pPr>
       <w:r>
-        <w:t xml:space="preserve">The hydrophone array was deployed approximately 100 meters down in the water column and was composed of two vertically spaced hydrophones placed approximately 5 meters apart allowing for improved acoustic detections using triangulation. The recording components were programmed to sample at a minimum sampling rate of 288 kHz, allowing for broadband acoustic signals to be captured, with the Adrift survey sampling continuously and PASCAL and CCES utilizing duty cycling resulting in 2 minute acoustic files. To ensure comparability across deployments, this study is restricted to recordings collected using SoundTrap recorders equipped with a HTI-92WB hydrophone model. This works to minimize variability in factors that could otherwise negate comparisons of acoustic detections.</w:t>
+        <w:t xml:space="preserve">The hydrophone array was suspended approximately at 100 meters depth and was composed of two hydrophones spaced approximately 5 meters apart allowing for signal localization via time difference of arrival</w:t>
+      </w:r>
+      <w:r>
+        <w:t xml:space="preserve"> </w:t>
+      </w:r>
+      <w:r>
+        <w:t xml:space="preserve">(Douglas Gillespie and Macaulay 2019)</w:t>
+      </w:r>
+      <w:r>
+        <w:t xml:space="preserve">. The SoundTraps (Ocean Instruments, NZ) were programmed to record acoustic data at a minimum sampling rate of 288 kHz, with continuous recording schedules on Adrift and 2 minute duty cycles on PASCAL and CCES. To ensure comparability across deployments, this study is restricted to recordings collected using SoundTrap recorders (models ST4300 and ST640) equipped with a HTI-92WB hydrophone. This works to minimize variability in factors that could otherwise negate comparisons of acoustic detections.</w:t>
       </w:r>
     </w:p>
     <w:p>
@@ -731,14 +768,14 @@
         <w:t xml:space="preserve">.</w:t>
       </w:r>
     </w:p>
-    <w:bookmarkEnd w:id="23"/>
-    <w:bookmarkStart w:id="24" w:name="Xf8f607feced794e2d706b98caf34a6b8d085611"/>
+    <w:bookmarkEnd w:id="24"/>
+    <w:bookmarkStart w:id="25" w:name="X8a9f7c232a166109e6be4c35b34d04d776fd5d4"/>
     <w:p>
       <w:pPr>
         <w:pStyle w:val="Heading2"/>
       </w:pPr>
       <w:r>
-        <w:t xml:space="preserve">B. Signal Processing and Click Feature Extraction</w:t>
+        <w:t xml:space="preserve">B. Acoustic Event Processing and Click-Level Quality Control</w:t>
       </w:r>
     </w:p>
     <w:p>
@@ -746,7 +783,7 @@
         <w:pStyle w:val="FirstParagraph"/>
       </w:pPr>
       <w:r>
-        <w:t xml:space="preserve">Acoustic recordings from the PASCAL, CCES, and Adrift surveys were initially pre-processed by NOAA analysts resulting in the identification of acoustic events of multiple species, including Risso’s dolphins</w:t>
+        <w:t xml:space="preserve">Acoustic recordings from the PASCAL, CCES, and Adrift surveys were initially pre-processed by NOAA analysts</w:t>
       </w:r>
       <w:r>
         <w:t xml:space="preserve"> </w:t>
@@ -755,13 +792,22 @@
         <w:t xml:space="preserve">(Rankin et al. 2025)</w:t>
       </w:r>
       <w:r>
+        <w:t xml:space="preserve">. Analysts used Matlab-based Triton software to identify the start and end times of acoustic events of Risso’s dolphin echolocation clicks using long-term spectral averages (LTSA) viewed in one hour increments with a five second, 200 Hz resolution</w:t>
+      </w:r>
+      <w:r>
+        <w:t xml:space="preserve"> </w:t>
+      </w:r>
+      <w:r>
+        <w:t xml:space="preserve">(Frasier et al. 2024)</w:t>
+      </w:r>
+      <w:r>
         <w:t xml:space="preserve">. From these analyst-labelled events, broadband echolocation clicks were identified using a customized detection workflow within the PAMguard software [version 2.02.15;</w:t>
       </w:r>
       <w:r>
         <w:t xml:space="preserve"> </w:t>
       </w:r>
       <w:r>
-        <w:t xml:space="preserve">Gillespie et al. (2008)</w:t>
+        <w:t xml:space="preserve">D. Gillespie et al. (2008)</w:t>
       </w:r>
       <w:r>
         <w:t xml:space="preserve">]. Click detection utilized a 15 dB signal-to-noise (SNR) threshold. Echolocation clicks were grouped into categories dependent upon click peak frequency, with each category identified by a symbol and shape, paralleling the systems used by</w:t>
@@ -802,7 +848,16 @@
         <w:pStyle w:val="BodyText"/>
       </w:pPr>
       <w:r>
-        <w:t xml:space="preserve">Events were organized into event-level databases, binaries, and acoustic study files for subsequent review and analysis. From these events, concatenated spectrograms and mean spectra were generated in R in order to facilitate visual inspection and species confirmation.</w:t>
+        <w:t xml:space="preserve">Event-level acoustic study files were generated in PAMpal in R from copied PAMGuard SQLite databases and associated binary files</w:t>
+      </w:r>
+      <w:r>
+        <w:t xml:space="preserve"> </w:t>
+      </w:r>
+      <w:r>
+        <w:t xml:space="preserve">(Sakai et al. 2026)</w:t>
+      </w:r>
+      <w:r>
+        <w:t xml:space="preserve">. For each drift, PAMpal settings were defined using the corresponding database and binary folder, with the sampling rate detected automatically, a 2.5 ms analysis window, and a 10–80 kHz frequency filter applied during click processing. Analyst-identified Risso’s dolphin event times were imported into R, converted to UTC start and end times, and used to group PAMGuard click detections into event-level acoustic study objects. For CCES deployments, event end times were defined as 119 seconds after the start time to reflect the two-minute duty-cycle recording structure. During this processing step, click-level metadata were extracted from the PAMGuard detections, including unique click identifiers, timing information, amplitude, frequency measurements, inter-click interval (ICI), and other detector-derived spectral and temporal features.</w:t>
       </w:r>
     </w:p>
     <w:p>
@@ -810,7 +865,7 @@
         <w:pStyle w:val="BodyText"/>
       </w:pPr>
       <w:r>
-        <w:t xml:space="preserve">To limit the inclusion of non-target echolocation clicks, each candidate Risso’s event was manually reviewed through the comparison of concatenated spectrograms, spectra, and broader event context. Events were retained as usable events only when displaying the anticipated spectral banding signature of Risso’ dolphins, containing more than 100 echolocation clicks to ensure sufficient representation of spectra structure, and not overlapping with recorded detections of other cetacean species</w:t>
+        <w:t xml:space="preserve">To limit the inclusion of non-target echolocation clicks, each candidate Risso’s dolphin event was manually reviewed through comparison of concatenated spectrograms, mean spectra, and broader event context. Events were retained only when they displayed the expected spectral banding structure of Risso’s dolphin echolocation clicks, contained more than 100 echolocation clicks to ensure sufficient representation of spectral structure, and did not overlap with recorded detections of other cetacean species</w:t>
       </w:r>
       <w:r>
         <w:t xml:space="preserve"> </w:t>
@@ -819,116 +874,100 @@
         <w:t xml:space="preserve">(Soldevilla et al. 2017)</w:t>
       </w:r>
       <w:r>
-        <w:t xml:space="preserve">. Additionally, events occurring within 20 minutes before or after a non-target species detection were excluded and classified as potential multi-species encounters to reduce the likelihood of contaminated acoustic events. For all retained events, duplicated</w:t>
-      </w:r>
-      <w:r>
-        <w:t xml:space="preserve"> </w:t>
-      </w:r>
-      <w:r>
-        <w:t xml:space="preserve">“</w:t>
-      </w:r>
-      <w:r>
-        <w:t xml:space="preserve">clean</w:t>
-      </w:r>
-      <w:r>
-        <w:t xml:space="preserve">”</w:t>
-      </w:r>
-      <w:r>
-        <w:t xml:space="preserve"> </w:t>
-      </w:r>
-      <w:r>
-        <w:t xml:space="preserve">versions of the acoustic databases were created for further click-level processing and manual cleaning.</w:t>
-      </w:r>
-    </w:p>
-    <w:p>
-      <w:pPr>
-        <w:pStyle w:val="BodyText"/>
-      </w:pPr>
-      <w:r>
-        <w:t xml:space="preserve">Click-level processing was carried out via the PAMpal package in RStudio</w:t>
-      </w:r>
-      <w:r>
-        <w:t xml:space="preserve"> </w:t>
-      </w:r>
-      <w:r>
-        <w:t xml:space="preserve">(Sakai et al. 2026)</w:t>
-      </w:r>
-      <w:r>
-        <w:t xml:space="preserve">. From the cleaned acoustic study databases, echolocation clicks were automatically detected, and the related click-level metadata were extracted, including click features such as inter-click interval (ICI), amplitude, frequency values, spectral characteristics, and temporal information. Event start and end times, as well as associated metadata, were defined in R.</w:t>
-      </w:r>
-    </w:p>
-    <w:p>
-      <w:pPr>
-        <w:pStyle w:val="BodyText"/>
-      </w:pPr>
-      <w:r>
-        <w:t xml:space="preserve">Following the processing workflow in PAMGuard and R, all retained events underwent further processing through manual click-level cleaning of the clean copies of the database files in PAMGuard. For each event, the concatenated spectrograms and mean spectra were visually inspected to identify clicks lacking the characteristic spectral banding structure of Risso’s dolphin echolocation clicks. Suspect detections were then manually reviewed directly within PAMGuard and removed when determined to be inconsistent with the target click characteristics</w:t>
-      </w:r>
-      <w:r>
-        <w:t xml:space="preserve"> </w:t>
-      </w:r>
-      <w:r>
-        <w:t xml:space="preserve">(Soldevilla et al. 2017)</w:t>
-      </w:r>
-      <w:r>
-        <w:t xml:space="preserve">. This reiterative review process was conducted in order to maximize consistency of the echolocation click dataset, while also minimizing the influence of non-biological or non-meaningful acoustic signals.</w:t>
-      </w:r>
-    </w:p>
-    <w:p>
-      <w:pPr>
-        <w:pStyle w:val="BodyText"/>
-      </w:pPr>
-      <w:r>
-        <w:t xml:space="preserve">To reduce small-scale spectral fluctuations while preserving the broader peak and notch structure of echolocation clicks across events, click spectra were smoothed using a five-point Tukey smoothing approach prior to downstream analyses</w:t>
-      </w:r>
-      <w:r>
-        <w:t xml:space="preserve"> </w:t>
-      </w:r>
-      <w:r>
-        <w:t xml:space="preserve">(L. Rabiner, Sambur, and Schmidt 1975)</w:t>
-      </w:r>
-      <w:r>
-        <w:t xml:space="preserve">. Tukey smoothing was applied before spectral feature extraction, peak and notch identification, and clustering to improve the stability and consistency of spectral banding patterns across clicks and events.</w:t>
-      </w:r>
-    </w:p>
-    <w:p>
-      <w:pPr>
-        <w:pStyle w:val="BodyText"/>
-      </w:pPr>
-      <w:r>
-        <w:t xml:space="preserve">Cepstral liftering approaches as described in previous studies by Soldevilla et al. (2008, 2017) were also explored as a way of further emphasizing spectral banding within clicks during preliminary processing</w:t>
-      </w:r>
-      <w:r>
-        <w:t xml:space="preserve"> </w:t>
-      </w:r>
-      <w:r>
-        <w:t xml:space="preserve">(Lawrence Rabiner and Juang 1993)</w:t>
-      </w:r>
-      <w:r>
-        <w:t xml:space="preserve">. However, liftering produced minimal changes to the generated concatenated spectrograms and spectra, and ultimately did not improve the interpretability of examined spectral features. For this reason, all subsequent analyses were conducted using only the Tukey-smoothed spectra.</w:t>
-      </w:r>
-    </w:p>
-    <w:bookmarkEnd w:id="24"/>
-    <w:bookmarkStart w:id="27" w:name="X05c11d82f75fe162771995ec2f7d26cad316dd3"/>
-    <w:p>
-      <w:pPr>
-        <w:pStyle w:val="Heading2"/>
-      </w:pPr>
-      <w:r>
-        <w:t xml:space="preserve">C. Spectral Feature Clustering and Geographic Variation</w:t>
-      </w:r>
-    </w:p>
-    <w:bookmarkStart w:id="25" w:name="spectral-pre-processing"/>
-    <w:p>
-      <w:pPr>
-        <w:pStyle w:val="Heading3"/>
-      </w:pPr>
+        <w:t xml:space="preserve">. Events occurring within 20 minutes before or after a non-target species detection, such as Pacific white-sided dolphin (</w:t>
+      </w:r>
       <w:r>
         <w:rPr>
           <w:i/>
           <w:iCs/>
         </w:rPr>
-        <w:t xml:space="preserve">1. Spectral Pre-processing</w:t>
+        <w:t xml:space="preserve">Aethalodelphis obliquidens</w:t>
+      </w:r>
+      <w:r>
+        <w:t xml:space="preserve">), were excluded and classified as potential multi-species encounters to reduce the likelihood of acoustic contamination.</w:t>
+      </w:r>
+    </w:p>
+    <w:p>
+      <w:pPr>
+        <w:pStyle w:val="BodyText"/>
+      </w:pPr>
+      <w:r>
+        <w:t xml:space="preserve">For all retained events, duplicated clean copies of the PAMGuard databases were used for manual click-level review. Concatenated spectrograms and mean spectra were visually inspected to identify individual clicks lacking the characteristic Risso’s dolphin spectral banding structure. Suspect detections were then reviewed directly in PAMGuard and removed when determined to be inconsistent with target click characteristics or likely to represent non-biological or non-meaningful acoustic signals</w:t>
+      </w:r>
+      <w:r>
+        <w:t xml:space="preserve"> </w:t>
+      </w:r>
+      <w:r>
+        <w:t xml:space="preserve">(Soldevilla et al. 2017)</w:t>
+      </w:r>
+      <w:r>
+        <w:t xml:space="preserve">. This iterative review process was used to improve consistency of the final echolocation click dataset prior to downstream analyses.</w:t>
+      </w:r>
+    </w:p>
+    <w:p>
+      <w:pPr>
+        <w:pStyle w:val="BodyText"/>
+      </w:pPr>
+      <w:r>
+        <w:t xml:space="preserve">To reduce small-scale spectral fluctuations while preserving the broader peak and notch structure of echolocation clicks, click spectra from the cleaned dataset were smoothed using a five-point Tukey smoothing approach</w:t>
+      </w:r>
+      <w:r>
+        <w:t xml:space="preserve"> </w:t>
+      </w:r>
+      <w:r>
+        <w:t xml:space="preserve">(L. Rabiner, Sambur, and Schmidt 1975)</w:t>
+      </w:r>
+      <w:r>
+        <w:t xml:space="preserve">. Tukey smoothing was applied before spectral feature extraction and clustering to improve the stability and consistency of spectral banding patterns across clicks and events.</w:t>
+      </w:r>
+    </w:p>
+    <w:p>
+      <w:pPr>
+        <w:pStyle w:val="BodyText"/>
+      </w:pPr>
+      <w:r>
+        <w:t xml:space="preserve">Cepstral liftering approaches were also explored as a potential method for reducing broad spectral effects related to transmission loss, recording system response, and overall spectral tilt while preserving the finer-scale peak and notch structure of Risso’s dolphin echolocation clicks (Soldevilla et al. 2008, 2017). In cepstral analysis, the log-magnitude spectrum is transformed into the cepstral domain, where low cepstral coefficients, or quefrencies, describe slowly varying spectral structure, while higher quefrencies retain finer-scale spectral features [</w:t>
+      </w:r>
+      <w:r>
+        <w:t xml:space="preserve"> </w:t>
+      </w:r>
+      <w:r>
+        <w:t xml:space="preserve">Picone (1993)</w:t>
+      </w:r>
+      <w:r>
+        <w:t xml:space="preserve">;</w:t>
+      </w:r>
+      <w:r>
+        <w:t xml:space="preserve"> </w:t>
+      </w:r>
+      <w:r>
+        <w:t xml:space="preserve">Lawrence Rabiner and Juang (1993)</w:t>
+      </w:r>
+      <w:r>
+        <w:t xml:space="preserve">]. Previous Risso’s dolphin studies used high-pass liftering after truncating spectra to 19–50 kHz to de-emphasize broad spectral-envelope effects while retaining the main peak and notch features used to describe spectral banding (Soldevilla et al. 2008, 2017). In the present study, liftering was tested on the click spectra but produced only minor visual changes to the concatenated spectrograms and mean spectra. The dominant peak and notch positions remained largely unchanged, and liftering did not reveal additional consistent banding structure or improve visual separation of spectral features beyond the Tukey-smoothed spectra. Therefore, all subsequent analyses were conducted using only the Tukey-smoothed spectra.</w:t>
+      </w:r>
+    </w:p>
+    <w:bookmarkEnd w:id="25"/>
+    <w:bookmarkStart w:id="28" w:name="Xffdcfb37901fcb4dbec6b009e4897a02658a1bc"/>
+    <w:p>
+      <w:pPr>
+        <w:pStyle w:val="Heading2"/>
+      </w:pPr>
+      <w:r>
+        <w:t xml:space="preserve">C. Spectral-Temporal Feature Standardization and Clustering</w:t>
+      </w:r>
+    </w:p>
+    <w:bookmarkStart w:id="26" w:name="spectral-temporal-pre-processing"/>
+    <w:p>
+      <w:pPr>
+        <w:pStyle w:val="Heading3"/>
+      </w:pPr>
+      <w:r>
+        <w:rPr>
+          <w:i/>
+          <w:iCs/>
+        </w:rPr>
+        <w:t xml:space="preserve">1. Spectral-Temporal Pre-processing</w:t>
       </w:r>
     </w:p>
     <w:p>
@@ -936,32 +975,16 @@
         <w:pStyle w:val="FirstParagraph"/>
       </w:pPr>
       <w:r>
-        <w:t xml:space="preserve">Prior to clustering analyses, all echolocation click spectra were standardized through a pre-processing workflow in order to ensure across event comparability. All processed spectra contained 512 frequency bins, although recordings originating from different surveys were represented on two distinct frequency grids. Some events were generated on a frequency grid with spacing between bins of approximately 375 Hz, while a second group of events used a finer scale frequency grid with spacing of approximately 281.25 Hz. For this reason, corresponding bin positions did not necessarily represent the same frequencies across all events. Because downstream clustering analyses compare spectra on a bin-by-bin basis, directly combining spectra from events with different frequency grids would result in comparison of values at different frequencies which could, in turn, bias clustering calculations. To remedy this difference and ensure that corresponding bins represented the same frequencies throughout the dataset, all spectra were linearly interpolated to a shared reference frequency grid with approximately 375 Hz spacing prior to further analyses.</w:t>
-      </w:r>
-    </w:p>
-    <w:p>
-      <w:pPr>
-        <w:pStyle w:val="BodyText"/>
-      </w:pPr>
-      <w:r>
-        <w:t xml:space="preserve">Following interpolation, the spectra were restricted to a range of 19-50 kHz. This frequency range encompasses the primary banding structure of Risso’s dolphin echolocation clicks, while removing lower and higher-frequency noises deemed non-pertinent to the present study. Furthermore, restricting the frequency range also allowed for direct comparison with previous literture exploring the spectral banding of Risso’s dolphins</w:t>
-      </w:r>
-      <w:r>
-        <w:t xml:space="preserve"> </w:t>
-      </w:r>
-      <w:r>
-        <w:t xml:space="preserve">(Soldevilla et al. 2008, 2017)</w:t>
-      </w:r>
-      <w:r>
-        <w:t xml:space="preserve">.</w:t>
-      </w:r>
-    </w:p>
-    <w:p>
-      <w:pPr>
-        <w:pStyle w:val="BodyText"/>
-      </w:pPr>
-      <w:r>
-        <w:t xml:space="preserve">To emphasize the spectral shape of the echolocation clicks, as opposed to absolute signal amplitude, each spectrum was min-max normalized across the 19-50 kHz frequency range</w:t>
+        <w:t xml:space="preserve">Prior to clustering analyses, echolocation click spectra were standardized to ensure comparability across events and surveys. Although all processed spectra contained 512 frequency bins, recordings were represented on two different frequency grids, with bin spacings of approximately 375 Hz or 281.25 Hz. To ensure that corresponding bins represented the same frequencies across the dataset, spectra were linearly interpolated to a shared reference frequency grid with approximately 375 Hz spacing. Following interpolation, the spectra were restricted to a range of 19–50 kHz, following methods of</w:t>
+      </w:r>
+      <w:r>
+        <w:t xml:space="preserve"> </w:t>
+      </w:r>
+      <w:r>
+        <w:t xml:space="preserve">Soldevilla et al. (2017)</w:t>
+      </w:r>
+      <w:r>
+        <w:t xml:space="preserve">. This frequency range encompasses the primary banding structure of Risso’s dolphin echolocation clicks, while removing lower- and higher-frequency components not relevant to the present analysis. Spectra were then min-max normalized across the retained frequency range so that clustering emphasized relative spectral shape rather than absolute received level</w:t>
       </w:r>
       <w:r>
         <w:t xml:space="preserve"> </w:t>
@@ -970,15 +993,7 @@
         <w:t xml:space="preserve">(Patro and Sahu 2015)</w:t>
       </w:r>
       <w:r>
-        <w:t xml:space="preserve">. Within each click, spectral values were scaled between 0 and 1, allowing for clustering analyses to focus on the relative peak and notch positions rather than received level among detections.</w:t>
-      </w:r>
-    </w:p>
-    <w:p>
-      <w:pPr>
-        <w:pStyle w:val="BodyText"/>
-      </w:pPr>
-      <w:r>
-        <w:t xml:space="preserve">ICI measurements were then joined to the spectral dataset using click-level metadata in order to be accounted for in the clustering process. To reduce the influence of buzz click sequences associated with extremely short ICIs, any clicks with an ICI below 0.01 seconds was removed from further analyses. Similarly, ICI values above 0.4 seconds were also removed as they likely indicate long temporal gaps and are unlikely to represent continuous echolocation behavior</w:t>
+        <w:t xml:space="preserve">. To incorporate temporal information while reducing the influence of non-representative click sequences, ICI measurements were joined to the spectral dataset, and clicks with ICI values below 0.01 s or above 0.4 s were removed</w:t>
       </w:r>
       <w:r>
         <w:t xml:space="preserve"> </w:t>
@@ -987,15 +1002,7 @@
         <w:t xml:space="preserve">(Madsen, Kerr, and Payne 2004)</w:t>
       </w:r>
       <w:r>
-        <w:t xml:space="preserve">.</w:t>
-      </w:r>
-    </w:p>
-    <w:p>
-      <w:pPr>
-        <w:pStyle w:val="BodyText"/>
-      </w:pPr>
-      <w:r>
-        <w:t xml:space="preserve">Finally, to minimize unequal representation among encounters, a maximum of 200 clicks were randomly sampled without replacement per event following ICI filtering</w:t>
+        <w:t xml:space="preserve">. Finally, to minimize unequal representation among encounters, a maximum of 200 clicks were randomly sampled without replacement per event following ICI filtering</w:t>
       </w:r>
       <w:r>
         <w:t xml:space="preserve"> </w:t>
@@ -1007,8 +1014,8 @@
         <w:t xml:space="preserve">. Events containing fewer clicks than the 200 click threshold retained all clicks. The resulting dataset was used for all subsequent dimensionality reduction and clustering analyses.</w:t>
       </w:r>
     </w:p>
-    <w:bookmarkEnd w:id="25"/>
-    <w:bookmarkStart w:id="26" w:name="dimensionality-reduction-and-clustering"/>
+    <w:bookmarkEnd w:id="26"/>
+    <w:bookmarkStart w:id="27" w:name="dimensionality-reduction-and-clustering"/>
     <w:p>
       <w:pPr>
         <w:pStyle w:val="Heading3"/>
@@ -1026,7 +1033,7 @@
         <w:pStyle w:val="FirstParagraph"/>
       </w:pPr>
       <w:r>
-        <w:t xml:space="preserve">To identify recurring spectral-temporal click types, a clustering workflow integrating both spectral shape and ICI information was developed. Preliminary clustering approaches, including k-means clustering, k-shape clustering, and density-based full-spectra clustering, were evaluated during early stages of workflow development</w:t>
+        <w:t xml:space="preserve">To identify recurring click types, a clustering workflow integrating both spectral shape and ICI information was developed. Preliminary clustering approaches, including k-means clustering, k-shape clustering, and density-based full-spectra clustering, were evaluated during early stages of workflow development</w:t>
       </w:r>
       <w:r>
         <w:t xml:space="preserve"> </w:t>
@@ -1035,7 +1042,7 @@
         <w:t xml:space="preserve">(McInnes, Healy, and Astels 2017; Paparrizos and Gravano 2015)</w:t>
       </w:r>
       <w:r>
-        <w:t xml:space="preserve">. While these approaches identified broad patterns of spectral variation, they did not adequately resolve structure and instead suggested that the variation within the datatset revealed substantial continuity across clicks was as opposed to a small number of clearly separated groups. Consequently, a dimensionality reduction and density-based workflow was adopted to better characterize structure within the spectral-temporal feature space.</w:t>
+        <w:t xml:space="preserve">. While these approaches identified broad patterns of spectral-temporal variation, they did not adequately resolve discrete click groups. Instead, variation appeared largely continuous across clicks rather than organized into a small number of clearly separated clusters. Consequently, a dimensionality reduction and density-based workflow was adopted to better characterize structure within the spectral-temporal feature space.</w:t>
       </w:r>
     </w:p>
     <w:p>
@@ -1055,7 +1062,7 @@
         <w:t xml:space="preserve"> </w:t>
       </w:r>
       <w:r>
-        <w:t xml:space="preserve">. Direct clustering of the full spectral datatset would require comparisons across dozens of highly correlated frequency bins, potentially taking away from boarder patterns of variation. In using PCA, a better representation of spectral shape was retained, along with a majority of the information contained within the original spectra. Because each spectrum had already been normalized during pre-processing, PCA was applied using centered, but unscaled, spectral values. Principal components (PC) accounting for 90% of the cumulative spectral variance of the datatset were preserved for the remained of the clustering workflow.</w:t>
+        <w:t xml:space="preserve">. Direct clustering of the full spectral dataset would require comparisons across dozens of highly correlated frequency bins, potentially taking away from boarder patterns of variation. In using PCA, a better representation of spectral shape was retained, along with a majority of the information contained within the original spectra. Because each spectrum had already been normalized during pre-processing, PCA was applied using centered, but unscaled, spectral values. Principal components (PC) accounting for 90% of the cumulative spectral variance of the dataset were preserved for the remainder of the clustering workflow.</w:t>
       </w:r>
     </w:p>
     <w:p>
@@ -1097,9 +1104,6 @@
         <w:t xml:space="preserve">(Alexander et al. 2025; Best et al. 2023)</w:t>
       </w:r>
       <w:r>
-        <w:t xml:space="preserve"> </w:t>
-      </w:r>
-      <w:r>
         <w:t xml:space="preserve">. HDBSCAN was selected as the clustering algorithm as it identifies clusters based upon local point density, does not require specification of the number of clusters, and allows for detections that do not belong to a well-defined cluster to remain unassigned</w:t>
       </w:r>
       <w:r>
@@ -1112,18 +1116,18 @@
         <w:t xml:space="preserve"> </w:t>
       </w:r>
       <w:r>
-        <w:t xml:space="preserve">. Multiple point thresholds were explored during workflow development to assess clustering sensitivity and flexibility across a range of density requirements. A minimum point threshold of 50 was determined for the final analysis as it emphasized robust recurring density structure while also limiting fragmentation into small local clusters. The resulting cluster assignments were used for all following analyses of spectral and geographic variation.</w:t>
-      </w:r>
-    </w:p>
-    <w:bookmarkEnd w:id="26"/>
+        <w:t xml:space="preserve">. Multiple point thresholds were explored during workflow development to assess clustering sensitivity and flexibility across a range of density requirements. A minimum point threshold of 50 was determined for the final analysis as it emphasized robust recurring density structure while also limiting fragmentation into small local clusters. The resulting cluster assignments were used for all following analyses of spectral-temporal and geographic variation.</w:t>
+      </w:r>
+    </w:p>
     <w:bookmarkEnd w:id="27"/>
-    <w:bookmarkStart w:id="28" w:name="X5246065a8c05b299f48d51dd914dec13dc57641"/>
+    <w:bookmarkEnd w:id="28"/>
+    <w:bookmarkStart w:id="29" w:name="X2cfd084ee5e07363125116c62996d3434f57bbc"/>
     <w:p>
       <w:pPr>
         <w:pStyle w:val="Heading2"/>
       </w:pPr>
       <w:r>
-        <w:t xml:space="preserve">D. Testing Geographic Structure in Echolocation Click Types Against Pre-existing Regional Variation</w:t>
+        <w:t xml:space="preserve">D. Comparison of CCE Spectral-Temporal Features with Previously Described Regions</w:t>
       </w:r>
     </w:p>
     <w:p>
@@ -1140,7 +1144,7 @@
         <w:t xml:space="preserve">Soldevilla et al. (2017)</w:t>
       </w:r>
       <w:r>
-        <w:t xml:space="preserve">. Rather than comparing individual cluster types, all events from the CCE dataset were treated collectively as a regional datatset, paralleling methodlogy by</w:t>
+        <w:t xml:space="preserve">. For this event-level comparison, all retained events from the CCE dataset were treated collectively as a regional dataset, paralleling regional comparison framework by</w:t>
       </w:r>
       <w:r>
         <w:t xml:space="preserve"> </w:t>
@@ -1152,7 +1156,7 @@
         <w:t xml:space="preserve"> </w:t>
       </w:r>
       <w:r>
-        <w:t xml:space="preserve">and allowing for direct comparison with previously described geographic regions.</w:t>
+        <w:t xml:space="preserve">rather than comparing individual click types.</w:t>
       </w:r>
     </w:p>
     <w:p>
@@ -1160,15 +1164,7 @@
         <w:pStyle w:val="BodyText"/>
       </w:pPr>
       <w:r>
-        <w:t xml:space="preserve">For each retained event, an event-level mean spectrum was calculated from the sampled min-max normalized spectra. Because HDBSCAN cluster 0 represents unassigned detections, event-level mean spectra were generated both with and without cluster 0 included. The unassigned detection excluded event-level mean spectra were used as the primary comparison datatset, while the unassigned detection included spectra were retained as a sensitivity check.</w:t>
-      </w:r>
-    </w:p>
-    <w:p>
-      <w:pPr>
-        <w:pStyle w:val="BodyText"/>
-      </w:pPr>
-      <w:r>
-        <w:t xml:space="preserve">To identify spectral peaks and notches, the findpeaks function in the R package</w:t>
+        <w:t xml:space="preserve">For each retained event, an event-level mean spectrum was calculated from the sampled min-max normalized spectra. To identify spectral peaks and notches, the findpeaks function in the R package</w:t>
       </w:r>
       <w:r>
         <w:t xml:space="preserve"> </w:t>
@@ -1193,7 +1189,7 @@
         <w:t xml:space="preserve">(Borchers 2011)</w:t>
       </w:r>
       <w:r>
-        <w:t xml:space="preserve">. Peak frequencies were identified as local maxima within the spectra, while notch frequencies were identified by inverting the spectra and applying the same procedure. Detected peak and notch frequencies were ordering by increasing frequency, with the first four peaks and first three notches retained for later analyses</w:t>
+        <w:t xml:space="preserve">. Peak frequencies were identified as local maxima within the mean spectra, while notch frequencies were identified by inverting the spectra and applying the same procedure. Detected peak and notch frequencies were ordering by increasing frequency, with the first four peaks and first three notches retained for later analyses</w:t>
       </w:r>
       <w:r>
         <w:t xml:space="preserve"> </w:t>
@@ -1202,7 +1198,7 @@
         <w:t xml:space="preserve">(Soldevilla et al. 2008, 2017)</w:t>
       </w:r>
       <w:r>
-        <w:t xml:space="preserve">. Peak detection was performed using a minimum peak height of 0.15, a minimum peak distance of three frequency bins, and a requirement of two ascending and two descending points surrounding each peak. Equivalent parameters were used during notch identification.</w:t>
+        <w:t xml:space="preserve">. Peak detection was performed using a minimum peak height of 0.15, a minimum peak distance of one frequency bin, and a requirement of one ascending and one descending point surrounding each peak. These less restrictive settings were used to allow detection of closely spaced or less pronounced spectral extrema while retaining the same minimum amplitude threshold. Equivalent parameters were used during notch identification following spectral inversion.</w:t>
       </w:r>
     </w:p>
     <w:p>
@@ -1210,16 +1206,46 @@
         <w:pStyle w:val="BodyText"/>
       </w:pPr>
       <w:r>
-        <w:t xml:space="preserve">In addition to the event-level spectral feature analyses, peaks and notches were also quantified from the mean spectrum of each identified click type generated through the spectral-temporal clustering workflow</w:t>
-      </w:r>
-      <w:r>
-        <w:t xml:space="preserve"> </w:t>
-      </w:r>
-      <w:r>
-        <w:t xml:space="preserve">(Soldevilla et al. 2017)</w:t>
-      </w:r>
-      <w:r>
-        <w:t xml:space="preserve">. The same peak and notch picking procedure was applied to cluster mean spectra, allowing spectral banding characteristics to be summarized among recurring click types within the dataset.</w:t>
+        <w:t xml:space="preserve">Following all feature extraction, the frequencies of each peak and notch position were summarized across all retained CCE events by calculating the mean and standard deviation. These event-level summary statistics were then compared with published regional values reported by</w:t>
+      </w:r>
+      <w:r>
+        <w:t xml:space="preserve"> </w:t>
+      </w:r>
+      <w:r>
+        <w:t xml:space="preserve">Soldevilla et al. (2017)</w:t>
+      </w:r>
+      <w:r>
+        <w:t xml:space="preserve">, including the Southeast U.S. Continental Shelf, Northeast U.S. Continental Shelf, Gulf of Mexico, Pelagic Pacific, and California Current’s Southern California Bight.</w:t>
+      </w:r>
+    </w:p>
+    <w:bookmarkEnd w:id="29"/>
+    <w:bookmarkStart w:id="30" w:name="X33a9650a3db98b4712b45fd1a9b893fe62b6b0e"/>
+    <w:p>
+      <w:pPr>
+        <w:pStyle w:val="Heading2"/>
+      </w:pPr>
+      <w:r>
+        <w:t xml:space="preserve">E. Click Type Comparison with Previously Described Click Types</w:t>
+      </w:r>
+    </w:p>
+    <w:p>
+      <w:pPr>
+        <w:pStyle w:val="FirstParagraph"/>
+      </w:pPr>
+      <w:r>
+        <w:t xml:space="preserve">In addition to the event-level regional comparison, spectral peaks and notches were quantified from the mean spectra of each click type identified through the spectral-temporal clustering workflow in the present study. This click type-level analysis was used to evaluate whether recurring click types identified in the CCE dataset showed spectral banding patterns similar to the nine Risso’s dolphin click types previously described by</w:t>
+      </w:r>
+      <w:r>
+        <w:t xml:space="preserve"> </w:t>
+      </w:r>
+      <w:r>
+        <w:t xml:space="preserve">Soldevilla et al. (2017)</w:t>
+      </w:r>
+      <w:r>
+        <w:t xml:space="preserve"> </w:t>
+      </w:r>
+      <w:r>
+        <w:t xml:space="preserve">across multiple geographic regions.</w:t>
       </w:r>
     </w:p>
     <w:p>
@@ -1227,7 +1253,7 @@
         <w:pStyle w:val="BodyText"/>
       </w:pPr>
       <w:r>
-        <w:t xml:space="preserve">Following all feature extraction, the frequencies of each peak and notch position were summarized across all retained events by calculating the mean and standard deviation of the CCE. These summary statistics were then compared with published regional values reported by</w:t>
+        <w:t xml:space="preserve">To support this click type-level comparison, MATLAB files associated with the</w:t>
       </w:r>
       <w:r>
         <w:t xml:space="preserve"> </w:t>
@@ -1236,12 +1262,27 @@
         <w:t xml:space="preserve">Soldevilla et al. (2017)</w:t>
       </w:r>
       <w:r>
-        <w:t xml:space="preserve">, including the Southest U.S. Continental Shelf, Northeast U.S. Continental Shelf, Gulf of Mexico, Pelagic Pacific, and California Current Southern California Bight.</w:t>
-      </w:r>
-    </w:p>
-    <w:bookmarkEnd w:id="28"/>
-    <w:bookmarkEnd w:id="29"/>
-    <w:bookmarkStart w:id="33" w:name="iii.-results"/>
+        <w:t xml:space="preserve"> </w:t>
+      </w:r>
+      <w:r>
+        <w:t xml:space="preserve">cluster spectra were imported and used to extract the mean spectra of the nine click types. The same peak and notch detection workflow and parameters described for the event-level analysis were then applied to both the</w:t>
+      </w:r>
+      <w:r>
+        <w:t xml:space="preserve"> </w:t>
+      </w:r>
+      <w:r>
+        <w:t xml:space="preserve">Soldevilla et al. (2017)</w:t>
+      </w:r>
+      <w:r>
+        <w:t xml:space="preserve"> </w:t>
+      </w:r>
+      <w:r>
+        <w:t xml:space="preserve">click type mean spectra and the present CCE click type mean spectra. The resulting peak and notch frequencies were then used to compare spectral banding patterns between the previously described click types and the click types identified in the present study.</w:t>
+      </w:r>
+    </w:p>
+    <w:bookmarkEnd w:id="30"/>
+    <w:bookmarkEnd w:id="31"/>
+    <w:bookmarkStart w:id="36" w:name="iii.-results"/>
     <w:p>
       <w:pPr>
         <w:pStyle w:val="Heading1"/>
@@ -1250,23 +1291,55 @@
         <w:t xml:space="preserve">III. Results</w:t>
       </w:r>
     </w:p>
-    <w:bookmarkStart w:id="30" w:name="a.-prevalence-of-spectral-banding"/>
+    <w:p>
+      <w:pPr>
+        <w:pStyle w:val="FirstParagraph"/>
+      </w:pPr>
+      <w:r>
+        <w:t xml:space="preserve">Risso’s dolphin echolocation clicks were detected across all three surveys - PASCAL, CCES, and Adrift - with the raw dataset containing 127 candidate acoustic events from 32 drifts. These included 28 events from PASCAL (22.0%), 49 events from CCES (38.6%), and 50 events from Adrift (39.4%). Following event-level review, 79 events were excluded from the dataset due to incompatible recorder type, insufficient number of click detections, recorder failure or data gaps, or multi-species detections. Only one candidate event was removed because it did not exhibit clear Risso’s dolphin spectral banding. The retained dataset included 48 events from 20 drifts, composed of three PASCAL events (6.3%), 24 CCES events (50%), and 21 events from Adrift (43.8%). Following manual click-level cleaning, the retained dataset contained 344,153 clicks, with cleaned click counts ranging from 99 to 80,999 clicks per event. After filtering ICI from 0.01-0.4 s, 214,944 clicks were retained for downstream analysis.</w:t>
+      </w:r>
+    </w:p>
+    <w:bookmarkStart w:id="32" w:name="Xfc8c1db0e6f565f128541a21409f9808eb31779"/>
     <w:p>
       <w:pPr>
         <w:pStyle w:val="Heading2"/>
       </w:pPr>
       <w:r>
-        <w:t xml:space="preserve">A. Prevalence of Spectral Banding</w:t>
-      </w:r>
-    </w:p>
-    <w:bookmarkEnd w:id="30"/>
-    <w:bookmarkStart w:id="31" w:name="X5e2fa6465b7490eea1741d0acaa8cfa9499838a"/>
+        <w:t xml:space="preserve">A. Spectral-Temporal Clustering and Resulting Click Types</w:t>
+      </w:r>
+    </w:p>
+    <w:p>
+      <w:pPr>
+        <w:pStyle w:val="FirstParagraph"/>
+      </w:pPr>
+      <w:r>
+        <w:t xml:space="preserve">9,220 clicks from 48 events were included in the spectral-temporal clustering workflow following ICI filtering and sampling of 200 clicks per event. The first 18 principal components accounted for 90.6% of the cumulative spectral variance of the dataset and were used in downstream analysis. These spectral features were combined with the fully weighted scaled log10 ICI feature and projected into a two-dimensional UMAP embedding. HDBSCAN cluster analysis of this UMAP embedding, using a minimum point threshold of 50, led to the identification of nine non-noise clusters which can be interpreted as recurring CCE click types.</w:t>
+      </w:r>
+    </w:p>
+    <w:p>
+      <w:pPr>
+        <w:pStyle w:val="BodyText"/>
+      </w:pPr>
+      <w:r>
+        <w:t xml:space="preserve">Of the 9,220 sampled clicks, 4,501 clicks (48.8%) were assigned to the nine click types, while 4,719 (51.2%) were classified by HDBSCAN as low-density or unassigned. Click type 9 was the most prevalent assigned type with 2,745 clicks – 29.8% of all sampled clicks and 61.0% of assigned clicks. The remaining click types were smaller, ranging from 66 clicks in click type 5, to 510 clicks in click type 7. This clustering result indicates that click type 9, the most dominant click type, was prevalent across the sampled dataset, while lower-abundance click types represented smaller, but still meaningful, distinct regions of the spectral-temporal feature space.</w:t>
+      </w:r>
+    </w:p>
+    <w:p>
+      <w:pPr>
+        <w:pStyle w:val="BodyText"/>
+      </w:pPr>
+      <w:r>
+        <w:t xml:space="preserve">The identified click types differed in click timing, as well as spectral structure. Median ICI values separated the click types into broadly defined temporal groups; click types 1, 4, 5, 6, and 7 characterized by short median ICIs of approximately 0.016-0.020 s, click types 2, 3, and 8 characterized by intermediate median ICIs of approximately 0.033-0.052 s, and click type 9 characterized by a substantially longer median ICI of 0.170 s. The mean spectra for the nine click types all exhibited the characteristic peak and notch structure of Risso’s dolphin echolocation clicks, but differed in the frequency placement and spacing of these features. Across the identified click types, the first peak ranged from 21.4-22.9 kHz, the second peak ranged from 24.4-25.5 kHz, the third peak ranged from 25.5-33.8 kHz, and the fourth peak ranged from 26.6-37.5 kHz. Notch frequencies also varied across click types, with the first notch occurring between 19.5-23.6 kHz, the second between 23.6-27.8 kHz, and the third between 25.9-35.6 kHz. Click type 7 was spectrally distinct as it exhibited a clear six-banded pattern, with six visible peaks at 22.5, 25.5, 29.6, 33.8, 36.8, and 42.4 kHz, separated by pronounced notches. When combined with the observed ICI patterns, these spectral differences support the interpretation of the nine clusters as recurring spectral-temporal click types.</w:t>
+      </w:r>
+    </w:p>
+    <w:bookmarkEnd w:id="32"/>
+    <w:bookmarkStart w:id="33" w:name="X58c62cfa1a7957e30f0e226059323870addb8a1"/>
     <w:p>
       <w:pPr>
         <w:pStyle w:val="Heading2"/>
       </w:pPr>
       <w:r>
-        <w:t xml:space="preserve">B. Spectral Feature Clustering and Geographic Variation</w:t>
+        <w:t xml:space="preserve">B. Event-Level Composition and Spatiotemporal Distribution of Click Types</w:t>
       </w:r>
     </w:p>
     <w:p>
@@ -1274,22 +1347,316 @@
         <w:pStyle w:val="FirstParagraph"/>
       </w:pPr>
       <w:r>
-        <w:t xml:space="preserve">After filtering from 0.01-0.4 ICI clicks out we retain 214,944 clicks (about 62.5% of the dataset) and remove 111,570 likely buzz/very short ICI clicks (about 32.4%)</w:t>
-      </w:r>
-    </w:p>
-    <w:bookmarkEnd w:id="31"/>
-    <w:bookmarkStart w:id="32" w:name="X05b0b16a679f494a5fdb1ab670857f1bfad35a7"/>
+        <w:t xml:space="preserve">Across the 48 retained events and 20 drifts, event-level click type composition was evaluated using the assigned, non-noise click types. Because HDBSCAN classified a large proportion of sampled clicks as low-density noise or unassigned, event-level composition was summarized following exclusion of unassigned clicks in order to characterize relative contribution of recurring click types. Across events, the number of click types present ranged from one to nine, with an average of 6.5 click types (±1.9) per event. The percentage of sampled clicks assigned to click types varied from 31.5-92.0% across events.</w:t>
+      </w:r>
+    </w:p>
+    <w:p>
+      <w:pPr>
+        <w:pStyle w:val="BodyText"/>
+      </w:pPr>
+      <w:r>
+        <w:t xml:space="preserve">The most consistently represented click type across the CCE dataset was click type 9. Click type 9 occurred in 47 of 48 events and all 20 retained drifts. It was also the dominant click type in 37 events. In events in which click type 9 was present, it accounted for 3.4-100% of clicks, with a median event-level contribution of 66.0%. In examining drift-level structure, click type 9 was the dominant click type in 17 of 20 drifts, indicating that this click type was common throughout the retained dataset, as opposed to restricted to a small number of events or locations.</w:t>
+      </w:r>
+    </w:p>
+    <w:p>
+      <w:pPr>
+        <w:pStyle w:val="BodyText"/>
+      </w:pPr>
+      <w:r>
+        <w:t xml:space="preserve">Other click types showed more limited event-level dominance. The second most common dominant click type was click type 7, the six-banded click type, which represented the dominant assigned click type in 5 events and three drifts. Events containing click type 7 occurred primarily between approximately 37.8-42.1°N and 123.4-124.6°W, within the central and northern portion of the retained event distribution and in the comparatively eastern portion of the sampled spatial range. Click type 7 was also broadly present, identified in 35 events and 16 drifts, although usually at lower proportions than click type 9. In events where click type 7 occurred, it represented 0.7-77.0% of assigned clicks with a median contribution of 12.7%.</w:t>
+      </w:r>
+    </w:p>
+    <w:p>
+      <w:pPr>
+        <w:pStyle w:val="BodyText"/>
+      </w:pPr>
+      <w:r>
+        <w:t xml:space="preserve">The remaining dominant click types were less common and primarily associated with the southern to central portion of the retained CCE dataset. Click type 1 was the dominant assigned type in four events between approximately 33.3-35.8°N and 121.4-127.2°W, while click types 2 and 4 were each dominant in one event respectively. Click types 3, 5, 6, and 8 occurred in multiple events but did not dominate any events. This overall pattern suggests that, while the nine recurring click types were present throughout the CCE dataset, most event-level variation was focused around the broad dominance of click type 9, with localized prevalence of click type 7, and smaller contributions from the other click types.</w:t>
+      </w:r>
+    </w:p>
+    <w:p>
+      <w:pPr>
+        <w:pStyle w:val="BodyText"/>
+      </w:pPr>
+      <w:r>
+        <w:t xml:space="preserve">Spatially, all retained events ranged from approximately 33.3-45.3°N and 121.4-129.3°W. Survey-level click type prevalence varied, with PASCAL events all dominated by click type 9, CCES events dispalying greatest dominant click type diversity – click types 1, 2, 4, 7, and 9 – and Adrift events dominated exclusively by both click types 7 and 9.</w:t>
+      </w:r>
+    </w:p>
+    <w:p>
+      <w:pPr>
+        <w:pStyle w:val="BodyText"/>
+      </w:pPr>
+      <w:r>
+        <w:t xml:space="preserve">Diel period was also summarized for all retained events, with most events occurring at night, aligning with findings from previous studies of Risso’s dolphins and other melon-headed cetaceans</w:t>
+      </w:r>
+      <w:r>
+        <w:t xml:space="preserve"> </w:t>
+      </w:r>
+      <w:r>
+        <w:t xml:space="preserve">(Soldevilla, Wiggins, and Hildebrand 2010; Baumann-Pickering et al. 2015)</w:t>
+      </w:r>
+      <w:r>
+        <w:t xml:space="preserve">. Of 48 retained events, 43 occurred during nighttime periods and five occurred during daytime periods. Click type 9 dominated both day and nighttime events.</w:t>
+      </w:r>
+    </w:p>
+    <w:bookmarkEnd w:id="33"/>
+    <w:bookmarkStart w:id="34" w:name="X825e88265ebdf1416f97ec3174b36dea9a5155c"/>
     <w:p>
       <w:pPr>
         <w:pStyle w:val="Heading2"/>
       </w:pPr>
       <w:r>
-        <w:t xml:space="preserve">C. Testing Geographic Structure in Echolocation Click Types Against Pre-existing Regional Variation</w:t>
-      </w:r>
-    </w:p>
-    <w:bookmarkEnd w:id="32"/>
-    <w:bookmarkEnd w:id="33"/>
-    <w:bookmarkStart w:id="34" w:name="iv.-discussion"/>
+        <w:t xml:space="preserve">C. Comparison of CCE Spectral-Temporal Features with Previously Described Regions</w:t>
+      </w:r>
+    </w:p>
+    <w:p>
+      <w:pPr>
+        <w:pStyle w:val="FirstParagraph"/>
+      </w:pPr>
+      <w:r>
+        <w:t xml:space="preserve">To compare the retained CCE events with previously described regional peak and notch frequencies identified by</w:t>
+      </w:r>
+      <w:r>
+        <w:t xml:space="preserve"> </w:t>
+      </w:r>
+      <w:r>
+        <w:t xml:space="preserve">Soldevilla et al. (2017)</w:t>
+      </w:r>
+      <w:r>
+        <w:t xml:space="preserve">, event-level mean spectra were examined. Across all 48 retained events, the first four spectral peaks occurred at mean frequencies of 22.0 ± 1.4, 25.7 ± 2.5, 30.1 ± 3.0, and 33.6 ± 3.4 kHz, respectively. The first three spectral notches occurred at mean frequencies of 22.9 ± 2.3, 27.1 ± 3.6, and 31.2 ± 4.1 kHz, respectively.</w:t>
+      </w:r>
+    </w:p>
+    <w:p>
+      <w:pPr>
+        <w:pStyle w:val="BodyText"/>
+      </w:pPr>
+      <w:r>
+        <w:t xml:space="preserve">When compared against regional values from the six large marine ecosystems (LMEs) composed of 69 Risso’s dolphin events identified by</w:t>
+      </w:r>
+      <w:r>
+        <w:t xml:space="preserve"> </w:t>
+      </w:r>
+      <w:r>
+        <w:t xml:space="preserve">Soldevilla et al. (2017)</w:t>
+      </w:r>
+      <w:r>
+        <w:t xml:space="preserve">, the lower peak and notch positions in the present CCE datatset were broadly similar to published regional summaries. Peaks 1 and 2 fell within the range of previously reported LME regional means, which ranged from 21.8-24.5 kHz for peak 1 and 24.8-27.3 for peak 2. Notch 2 also fit within the previously reported LME regional mean range of 27.0-29.4 kHz. Peak 3 and notch 1 were slightly lover than the previously reported LME regional mean ranges, with Peak 3 averaging 30.1 kHz compared with the published LME regional means of 30.4-33.5 kHz, and Notch 1 averaging 22.9 kHz compared with published LME regional means of 23.4-25.9 kHz.</w:t>
+      </w:r>
+    </w:p>
+    <w:p>
+      <w:pPr>
+        <w:pStyle w:val="BodyText"/>
+      </w:pPr>
+      <w:r>
+        <w:t xml:space="preserve">The most notable difference between the present CCE dataset and the regions described by</w:t>
+      </w:r>
+      <w:r>
+        <w:t xml:space="preserve"> </w:t>
+      </w:r>
+      <w:r>
+        <w:t xml:space="preserve">Soldevilla et al. (2017)</w:t>
+      </w:r>
+      <w:r>
+        <w:t xml:space="preserve"> </w:t>
+      </w:r>
+      <w:r>
+        <w:t xml:space="preserve">occurred in the higher-frequency spectral features. In the present dataset, peak 4 averaged 33.6 ± 3.4 kHz, lower than all previously reported means for peak 4, which ranged from 36.0-39.3 kHz. Similarly, notch 3 averaged 31.2 ± 4.1 kHz, lower than documented LME regional means for notch 3, which ranged from 32.5-36.2 kHz.</w:t>
+      </w:r>
+    </w:p>
+    <w:p>
+      <w:pPr>
+        <w:pStyle w:val="BodyText"/>
+      </w:pPr>
+      <w:r>
+        <w:t xml:space="preserve">Focused comparison with the two US Pacific / West Coast LME regions described by</w:t>
+      </w:r>
+      <w:r>
+        <w:t xml:space="preserve"> </w:t>
+      </w:r>
+      <w:r>
+        <w:t xml:space="preserve">Soldevilla et al. (2017)</w:t>
+      </w:r>
+      <w:r>
+        <w:t xml:space="preserve"> </w:t>
+      </w:r>
+      <w:r>
+        <w:t xml:space="preserve">showed that the present CCE datatset was more similar to the previously described California Current (CC) region than to the Pelagic Pacific (PPac) region, but differed from both in the higher frequency features. With reference to the CC region, the first two peak and notches in the present CCE dataset were relatively similar; Peak 1 differed by 0.2 kHz, Peak 2 by 0.9 kHz, notch 1 differed by 0.5 kHz, and notch 2 differed by 0.1 kHz. However, peaks 3 and 4, as well as notch 3, were lower in the CCE datatset by 1.1, 4.3, and 3.3 kHz respectively. In comparing the PPac region, all peak and notch frequencies in the current dataset occurred at lower mean frequencies. Differences in peak frequencies ranged from 0.9-2.4 kHz, with the largest difference occurring at peak 4. Notch frequency differences ranged from 1.6-2.5 kHz. From this comparison, it can be inferred that the retained CCE events from the current study displayed lower-frequency banding than events observed in the PPac region and shared more similarity with the CC, while still exhibiting lower high-frequency spectral feature frequencies than both US Pacific / West Coast regions.</w:t>
+      </w:r>
+    </w:p>
+    <w:bookmarkEnd w:id="34"/>
+    <w:bookmarkStart w:id="35" w:name="X747556305aa4195cc9f6f4231d92ae904b12eba"/>
+    <w:p>
+      <w:pPr>
+        <w:pStyle w:val="Heading2"/>
+      </w:pPr>
+      <w:r>
+        <w:t xml:space="preserve">D. Click Type Comparison with Previously Described Click Types</w:t>
+      </w:r>
+    </w:p>
+    <w:p>
+      <w:pPr>
+        <w:pStyle w:val="FirstParagraph"/>
+      </w:pPr>
+      <w:r>
+        <w:t xml:space="preserve">Peak and notch frequencies extracted from the current CCE click type mean spectra were compared with the nine click types described by</w:t>
+      </w:r>
+      <w:r>
+        <w:t xml:space="preserve"> </w:t>
+      </w:r>
+      <w:r>
+        <w:t xml:space="preserve">Soldevilla et al. (2017)</w:t>
+      </w:r>
+      <w:r>
+        <w:t xml:space="preserve">. This comparison worked to evaluate whether recurring CCE click types identified through the present spectral-temporal clustering workflow correlated to previously identified Risso’s click types. Two click types from the CCE showed especially strong similarity; CCE click type 9 most closely resembled</w:t>
+      </w:r>
+      <w:r>
+        <w:t xml:space="preserve"> </w:t>
+      </w:r>
+      <w:r>
+        <w:t xml:space="preserve">Soldevilla et al. (2017)</w:t>
+      </w:r>
+      <w:r>
+        <w:t xml:space="preserve"> </w:t>
+      </w:r>
+      <w:r>
+        <w:t xml:space="preserve">click type 1, and CCE click type 6 most closely resembled</w:t>
+      </w:r>
+      <w:r>
+        <w:t xml:space="preserve"> </w:t>
+      </w:r>
+      <w:r>
+        <w:t xml:space="preserve">Soldevilla et al. (2017)</w:t>
+      </w:r>
+      <w:r>
+        <w:t xml:space="preserve"> </w:t>
+      </w:r>
+      <w:r>
+        <w:t xml:space="preserve">click type 4.</w:t>
+      </w:r>
+    </w:p>
+    <w:p>
+      <w:pPr>
+        <w:pStyle w:val="BodyText"/>
+      </w:pPr>
+      <w:r>
+        <w:t xml:space="preserve">In comparing the CCE click type 9 and</w:t>
+      </w:r>
+      <w:r>
+        <w:t xml:space="preserve"> </w:t>
+      </w:r>
+      <w:r>
+        <w:t xml:space="preserve">Soldevilla et al. (2017)</w:t>
+      </w:r>
+      <w:r>
+        <w:t xml:space="preserve"> </w:t>
+      </w:r>
+      <w:r>
+        <w:t xml:space="preserve">click type 1, all spectral features aligned closely; CCE click type 9 peaks at 21.8, 24.8, 29.2, and 32.6 kHz paralelled</w:t>
+      </w:r>
+      <w:r>
+        <w:t xml:space="preserve"> </w:t>
+      </w:r>
+      <w:r>
+        <w:t xml:space="preserve">Soldevilla et al. (2017)</w:t>
+      </w:r>
+      <w:r>
+        <w:t xml:space="preserve"> </w:t>
+      </w:r>
+      <w:r>
+        <w:t xml:space="preserve">click type 1 peaks at 21.2, 24.8, 29.2, and 32.0 kHz. The equivalent notches were also similar, with CCE click type 9 notches at 22.9, 27.0, and 30.0 kHz aligning with</w:t>
+      </w:r>
+      <w:r>
+        <w:t xml:space="preserve"> </w:t>
+      </w:r>
+      <w:r>
+        <w:t xml:space="preserve">Soldevilla et al. (2017)</w:t>
+      </w:r>
+      <w:r>
+        <w:t xml:space="preserve"> </w:t>
+      </w:r>
+      <w:r>
+        <w:t xml:space="preserve">click type 1 notches at 22.8, 27.2, and 29.6 kHz.</w:t>
+      </w:r>
+    </w:p>
+    <w:p>
+      <w:pPr>
+        <w:pStyle w:val="BodyText"/>
+      </w:pPr>
+      <w:r>
+        <w:t xml:space="preserve">Comparison between CCE click type 6 and</w:t>
+      </w:r>
+      <w:r>
+        <w:t xml:space="preserve"> </w:t>
+      </w:r>
+      <w:r>
+        <w:t xml:space="preserve">Soldevilla et al. (2017)</w:t>
+      </w:r>
+      <w:r>
+        <w:t xml:space="preserve"> </w:t>
+      </w:r>
+      <w:r>
+        <w:t xml:space="preserve">click type 4 also showed strong similarity in peak frequency values – CCE click type 6 peaks at 25.5, 30.4, 32.6, and 36.4 kHz, and</w:t>
+      </w:r>
+      <w:r>
+        <w:t xml:space="preserve"> </w:t>
+      </w:r>
+      <w:r>
+        <w:t xml:space="preserve">Soldevilla et al. (2017)</w:t>
+      </w:r>
+      <w:r>
+        <w:t xml:space="preserve"> </w:t>
+      </w:r>
+      <w:r>
+        <w:t xml:space="preserve">click type 4 peaks at 25.6, 30.0, 32.8, and 36.8 kHz – as well as notch frequency values; CCE click type 6 notches at 27.4, 30.8, and 35.2 kHz, aligning with</w:t>
+      </w:r>
+      <w:r>
+        <w:t xml:space="preserve"> </w:t>
+      </w:r>
+      <w:r>
+        <w:t xml:space="preserve">Soldevilla et al. (2017)</w:t>
+      </w:r>
+      <w:r>
+        <w:t xml:space="preserve"> </w:t>
+      </w:r>
+      <w:r>
+        <w:t xml:space="preserve">click type 4 notches at 27.6, 31.2, and 34.8 kHz. Due to a lower-frequency notch registering as the first spectral feature in CCE click type 6, the ranked feature numbering was shifted. In order to remedy this issue, the comparison between these two click types was based on alignment of the shared central peak-and-notch structure rather than strict first-through-fourth peak ranking.</w:t>
+      </w:r>
+    </w:p>
+    <w:p>
+      <w:pPr>
+        <w:pStyle w:val="BodyText"/>
+      </w:pPr>
+      <w:r>
+        <w:t xml:space="preserve">While strong similarity was observed between these two click types, not all CCE click types had a relative one-to-one analog among the</w:t>
+      </w:r>
+      <w:r>
+        <w:t xml:space="preserve"> </w:t>
+      </w:r>
+      <w:r>
+        <w:t xml:space="preserve">Soldevilla et al. (2017)</w:t>
+      </w:r>
+      <w:r>
+        <w:t xml:space="preserve"> </w:t>
+      </w:r>
+      <w:r>
+        <w:t xml:space="preserve">click types. All CCE and</w:t>
+      </w:r>
+      <w:r>
+        <w:t xml:space="preserve"> </w:t>
+      </w:r>
+      <w:r>
+        <w:t xml:space="preserve">Soldevilla et al. (2017)</w:t>
+      </w:r>
+      <w:r>
+        <w:t xml:space="preserve"> </w:t>
+      </w:r>
+      <w:r>
+        <w:t xml:space="preserve">click types shared the expected spectral banding structure, but frequency values of spectral features in other click types differed in placement, spacing, or relative prominence. These results reveal that the CCE dataset included click types correlating to previously described click types in the CC and PPac, while also containing additional spectral-temporal variation not fully captured by simple correspondence with previously described studies.</w:t>
+      </w:r>
+    </w:p>
+    <w:bookmarkEnd w:id="35"/>
+    <w:bookmarkEnd w:id="36"/>
+    <w:bookmarkStart w:id="37" w:name="iv.-discussion"/>
     <w:p>
       <w:pPr>
         <w:pStyle w:val="Heading1"/>
@@ -1306,8 +1673,8 @@
         <w:t xml:space="preserve">Soldevilla et al. 2017 used the following sections: Species Identification, Geographic Variation, Within-encounter variability, Geographical variation and seasonal movements, Automated extraction and classification)</w:t>
       </w:r>
     </w:p>
-    <w:bookmarkEnd w:id="34"/>
-    <w:bookmarkStart w:id="35" w:name="v.-conclusions"/>
+    <w:bookmarkEnd w:id="37"/>
+    <w:bookmarkStart w:id="38" w:name="v.-conclusions"/>
     <w:p>
       <w:pPr>
         <w:pStyle w:val="Heading1"/>
@@ -1316,15 +1683,15 @@
         <w:t xml:space="preserve">V. Conclusions</w:t>
       </w:r>
     </w:p>
-    <w:bookmarkEnd w:id="35"/>
-    <w:bookmarkStart w:id="98" w:name="section"/>
+    <w:bookmarkEnd w:id="38"/>
+    <w:bookmarkStart w:id="109" w:name="section"/>
     <w:p>
       <w:pPr>
         <w:pStyle w:val="Heading1"/>
       </w:pPr>
     </w:p>
-    <w:bookmarkStart w:id="97" w:name="refs"/>
-    <w:bookmarkStart w:id="37" w:name="ref-alexander2025"/>
+    <w:bookmarkStart w:id="108" w:name="refs"/>
+    <w:bookmarkStart w:id="40" w:name="ref-alexander2025"/>
     <w:p>
       <w:pPr>
         <w:pStyle w:val="Bibliography"/>
@@ -1341,7 +1708,7 @@
       <w:r>
         <w:t xml:space="preserve"> </w:t>
       </w:r>
-      <w:hyperlink r:id="rId36">
+      <w:hyperlink r:id="rId39">
         <w:r>
           <w:rPr>
             <w:rStyle w:val="Hyperlink"/>
@@ -1353,8 +1720,8 @@
         <w:t xml:space="preserve">.</w:t>
       </w:r>
     </w:p>
-    <w:bookmarkEnd w:id="37"/>
-    <w:bookmarkStart w:id="39" w:name="ref-andrews2015"/>
+    <w:bookmarkEnd w:id="40"/>
+    <w:bookmarkStart w:id="42" w:name="ref-andrews2015"/>
     <w:p>
       <w:pPr>
         <w:pStyle w:val="Bibliography"/>
@@ -1387,7 +1754,7 @@
       <w:r>
         <w:t xml:space="preserve"> </w:t>
       </w:r>
-      <w:hyperlink r:id="rId38">
+      <w:hyperlink r:id="rId41">
         <w:r>
           <w:rPr>
             <w:rStyle w:val="Hyperlink"/>
@@ -1399,8 +1766,8 @@
         <w:t xml:space="preserve">.</w:t>
       </w:r>
     </w:p>
-    <w:bookmarkEnd w:id="39"/>
-    <w:bookmarkStart w:id="41" w:name="ref-baird2009"/>
+    <w:bookmarkEnd w:id="42"/>
+    <w:bookmarkStart w:id="44" w:name="ref-baird2009"/>
     <w:p>
       <w:pPr>
         <w:pStyle w:val="Bibliography"/>
@@ -1423,7 +1790,7 @@
       <w:r>
         <w:t xml:space="preserve"> </w:t>
       </w:r>
-      <w:hyperlink r:id="rId40">
+      <w:hyperlink r:id="rId43">
         <w:r>
           <w:rPr>
             <w:rStyle w:val="Hyperlink"/>
@@ -1435,8 +1802,8 @@
         <w:t xml:space="preserve">.</w:t>
       </w:r>
     </w:p>
-    <w:bookmarkEnd w:id="41"/>
-    <w:bookmarkStart w:id="42" w:name="ref-barlow2007"/>
+    <w:bookmarkEnd w:id="44"/>
+    <w:bookmarkStart w:id="45" w:name="ref-barlow2007"/>
     <w:p>
       <w:pPr>
         <w:pStyle w:val="Bibliography"/>
@@ -1488,8 +1855,54 @@
         <w:t xml:space="preserve">105 (October).</w:t>
       </w:r>
     </w:p>
-    <w:bookmarkEnd w:id="42"/>
-    <w:bookmarkStart w:id="44" w:name="ref-best2023"/>
+    <w:bookmarkEnd w:id="45"/>
+    <w:bookmarkStart w:id="47" w:name="ref-baumann-pickering2015"/>
+    <w:p>
+      <w:pPr>
+        <w:pStyle w:val="Bibliography"/>
+      </w:pPr>
+      <w:r>
+        <w:t xml:space="preserve">Baumann-Pickering, Simone, Marie A. Roch, Sean M. Wiggins, Hans-Ulrich Schnitzler, and John A. Hildebrand. 2015.</w:t>
+      </w:r>
+      <w:r>
+        <w:t xml:space="preserve"> </w:t>
+      </w:r>
+      <w:r>
+        <w:t xml:space="preserve">“Acoustic Behavior of Melon-Headed Whales Varies on a Diel Cycle.”</w:t>
+      </w:r>
+      <w:r>
+        <w:t xml:space="preserve"> </w:t>
+      </w:r>
+      <w:r>
+        <w:rPr>
+          <w:i/>
+          <w:iCs/>
+        </w:rPr>
+        <w:t xml:space="preserve">Behavioral Ecology and Sociobiology</w:t>
+      </w:r>
+      <w:r>
+        <w:t xml:space="preserve"> </w:t>
+      </w:r>
+      <w:r>
+        <w:t xml:space="preserve">69 (9): 1553–63.</w:t>
+      </w:r>
+      <w:r>
+        <w:t xml:space="preserve"> </w:t>
+      </w:r>
+      <w:hyperlink r:id="rId46">
+        <w:r>
+          <w:rPr>
+            <w:rStyle w:val="Hyperlink"/>
+          </w:rPr>
+          <w:t xml:space="preserve">https://doi.org/10.1007/s00265-015-1967-0</w:t>
+        </w:r>
+      </w:hyperlink>
+      <w:r>
+        <w:t xml:space="preserve">.</w:t>
+      </w:r>
+    </w:p>
+    <w:bookmarkEnd w:id="47"/>
+    <w:bookmarkStart w:id="49" w:name="ref-best2023"/>
     <w:p>
       <w:pPr>
         <w:pStyle w:val="Bibliography"/>
@@ -1522,7 +1935,7 @@
       <w:r>
         <w:t xml:space="preserve"> </w:t>
       </w:r>
-      <w:hyperlink r:id="rId43">
+      <w:hyperlink r:id="rId48">
         <w:r>
           <w:rPr>
             <w:rStyle w:val="Hyperlink"/>
@@ -1534,8 +1947,8 @@
         <w:t xml:space="preserve">.</w:t>
       </w:r>
     </w:p>
-    <w:bookmarkEnd w:id="44"/>
-    <w:bookmarkStart w:id="46" w:name="ref-borchers2011"/>
+    <w:bookmarkEnd w:id="49"/>
+    <w:bookmarkStart w:id="51" w:name="ref-borchers2011"/>
     <w:p>
       <w:pPr>
         <w:pStyle w:val="Bibliography"/>
@@ -1559,7 +1972,7 @@
       <w:r>
         <w:t xml:space="preserve"> </w:t>
       </w:r>
-      <w:hyperlink r:id="rId45">
+      <w:hyperlink r:id="rId50">
         <w:r>
           <w:rPr>
             <w:rStyle w:val="Hyperlink"/>
@@ -1571,8 +1984,8 @@
         <w:t xml:space="preserve">.</w:t>
       </w:r>
     </w:p>
-    <w:bookmarkEnd w:id="46"/>
-    <w:bookmarkStart w:id="48" w:name="ref-carretta2024"/>
+    <w:bookmarkEnd w:id="51"/>
+    <w:bookmarkStart w:id="53" w:name="ref-carretta2024"/>
     <w:p>
       <w:pPr>
         <w:pStyle w:val="Bibliography"/>
@@ -1589,7 +2002,7 @@
       <w:r>
         <w:t xml:space="preserve"> </w:t>
       </w:r>
-      <w:hyperlink r:id="rId47">
+      <w:hyperlink r:id="rId52">
         <w:r>
           <w:rPr>
             <w:rStyle w:val="Hyperlink"/>
@@ -1601,8 +2014,8 @@
         <w:t xml:space="preserve">.</w:t>
       </w:r>
     </w:p>
-    <w:bookmarkEnd w:id="48"/>
-    <w:bookmarkStart w:id="50" w:name="ref-cranford1996"/>
+    <w:bookmarkEnd w:id="53"/>
+    <w:bookmarkStart w:id="55" w:name="ref-cranford1996"/>
     <w:p>
       <w:pPr>
         <w:pStyle w:val="Bibliography"/>
@@ -1635,7 +2048,7 @@
       <w:r>
         <w:t xml:space="preserve"> </w:t>
       </w:r>
-      <w:hyperlink r:id="rId49">
+      <w:hyperlink r:id="rId54">
         <w:r>
           <w:rPr>
             <w:rStyle w:val="Hyperlink"/>
@@ -1647,8 +2060,8 @@
         <w:t xml:space="preserve">.</w:t>
       </w:r>
     </w:p>
-    <w:bookmarkEnd w:id="50"/>
-    <w:bookmarkStart w:id="52" w:name="ref-forney1998"/>
+    <w:bookmarkEnd w:id="55"/>
+    <w:bookmarkStart w:id="57" w:name="ref-forney1998"/>
     <w:p>
       <w:pPr>
         <w:pStyle w:val="Bibliography"/>
@@ -1684,7 +2097,7 @@
       <w:r>
         <w:t xml:space="preserve"> </w:t>
       </w:r>
-      <w:hyperlink r:id="rId51">
+      <w:hyperlink r:id="rId56">
         <w:r>
           <w:rPr>
             <w:rStyle w:val="Hyperlink"/>
@@ -1696,13 +2109,50 @@
         <w:t xml:space="preserve">.</w:t>
       </w:r>
     </w:p>
-    <w:bookmarkEnd w:id="52"/>
-    <w:bookmarkStart w:id="54" w:name="ref-gillespie2008"/>
+    <w:bookmarkEnd w:id="57"/>
+    <w:bookmarkStart w:id="59" w:name="ref-frasier2024"/>
     <w:p>
       <w:pPr>
         <w:pStyle w:val="Bibliography"/>
       </w:pPr>
       <w:r>
+        <w:t xml:space="preserve">Frasier, Kait, sfregosi, Morgan Ziegenhorn, Alba Solsona, Simone Baumann-Pickering, marie-r, Macey Rafter, John Hildebrand, CSchoenbeck, and Rebecca Cohen. 2024.</w:t>
+      </w:r>
+      <w:r>
+        <w:t xml:space="preserve"> </w:t>
+      </w:r>
+      <w:r>
+        <w:rPr>
+          <w:i/>
+          <w:iCs/>
+        </w:rPr>
+        <w:t xml:space="preserve">MarineBioAcousticsRC/Triton: Remora Update Early 2024</w:t>
+      </w:r>
+      <w:r>
+        <w:t xml:space="preserve">. Zenodo.</w:t>
+      </w:r>
+      <w:r>
+        <w:t xml:space="preserve"> </w:t>
+      </w:r>
+      <w:hyperlink r:id="rId58">
+        <w:r>
+          <w:rPr>
+            <w:rStyle w:val="Hyperlink"/>
+          </w:rPr>
+          <w:t xml:space="preserve">https://doi.org/10.5281/zenodo.10963175</w:t>
+        </w:r>
+      </w:hyperlink>
+      <w:r>
+        <w:t xml:space="preserve">.</w:t>
+      </w:r>
+    </w:p>
+    <w:bookmarkEnd w:id="59"/>
+    <w:bookmarkStart w:id="61" w:name="ref-gillespie2008"/>
+    <w:p>
+      <w:pPr>
+        <w:pStyle w:val="Bibliography"/>
+      </w:pPr>
+      <w:r>
         <w:t xml:space="preserve">Gillespie, D., D. K. Mellinger, J. Gordon, D. McLaren, P. Redmond, Ronald McHugh, P. W. Trinder, X. Y. Deng, and A. Thode. 2008.</w:t>
       </w:r>
       <w:r>
@@ -1720,7 +2170,7 @@
       <w:r>
         <w:t xml:space="preserve"> </w:t>
       </w:r>
-      <w:hyperlink r:id="rId53">
+      <w:hyperlink r:id="rId60">
         <w:r>
           <w:rPr>
             <w:rStyle w:val="Hyperlink"/>
@@ -1732,8 +2182,54 @@
         <w:t xml:space="preserve">.</w:t>
       </w:r>
     </w:p>
-    <w:bookmarkEnd w:id="54"/>
-    <w:bookmarkStart w:id="56" w:name="ref-grech2011"/>
+    <w:bookmarkEnd w:id="61"/>
+    <w:bookmarkStart w:id="63" w:name="ref-gillespie2019"/>
+    <w:p>
+      <w:pPr>
+        <w:pStyle w:val="Bibliography"/>
+      </w:pPr>
+      <w:r>
+        <w:t xml:space="preserve">Gillespie, Douglas, and Jamie Macaulay. 2019.</w:t>
+      </w:r>
+      <w:r>
+        <w:t xml:space="preserve"> </w:t>
+      </w:r>
+      <w:r>
+        <w:t xml:space="preserve">“Time of Arrival Difference Estimation for Narrow Band High Frequency Echolocation Clicks.”</w:t>
+      </w:r>
+      <w:r>
+        <w:t xml:space="preserve"> </w:t>
+      </w:r>
+      <w:r>
+        <w:rPr>
+          <w:i/>
+          <w:iCs/>
+        </w:rPr>
+        <w:t xml:space="preserve">The Journal of the Acoustical Society of America</w:t>
+      </w:r>
+      <w:r>
+        <w:t xml:space="preserve"> </w:t>
+      </w:r>
+      <w:r>
+        <w:t xml:space="preserve">146 (4): EL387–92.</w:t>
+      </w:r>
+      <w:r>
+        <w:t xml:space="preserve"> </w:t>
+      </w:r>
+      <w:hyperlink r:id="rId62">
+        <w:r>
+          <w:rPr>
+            <w:rStyle w:val="Hyperlink"/>
+          </w:rPr>
+          <w:t xml:space="preserve">https://doi.org/10.1121/1.5129678</w:t>
+        </w:r>
+      </w:hyperlink>
+      <w:r>
+        <w:t xml:space="preserve">.</w:t>
+      </w:r>
+    </w:p>
+    <w:bookmarkEnd w:id="63"/>
+    <w:bookmarkStart w:id="65" w:name="ref-grech2011"/>
     <w:p>
       <w:pPr>
         <w:pStyle w:val="Bibliography"/>
@@ -1766,7 +2262,7 @@
       <w:r>
         <w:t xml:space="preserve"> </w:t>
       </w:r>
-      <w:hyperlink r:id="rId55">
+      <w:hyperlink r:id="rId64">
         <w:r>
           <w:rPr>
             <w:rStyle w:val="Hyperlink"/>
@@ -1778,8 +2274,8 @@
         <w:t xml:space="preserve">.</w:t>
       </w:r>
     </w:p>
-    <w:bookmarkEnd w:id="56"/>
-    <w:bookmarkStart w:id="58" w:name="ref-jefferson2017"/>
+    <w:bookmarkEnd w:id="65"/>
+    <w:bookmarkStart w:id="67" w:name="ref-jefferson2017"/>
     <w:p>
       <w:pPr>
         <w:pStyle w:val="Bibliography"/>
@@ -1802,7 +2298,7 @@
       <w:r>
         <w:t xml:space="preserve"> </w:t>
       </w:r>
-      <w:hyperlink r:id="rId57">
+      <w:hyperlink r:id="rId66">
         <w:r>
           <w:rPr>
             <w:rStyle w:val="Hyperlink"/>
@@ -1814,8 +2310,8 @@
         <w:t xml:space="preserve">.</w:t>
       </w:r>
     </w:p>
-    <w:bookmarkEnd w:id="58"/>
-    <w:bookmarkStart w:id="60" w:name="ref-jolliffe2002"/>
+    <w:bookmarkEnd w:id="67"/>
+    <w:bookmarkStart w:id="69" w:name="ref-jolliffe2002"/>
     <w:p>
       <w:pPr>
         <w:pStyle w:val="Bibliography"/>
@@ -1839,7 +2335,7 @@
       <w:r>
         <w:t xml:space="preserve"> </w:t>
       </w:r>
-      <w:hyperlink r:id="rId59">
+      <w:hyperlink r:id="rId68">
         <w:r>
           <w:rPr>
             <w:rStyle w:val="Hyperlink"/>
@@ -1851,8 +2347,8 @@
         <w:t xml:space="preserve">.</w:t>
       </w:r>
     </w:p>
-    <w:bookmarkEnd w:id="60"/>
-    <w:bookmarkStart w:id="62" w:name="ref-keating2018"/>
+    <w:bookmarkEnd w:id="69"/>
+    <w:bookmarkStart w:id="71" w:name="ref-keating2018"/>
     <w:p>
       <w:pPr>
         <w:pStyle w:val="Bibliography"/>
@@ -1875,7 +2371,7 @@
       <w:r>
         <w:t xml:space="preserve"> </w:t>
       </w:r>
-      <w:hyperlink r:id="rId61">
+      <w:hyperlink r:id="rId70">
         <w:r>
           <w:rPr>
             <w:rStyle w:val="Hyperlink"/>
@@ -1887,8 +2383,8 @@
         <w:t xml:space="preserve">.</w:t>
       </w:r>
     </w:p>
-    <w:bookmarkEnd w:id="62"/>
-    <w:bookmarkStart w:id="64" w:name="ref-madsen2004"/>
+    <w:bookmarkEnd w:id="71"/>
+    <w:bookmarkStart w:id="73" w:name="ref-madsen2004"/>
     <w:p>
       <w:pPr>
         <w:pStyle w:val="Bibliography"/>
@@ -1921,7 +2417,7 @@
       <w:r>
         <w:t xml:space="preserve"> </w:t>
       </w:r>
-      <w:hyperlink r:id="rId63">
+      <w:hyperlink r:id="rId72">
         <w:r>
           <w:rPr>
             <w:rStyle w:val="Hyperlink"/>
@@ -1933,8 +2429,8 @@
         <w:t xml:space="preserve">.</w:t>
       </w:r>
     </w:p>
-    <w:bookmarkEnd w:id="64"/>
-    <w:bookmarkStart w:id="66" w:name="ref-martien2019"/>
+    <w:bookmarkEnd w:id="73"/>
+    <w:bookmarkStart w:id="75" w:name="ref-martien2019"/>
     <w:p>
       <w:pPr>
         <w:pStyle w:val="Bibliography"/>
@@ -1957,7 +2453,7 @@
       <w:r>
         <w:t xml:space="preserve"> </w:t>
       </w:r>
-      <w:hyperlink r:id="rId65">
+      <w:hyperlink r:id="rId74">
         <w:r>
           <w:rPr>
             <w:rStyle w:val="Hyperlink"/>
@@ -1969,8 +2465,8 @@
         <w:t xml:space="preserve">.</w:t>
       </w:r>
     </w:p>
-    <w:bookmarkEnd w:id="66"/>
-    <w:bookmarkStart w:id="68" w:name="ref-mcclatchie2025"/>
+    <w:bookmarkEnd w:id="75"/>
+    <w:bookmarkStart w:id="77" w:name="ref-mcclatchie2025"/>
     <w:p>
       <w:pPr>
         <w:pStyle w:val="Bibliography"/>
@@ -1994,7 +2490,7 @@
       <w:r>
         <w:t xml:space="preserve"> </w:t>
       </w:r>
-      <w:hyperlink r:id="rId67">
+      <w:hyperlink r:id="rId76">
         <w:r>
           <w:rPr>
             <w:rStyle w:val="Hyperlink"/>
@@ -2006,8 +2502,8 @@
         <w:t xml:space="preserve">.</w:t>
       </w:r>
     </w:p>
-    <w:bookmarkEnd w:id="68"/>
-    <w:bookmarkStart w:id="70" w:name="ref-mcinnes2017"/>
+    <w:bookmarkEnd w:id="77"/>
+    <w:bookmarkStart w:id="79" w:name="ref-mcinnes2017"/>
     <w:p>
       <w:pPr>
         <w:pStyle w:val="Bibliography"/>
@@ -2040,7 +2536,7 @@
       <w:r>
         <w:t xml:space="preserve"> </w:t>
       </w:r>
-      <w:hyperlink r:id="rId69">
+      <w:hyperlink r:id="rId78">
         <w:r>
           <w:rPr>
             <w:rStyle w:val="Hyperlink"/>
@@ -2052,8 +2548,8 @@
         <w:t xml:space="preserve">.</w:t>
       </w:r>
     </w:p>
-    <w:bookmarkEnd w:id="70"/>
-    <w:bookmarkStart w:id="72" w:name="ref-mcinnes2020"/>
+    <w:bookmarkEnd w:id="79"/>
+    <w:bookmarkStart w:id="81" w:name="ref-mcinnes2020"/>
     <w:p>
       <w:pPr>
         <w:pStyle w:val="Bibliography"/>
@@ -2070,7 +2566,7 @@
       <w:r>
         <w:t xml:space="preserve"> </w:t>
       </w:r>
-      <w:hyperlink r:id="rId71">
+      <w:hyperlink r:id="rId80">
         <w:r>
           <w:rPr>
             <w:rStyle w:val="Hyperlink"/>
@@ -2082,8 +2578,8 @@
         <w:t xml:space="preserve">.</w:t>
       </w:r>
     </w:p>
-    <w:bookmarkEnd w:id="72"/>
-    <w:bookmarkStart w:id="74" w:name="ref-mckenna2012"/>
+    <w:bookmarkEnd w:id="81"/>
+    <w:bookmarkStart w:id="83" w:name="ref-mckenna2012"/>
     <w:p>
       <w:pPr>
         <w:pStyle w:val="Bibliography"/>
@@ -2116,7 +2612,7 @@
       <w:r>
         <w:t xml:space="preserve"> </w:t>
       </w:r>
-      <w:hyperlink r:id="rId73">
+      <w:hyperlink r:id="rId82">
         <w:r>
           <w:rPr>
             <w:rStyle w:val="Hyperlink"/>
@@ -2128,8 +2624,8 @@
         <w:t xml:space="preserve">.</w:t>
       </w:r>
     </w:p>
-    <w:bookmarkEnd w:id="74"/>
-    <w:bookmarkStart w:id="75" w:name="ref-mellinger2003"/>
+    <w:bookmarkEnd w:id="83"/>
+    <w:bookmarkStart w:id="84" w:name="ref-mellinger2003"/>
     <w:p>
       <w:pPr>
         <w:pStyle w:val="Bibliography"/>
@@ -2144,8 +2640,8 @@
         <w:t xml:space="preserve">“Future Directions for Acoustic Marine Mammal Surveys: Stock Assessment and Habitat Use.”</w:t>
       </w:r>
     </w:p>
-    <w:bookmarkEnd w:id="75"/>
-    <w:bookmarkStart w:id="77" w:name="ref-paparrizos2015"/>
+    <w:bookmarkEnd w:id="84"/>
+    <w:bookmarkStart w:id="86" w:name="ref-paparrizos2015"/>
     <w:p>
       <w:pPr>
         <w:pStyle w:val="Bibliography"/>
@@ -2168,7 +2664,7 @@
       <w:r>
         <w:t xml:space="preserve"> </w:t>
       </w:r>
-      <w:hyperlink r:id="rId76">
+      <w:hyperlink r:id="rId85">
         <w:r>
           <w:rPr>
             <w:rStyle w:val="Hyperlink"/>
@@ -2180,8 +2676,8 @@
         <w:t xml:space="preserve">.</w:t>
       </w:r>
     </w:p>
-    <w:bookmarkEnd w:id="77"/>
-    <w:bookmarkStart w:id="78" w:name="ref-patro2015"/>
+    <w:bookmarkEnd w:id="86"/>
+    <w:bookmarkStart w:id="87" w:name="ref-patro2015"/>
     <w:p>
       <w:pPr>
         <w:pStyle w:val="Bibliography"/>
@@ -2196,13 +2692,59 @@
         <w:t xml:space="preserve">“Normalization: A Preprocessing Stage.”</w:t>
       </w:r>
     </w:p>
-    <w:bookmarkEnd w:id="78"/>
-    <w:bookmarkStart w:id="80" w:name="ref-rabiner1993"/>
+    <w:bookmarkEnd w:id="87"/>
+    <w:bookmarkStart w:id="89" w:name="ref-picone1993"/>
     <w:p>
       <w:pPr>
         <w:pStyle w:val="Bibliography"/>
       </w:pPr>
       <w:r>
+        <w:t xml:space="preserve">Picone, J. W. 1993.</w:t>
+      </w:r>
+      <w:r>
+        <w:t xml:space="preserve"> </w:t>
+      </w:r>
+      <w:r>
+        <w:t xml:space="preserve">“Signal Modeling Techniques in Speech Recognition.”</w:t>
+      </w:r>
+      <w:r>
+        <w:t xml:space="preserve"> </w:t>
+      </w:r>
+      <w:r>
+        <w:rPr>
+          <w:i/>
+          <w:iCs/>
+        </w:rPr>
+        <w:t xml:space="preserve">Proceedings of the IEEE</w:t>
+      </w:r>
+      <w:r>
+        <w:t xml:space="preserve"> </w:t>
+      </w:r>
+      <w:r>
+        <w:t xml:space="preserve">81 (9): 1215–47.</w:t>
+      </w:r>
+      <w:r>
+        <w:t xml:space="preserve"> </w:t>
+      </w:r>
+      <w:hyperlink r:id="rId88">
+        <w:r>
+          <w:rPr>
+            <w:rStyle w:val="Hyperlink"/>
+          </w:rPr>
+          <w:t xml:space="preserve">https://doi.org/10.1109/5.237532</w:t>
+        </w:r>
+      </w:hyperlink>
+      <w:r>
+        <w:t xml:space="preserve">.</w:t>
+      </w:r>
+    </w:p>
+    <w:bookmarkEnd w:id="89"/>
+    <w:bookmarkStart w:id="91" w:name="ref-rabiner1993"/>
+    <w:p>
+      <w:pPr>
+        <w:pStyle w:val="Bibliography"/>
+      </w:pPr>
+      <w:r>
         <w:t xml:space="preserve">Rabiner, Lawrence, and Biing Hwang Juang. 1993.</w:t>
       </w:r>
       <w:r>
@@ -2220,7 +2762,7 @@
       <w:r>
         <w:t xml:space="preserve"> </w:t>
       </w:r>
-      <w:hyperlink r:id="rId79">
+      <w:hyperlink r:id="rId90">
         <w:r>
           <w:rPr>
             <w:rStyle w:val="Hyperlink"/>
@@ -2232,8 +2774,8 @@
         <w:t xml:space="preserve">.</w:t>
       </w:r>
     </w:p>
-    <w:bookmarkEnd w:id="80"/>
-    <w:bookmarkStart w:id="82" w:name="ref-rabiner1975"/>
+    <w:bookmarkEnd w:id="91"/>
+    <w:bookmarkStart w:id="93" w:name="ref-rabiner1975"/>
     <w:p>
       <w:pPr>
         <w:pStyle w:val="Bibliography"/>
@@ -2266,7 +2808,7 @@
       <w:r>
         <w:t xml:space="preserve"> </w:t>
       </w:r>
-      <w:hyperlink r:id="rId81">
+      <w:hyperlink r:id="rId92">
         <w:r>
           <w:rPr>
             <w:rStyle w:val="Hyperlink"/>
@@ -2278,8 +2820,8 @@
         <w:t xml:space="preserve">.</w:t>
       </w:r>
     </w:p>
-    <w:bookmarkEnd w:id="82"/>
-    <w:bookmarkStart w:id="83" w:name="ref-rankin2025"/>
+    <w:bookmarkEnd w:id="93"/>
+    <w:bookmarkStart w:id="94" w:name="ref-rankin2025"/>
     <w:p>
       <w:pPr>
         <w:pStyle w:val="Bibliography"/>
@@ -2294,8 +2836,8 @@
         <w:t xml:space="preserve">“Adrift in the California Current Survey: Passive Acoustic Monitoring in the California Current Using Drifting Recorders.”</w:t>
       </w:r>
     </w:p>
-    <w:bookmarkEnd w:id="83"/>
-    <w:bookmarkStart w:id="85" w:name="ref-sakai2026"/>
+    <w:bookmarkEnd w:id="94"/>
+    <w:bookmarkStart w:id="96" w:name="ref-sakai2026"/>
     <w:p>
       <w:pPr>
         <w:pStyle w:val="Bibliography"/>
@@ -2319,7 +2861,7 @@
       <w:r>
         <w:t xml:space="preserve"> </w:t>
       </w:r>
-      <w:hyperlink r:id="rId84">
+      <w:hyperlink r:id="rId95">
         <w:r>
           <w:rPr>
             <w:rStyle w:val="Hyperlink"/>
@@ -2331,8 +2873,8 @@
         <w:t xml:space="preserve">.</w:t>
       </w:r>
     </w:p>
-    <w:bookmarkEnd w:id="85"/>
-    <w:bookmarkStart w:id="86" w:name="ref-simonis2020"/>
+    <w:bookmarkEnd w:id="96"/>
+    <w:bookmarkStart w:id="97" w:name="ref-simonis2020"/>
     <w:p>
       <w:pPr>
         <w:pStyle w:val="Bibliography"/>
@@ -2353,8 +2895,8 @@
         <w:t xml:space="preserve">NOAA-TM-NMFS-SWFSC-630,.</w:t>
       </w:r>
     </w:p>
-    <w:bookmarkEnd w:id="86"/>
-    <w:bookmarkStart w:id="88" w:name="ref-smith2020"/>
+    <w:bookmarkEnd w:id="97"/>
+    <w:bookmarkStart w:id="99" w:name="ref-smith2020"/>
     <w:p>
       <w:pPr>
         <w:pStyle w:val="Bibliography"/>
@@ -2387,7 +2929,7 @@
       <w:r>
         <w:t xml:space="preserve"> </w:t>
       </w:r>
-      <w:hyperlink r:id="rId87">
+      <w:hyperlink r:id="rId98">
         <w:r>
           <w:rPr>
             <w:rStyle w:val="Hyperlink"/>
@@ -2399,8 +2941,8 @@
         <w:t xml:space="preserve">.</w:t>
       </w:r>
     </w:p>
-    <w:bookmarkEnd w:id="88"/>
-    <w:bookmarkStart w:id="90" w:name="ref-soldevilla2017"/>
+    <w:bookmarkEnd w:id="99"/>
+    <w:bookmarkStart w:id="101" w:name="ref-soldevilla2017"/>
     <w:p>
       <w:pPr>
         <w:pStyle w:val="Bibliography"/>
@@ -2433,7 +2975,7 @@
       <w:r>
         <w:t xml:space="preserve"> </w:t>
       </w:r>
-      <w:hyperlink r:id="rId89">
+      <w:hyperlink r:id="rId100">
         <w:r>
           <w:rPr>
             <w:rStyle w:val="Hyperlink"/>
@@ -2445,8 +2987,8 @@
         <w:t xml:space="preserve">.</w:t>
       </w:r>
     </w:p>
-    <w:bookmarkEnd w:id="90"/>
-    <w:bookmarkStart w:id="92" w:name="ref-soldevilla2008"/>
+    <w:bookmarkEnd w:id="101"/>
+    <w:bookmarkStart w:id="103" w:name="ref-soldevilla2008"/>
     <w:p>
       <w:pPr>
         <w:pStyle w:val="Bibliography"/>
@@ -2485,7 +3027,7 @@
       <w:r>
         <w:t xml:space="preserve"> </w:t>
       </w:r>
-      <w:hyperlink r:id="rId91">
+      <w:hyperlink r:id="rId102">
         <w:r>
           <w:rPr>
             <w:rStyle w:val="Hyperlink"/>
@@ -2497,8 +3039,8 @@
         <w:t xml:space="preserve">.</w:t>
       </w:r>
     </w:p>
-    <w:bookmarkEnd w:id="92"/>
-    <w:bookmarkStart w:id="94" w:name="ref-soldevilla2010"/>
+    <w:bookmarkEnd w:id="103"/>
+    <w:bookmarkStart w:id="105" w:name="ref-soldevilla2010"/>
     <w:p>
       <w:pPr>
         <w:pStyle w:val="Bibliography"/>
@@ -2531,7 +3073,7 @@
       <w:r>
         <w:t xml:space="preserve"> </w:t>
       </w:r>
-      <w:hyperlink r:id="rId93">
+      <w:hyperlink r:id="rId104">
         <w:r>
           <w:rPr>
             <w:rStyle w:val="Hyperlink"/>
@@ -2543,8 +3085,8 @@
         <w:t xml:space="preserve">.</w:t>
       </w:r>
     </w:p>
-    <w:bookmarkEnd w:id="94"/>
-    <w:bookmarkStart w:id="96" w:name="ref-vanparijs2023"/>
+    <w:bookmarkEnd w:id="105"/>
+    <w:bookmarkStart w:id="107" w:name="ref-vanparijs2023"/>
     <w:p>
       <w:pPr>
         <w:pStyle w:val="Bibliography"/>
@@ -2574,7 +3116,7 @@
       <w:r>
         <w:t xml:space="preserve"> </w:t>
       </w:r>
-      <w:hyperlink r:id="rId95">
+      <w:hyperlink r:id="rId106">
         <w:r>
           <w:rPr>
             <w:rStyle w:val="Hyperlink"/>
@@ -2586,9 +3128,9 @@
         <w:t xml:space="preserve">.</w:t>
       </w:r>
     </w:p>
-    <w:bookmarkEnd w:id="96"/>
-    <w:bookmarkEnd w:id="97"/>
-    <w:bookmarkEnd w:id="98"/>
+    <w:bookmarkEnd w:id="107"/>
+    <w:bookmarkEnd w:id="108"/>
+    <w:bookmarkEnd w:id="109"/>
     <w:sectPr/>
   </w:body>
 </w:document>

</xml_diff>

<commit_message>
Addition of Visuals to Thesis Draft
</commit_message>
<xml_diff>
--- a/R/Thesis Draft - Geographic Variation in Echolocation Clicks of Risso's Dolphins in the California Current.docx
+++ b/R/Thesis Draft - Geographic Variation in Echolocation Clicks of Risso's Dolphins in the California Current.docx
@@ -484,7 +484,7 @@
         <w:t xml:space="preserve"> </w:t>
       </w:r>
       <w:r>
-        <w:t xml:space="preserve">(Soldevilla et al. 2008)</w:t>
+        <w:t xml:space="preserve">(M. S. Soldevilla et al. 2008)</w:t>
       </w:r>
       <w:r>
         <w:t xml:space="preserve">. These spectral features are hypothesized to reflect the impacts of morphological structures within the sound production and propagation process, and are stable enough to allow for species identification</w:t>
@@ -493,7 +493,7 @@
         <w:t xml:space="preserve"> </w:t>
       </w:r>
       <w:r>
-        <w:t xml:space="preserve">(Cranford, Amundin, and Norris 1996; McKenna et al. 2012; Soldevilla et al. 2008; Soldevilla, Wiggins, and Hildebrand 2010)</w:t>
+        <w:t xml:space="preserve">(Cranford, Amundin, and Norris 1996; McKenna et al. 2012; M. S. Soldevilla et al. 2008; M. S. Soldevilla, Wiggins, and Hildebrand 2010)</w:t>
       </w:r>
       <w:r>
         <w:t xml:space="preserve">. More importantly for this study, spectral banding in the echolocation clicks of Risso’s dolphins provides a measurable framework for comparison of click structure across encounters, regions, and time</w:t>
@@ -502,7 +502,7 @@
         <w:t xml:space="preserve"> </w:t>
       </w:r>
       <w:r>
-        <w:t xml:space="preserve">(Soldevilla et al. 2017)</w:t>
+        <w:t xml:space="preserve">(M. S. Soldevilla et al. 2017)</w:t>
       </w:r>
       <w:r>
         <w:t xml:space="preserve">. If spectral characteristics vary systematically, such variation could indicate morphological, behavioral, ecological, or population differences</w:t>
@@ -511,7 +511,7 @@
         <w:t xml:space="preserve"> </w:t>
       </w:r>
       <w:r>
-        <w:t xml:space="preserve">(Soldevilla et al. 2008, 2017)</w:t>
+        <w:t xml:space="preserve">(M. S. Soldevilla et al. 2008, 2017)</w:t>
       </w:r>
       <w:r>
         <w:t xml:space="preserve">.</w:t>
@@ -554,7 +554,7 @@
         <w:t xml:space="preserve"> </w:t>
       </w:r>
       <w:r>
-        <w:t xml:space="preserve">Soldevilla et al. (2008)</w:t>
+        <w:t xml:space="preserve">M. S. Soldevilla et al. (2008)</w:t>
       </w:r>
       <w:r>
         <w:t xml:space="preserve"> </w:t>
@@ -566,7 +566,7 @@
         <w:t xml:space="preserve"> </w:t>
       </w:r>
       <w:r>
-        <w:t xml:space="preserve">Soldevilla et al. (2017)</w:t>
+        <w:t xml:space="preserve">M. S. Soldevilla et al. (2017)</w:t>
       </w:r>
       <w:r>
         <w:t xml:space="preserve"> </w:t>
@@ -578,7 +578,7 @@
         <w:t xml:space="preserve"> </w:t>
       </w:r>
       <w:r>
-        <w:t xml:space="preserve">Soldevilla et al. (2008)</w:t>
+        <w:t xml:space="preserve">M. S. Soldevilla et al. (2008)</w:t>
       </w:r>
       <w:r>
         <w:t xml:space="preserve"> </w:t>
@@ -590,7 +590,7 @@
         <w:t xml:space="preserve"> </w:t>
       </w:r>
       <w:r>
-        <w:t xml:space="preserve">Soldevilla et al. (2017)</w:t>
+        <w:t xml:space="preserve">M. S. Soldevilla et al. (2017)</w:t>
       </w:r>
       <w:r>
         <w:t xml:space="preserve"> </w:t>
@@ -611,7 +611,7 @@
         <w:t xml:space="preserve"> </w:t>
       </w:r>
       <w:r>
-        <w:t xml:space="preserve">(McClatchie 2025; Soldevilla et al. 2017)</w:t>
+        <w:t xml:space="preserve">(McClatchie 2025; M. S. Soldevilla et al. 2017)</w:t>
       </w:r>
     </w:p>
     <w:p>
@@ -625,7 +625,7 @@
         <w:t xml:space="preserve"> </w:t>
       </w:r>
       <w:r>
-        <w:t xml:space="preserve">(Barlow and Forney 2007; Carretta et al. 2024; Forney and Barlow 1998; Soldevilla et al. 2017)</w:t>
+        <w:t xml:space="preserve">(Barlow and Forney 2007; Carretta et al. 2024; Forney and Barlow 1998; M. S. Soldevilla et al. 2017)</w:t>
       </w:r>
       <w:r>
         <w:t xml:space="preserve">. It also places the CCE in the broader bio-geographic context of pre-existing population variation patterns while establishing the baseline needed to interpret acoustic trends within the ecosystem</w:t>
@@ -634,7 +634,7 @@
         <w:t xml:space="preserve"> </w:t>
       </w:r>
       <w:r>
-        <w:t xml:space="preserve">(Soldevilla, Wiggins, and Hildebrand 2010; Soldevilla et al. 2017)</w:t>
+        <w:t xml:space="preserve">(M. S. Soldevilla, Wiggins, and Hildebrand 2010; M. S. Soldevilla et al. 2017)</w:t>
       </w:r>
       <w:r>
         <w:t xml:space="preserve">. In an era of increasing offshore anthropogenic impact, stronger foundational understanding is both scientifically and practically important across the CCE</w:t>
@@ -660,14 +660,14 @@
         <w:t xml:space="preserve"> </w:t>
       </w:r>
       <w:r>
-        <w:t xml:space="preserve">Soldevilla et al. (2017)</w:t>
+        <w:t xml:space="preserve">M. S. Soldevilla et al. (2017)</w:t>
       </w:r>
       <w:r>
         <w:t xml:space="preserve">.</w:t>
       </w:r>
     </w:p>
     <w:bookmarkEnd w:id="23"/>
-    <w:bookmarkStart w:id="31" w:name="ii.-materials-and-methods"/>
+    <w:bookmarkStart w:id="32" w:name="ii.-materials-and-methods"/>
     <w:p>
       <w:pPr>
         <w:pStyle w:val="Heading1"/>
@@ -676,13 +676,13 @@
         <w:t xml:space="preserve">II. Materials and Methods</w:t>
       </w:r>
     </w:p>
-    <w:bookmarkStart w:id="24" w:name="Xb11bf955ab4723df6efc69c04c2bdf4ac91893c"/>
+    <w:bookmarkStart w:id="24" w:name="a.-data-collection"/>
     <w:p>
       <w:pPr>
         <w:pStyle w:val="Heading2"/>
       </w:pPr>
       <w:r>
-        <w:t xml:space="preserve">A. Field Sites, Acoustic Survey Design, and Data Collection</w:t>
+        <w:t xml:space="preserve">A. Data Collection</w:t>
       </w:r>
     </w:p>
     <w:p>
@@ -769,13 +769,13 @@
       </w:r>
     </w:p>
     <w:bookmarkEnd w:id="24"/>
-    <w:bookmarkStart w:id="25" w:name="X8a9f7c232a166109e6be4c35b34d04d776fd5d4"/>
+    <w:bookmarkStart w:id="25" w:name="b.-acoustic-event-processing"/>
     <w:p>
       <w:pPr>
         <w:pStyle w:val="Heading2"/>
       </w:pPr>
       <w:r>
-        <w:t xml:space="preserve">B. Acoustic Event Processing and Click-Level Quality Control</w:t>
+        <w:t xml:space="preserve">B. Acoustic Event Processing</w:t>
       </w:r>
     </w:p>
     <w:p>
@@ -792,7 +792,7 @@
         <w:t xml:space="preserve">(Rankin et al. 2025)</w:t>
       </w:r>
       <w:r>
-        <w:t xml:space="preserve">. Analysts used Matlab-based Triton software to identify the start and end times of acoustic events of Risso’s dolphin echolocation clicks using long-term spectral averages (LTSA) viewed in one hour increments with a five second, 200 Hz resolution</w:t>
+        <w:t xml:space="preserve">. Analysts used Matlab-based Triton software</w:t>
       </w:r>
       <w:r>
         <w:t xml:space="preserve"> </w:t>
@@ -801,7 +801,10 @@
         <w:t xml:space="preserve">(Frasier et al. 2024)</w:t>
       </w:r>
       <w:r>
-        <w:t xml:space="preserve">. From these analyst-labelled events, broadband echolocation clicks were identified using a customized detection workflow within the PAMguard software [version 2.02.15;</w:t>
+        <w:t xml:space="preserve"> </w:t>
+      </w:r>
+      <w:r>
+        <w:t xml:space="preserve">to identify the start and end times of acoustic events of Risso’s dolphin echolocation clicks using long-term spectral averages (LTSA) viewed in one hour increments with a five second, 200 Hz resolution. From these analyst-labelled events, broadband echolocation clicks were identified using a customized detection workflow within the PAMguard software [version 2.02.15;</w:t>
       </w:r>
       <w:r>
         <w:t xml:space="preserve"> </w:t>
@@ -831,16 +834,7 @@
         <w:t xml:space="preserve">Keating et al. (2018)</w:t>
       </w:r>
       <w:r>
-        <w:t xml:space="preserve">. The categories for peak frequencies of the classification of clicks were 2-15, 15-30, 30-50, and 50-80 kHz. The workflow also estimated the received vertical angle of the identified echolocation clicks using the two hydrophones of the vertical array to determine the time-difference-of arrival of the clicks</w:t>
-      </w:r>
-      <w:r>
-        <w:t xml:space="preserve"> </w:t>
-      </w:r>
-      <w:r>
-        <w:t xml:space="preserve">(Keating et al. 2018; Simonis et al. 2020)</w:t>
-      </w:r>
-      <w:r>
-        <w:t xml:space="preserve">.</w:t>
+        <w:t xml:space="preserve">. The categories for peak frequencies of clicks were 2-15, 15-30, 30-50, and 50-80 kHz.</w:t>
       </w:r>
     </w:p>
     <w:p>
@@ -848,7 +842,7 @@
         <w:pStyle w:val="BodyText"/>
       </w:pPr>
       <w:r>
-        <w:t xml:space="preserve">Event-level acoustic study files were generated in PAMpal in R from copied PAMGuard SQLite databases and associated binary files</w:t>
+        <w:t xml:space="preserve">Analyst-identfied Risso’s dolphin event times were imported into R and used to group PAMGuard detections into event-level acoustic study objects. Click features were calculated via the PAMpal package in R</w:t>
       </w:r>
       <w:r>
         <w:t xml:space="preserve"> </w:t>
@@ -857,7 +851,19 @@
         <w:t xml:space="preserve">(Sakai et al. 2026)</w:t>
       </w:r>
       <w:r>
-        <w:t xml:space="preserve">. For each drift, PAMpal settings were defined using the corresponding database and binary folder, with the sampling rate detected automatically, a 2.5 ms analysis window, and a 10–80 kHz frequency filter applied during click processing. Analyst-identified Risso’s dolphin event times were imported into R, converted to UTC start and end times, and used to group PAMGuard click detections into event-level acoustic study objects. For CCES deployments, event end times were defined as 119 seconds after the start time to reflect the two-minute duty-cycle recording structure. During this processing step, click-level metadata were extracted from the PAMGuard detections, including unique click identifiers, timing information, amplitude, frequency measurements, inter-click interval (ICI), and other detector-derived spectral and temporal features.</w:t>
+        <w:t xml:space="preserve"> </w:t>
+      </w:r>
+      <w:r>
+        <w:t xml:space="preserve">using a 2.5 ms analysis window and 10-80 kHz bandpass filter. During this processing step, a suite of standard features were calculated from the PAMGuuard click detections, including unique click identifiers, timing information, amplitude, spectral measurements, and inter-click interval</w:t>
+      </w:r>
+      <w:r>
+        <w:t xml:space="preserve"> </w:t>
+      </w:r>
+      <w:r>
+        <w:t xml:space="preserve">(Sakai et al. 2026)</w:t>
+      </w:r>
+      <w:r>
+        <w:t xml:space="preserve">. Additionally, in R clicks were omitted from events if they were assigned to classifiers 0 or 1 – making them unclassified or having a peak frequency between 2-15 kHz – or if they had measure peak frequencies below 15 kHz or duration great than 2000 ms which are features that would suggest that these detections were false positives.</w:t>
       </w:r>
     </w:p>
     <w:p>
@@ -865,13 +871,13 @@
         <w:pStyle w:val="BodyText"/>
       </w:pPr>
       <w:r>
-        <w:t xml:space="preserve">To limit the inclusion of non-target echolocation clicks, each candidate Risso’s dolphin event was manually reviewed through comparison of concatenated spectrograms, mean spectra, and broader event context. Events were retained only when they displayed the expected spectral banding structure of Risso’s dolphin echolocation clicks, contained more than 100 echolocation clicks to ensure sufficient representation of spectral structure, and did not overlap with recorded detections of other cetacean species</w:t>
-      </w:r>
-      <w:r>
-        <w:t xml:space="preserve"> </w:t>
-      </w:r>
-      <w:r>
-        <w:t xml:space="preserve">(Soldevilla et al. 2017)</w:t>
+        <w:t xml:space="preserve">The goal of this study was to evaluate variation in spectral banding in clicks, so clicks without spectral banding were omitted from the analysis. Each candidate Risso’s dolphin event was manually reviewed through comparison of concatenated spectrograms, mean spectra, and broader event context. Events were retained only when they displayed the expected spectral banding structure of Risso’s dolphin echolocation clicks, contained more than 100 echolocation clicks to ensure sufficient representation of spectral structure, and did not overlap with recorded detections of other cetacean species</w:t>
+      </w:r>
+      <w:r>
+        <w:t xml:space="preserve"> </w:t>
+      </w:r>
+      <w:r>
+        <w:t xml:space="preserve">(M. S. Soldevilla et al. 2017)</w:t>
       </w:r>
       <w:r>
         <w:t xml:space="preserve">. Events occurring within 20 minutes before or after a non-target species detection, such as Pacific white-sided dolphin (</w:t>
@@ -892,13 +898,13 @@
         <w:pStyle w:val="BodyText"/>
       </w:pPr>
       <w:r>
-        <w:t xml:space="preserve">For all retained events, duplicated clean copies of the PAMGuard databases were used for manual click-level review. Concatenated spectrograms and mean spectra were visually inspected to identify individual clicks lacking the characteristic Risso’s dolphin spectral banding structure. Suspect detections were then reviewed directly in PAMGuard and removed when determined to be inconsistent with target click characteristics or likely to represent non-biological or non-meaningful acoustic signals</w:t>
-      </w:r>
-      <w:r>
-        <w:t xml:space="preserve"> </w:t>
-      </w:r>
-      <w:r>
-        <w:t xml:space="preserve">(Soldevilla et al. 2017)</w:t>
+        <w:t xml:space="preserve">For all retained events, concatenated spectrograms and mean spectra were visually inspected to identify individual clicks lacking the characteristic Risso’s dolphin spectral banding structure. Detections were removed when inconsistent with known Risso’s dolphin click characteristics or likely to represent non-biological or non-meaningful acoustic signals</w:t>
+      </w:r>
+      <w:r>
+        <w:t xml:space="preserve"> </w:t>
+      </w:r>
+      <w:r>
+        <w:t xml:space="preserve">(M. S. Soldevilla et al. 2017)</w:t>
       </w:r>
       <w:r>
         <w:t xml:space="preserve">. This iterative review process was used to improve consistency of the final echolocation click dataset prior to downstream analyses.</w:t>
@@ -918,7 +924,7 @@
         <w:t xml:space="preserve">(L. Rabiner, Sambur, and Schmidt 1975)</w:t>
       </w:r>
       <w:r>
-        <w:t xml:space="preserve">. Tukey smoothing was applied before spectral feature extraction and clustering to improve the stability and consistency of spectral banding patterns across clicks and events.</w:t>
+        <w:t xml:space="preserve">. Tukey smoothing was applied before clustering to improve the stability and consistency of spectral banding patterns across clicks and events.</w:t>
       </w:r>
     </w:p>
     <w:p>
@@ -926,7 +932,7 @@
         <w:pStyle w:val="BodyText"/>
       </w:pPr>
       <w:r>
-        <w:t xml:space="preserve">Cepstral liftering approaches were also explored as a potential method for reducing broad spectral effects related to transmission loss, recording system response, and overall spectral tilt while preserving the finer-scale peak and notch structure of Risso’s dolphin echolocation clicks (Soldevilla et al. 2008, 2017). In cepstral analysis, the log-magnitude spectrum is transformed into the cepstral domain, where low cepstral coefficients, or quefrencies, describe slowly varying spectral structure, while higher quefrencies retain finer-scale spectral features [</w:t>
+        <w:t xml:space="preserve">Cepstral liftering approaches were also explored as a potential method for reducing broad spectral effects related to recording system response, and overall spectral tilt while preserving the finer-scale peak and notch structure of Risso’s dolphin echolocation clicks (Soldevilla et al. 2008, 2017). In cepstral analysis, the log-magnitude spectrum is transformed into the cepstral domain, where low cepstral coefficients, or quefrencies, describe slowly varying spectral structure, while higher quefrencies retain finer-scale spectral features [</w:t>
       </w:r>
       <w:r>
         <w:t xml:space="preserve"> </w:t>
@@ -944,17 +950,17 @@
         <w:t xml:space="preserve">Lawrence Rabiner and Juang (1993)</w:t>
       </w:r>
       <w:r>
-        <w:t xml:space="preserve">]. Previous Risso’s dolphin studies used high-pass liftering after truncating spectra to 19–50 kHz to de-emphasize broad spectral-envelope effects while retaining the main peak and notch features used to describe spectral banding (Soldevilla et al. 2008, 2017). In the present study, liftering was tested on the click spectra but produced only minor visual changes to the concatenated spectrograms and mean spectra. The dominant peak and notch positions remained largely unchanged, and liftering did not reveal additional consistent banding structure or improve visual separation of spectral features beyond the Tukey-smoothed spectra. Therefore, all subsequent analyses were conducted using only the Tukey-smoothed spectra.</w:t>
+        <w:t xml:space="preserve">]. Previous Risso’s dolphin studies used high-pass liftering after truncating spectra to 19–50 kHz to de-emphasize broad spectral-envelope effects while retaining the main peak and notch features used to describe spectral banding (Soldevilla et al. 2008, 2017). In the present study, liftering was tested on the click spectra but the dominant peak and notch positions remained largely unchanged. Therefore, all subsequent analyses were conducted using only the Tukey-smoothed spectra.</w:t>
       </w:r>
     </w:p>
     <w:bookmarkEnd w:id="25"/>
-    <w:bookmarkStart w:id="28" w:name="Xffdcfb37901fcb4dbec6b009e4897a02658a1bc"/>
+    <w:bookmarkStart w:id="29" w:name="c.-cluster-analysis"/>
     <w:p>
       <w:pPr>
         <w:pStyle w:val="Heading2"/>
       </w:pPr>
       <w:r>
-        <w:t xml:space="preserve">C. Spectral-Temporal Feature Standardization and Clustering</w:t>
+        <w:t xml:space="preserve">C. Cluster Analysis</w:t>
       </w:r>
     </w:p>
     <w:bookmarkStart w:id="26" w:name="spectral-temporal-pre-processing"/>
@@ -981,7 +987,7 @@
         <w:t xml:space="preserve"> </w:t>
       </w:r>
       <w:r>
-        <w:t xml:space="preserve">Soldevilla et al. (2017)</w:t>
+        <w:t xml:space="preserve">M. S. Soldevilla et al. (2017)</w:t>
       </w:r>
       <w:r>
         <w:t xml:space="preserve">. This frequency range encompasses the primary banding structure of Risso’s dolphin echolocation clicks, while removing lower- and higher-frequency components not relevant to the present analysis. Spectra were then min-max normalized across the retained frequency range so that clustering emphasized relative spectral shape rather than absolute received level</w:t>
@@ -1008,14 +1014,14 @@
         <w:t xml:space="preserve"> </w:t>
       </w:r>
       <w:r>
-        <w:t xml:space="preserve">(Soldevilla et al. 2017)</w:t>
+        <w:t xml:space="preserve">(M. S. Soldevilla et al. 2017)</w:t>
       </w:r>
       <w:r>
         <w:t xml:space="preserve">. Events containing fewer clicks than the 200 click threshold retained all clicks. The resulting dataset was used for all subsequent dimensionality reduction and clustering analyses.</w:t>
       </w:r>
     </w:p>
     <w:bookmarkEnd w:id="26"/>
-    <w:bookmarkStart w:id="27" w:name="dimensionality-reduction-and-clustering"/>
+    <w:bookmarkStart w:id="27" w:name="dimensionality-reduction"/>
     <w:p>
       <w:pPr>
         <w:pStyle w:val="Heading3"/>
@@ -1025,7 +1031,7 @@
           <w:i/>
           <w:iCs/>
         </w:rPr>
-        <w:t xml:space="preserve">2. Dimensionality Reduction and Clustering</w:t>
+        <w:t xml:space="preserve">2. Dimensionality Reduction</w:t>
       </w:r>
     </w:p>
     <w:p>
@@ -1090,9 +1096,23 @@
         <w:t xml:space="preserve">. UMAP was implemented using 30 nearest neighbors, a minimum distance of 0.1, Euclidean distance metrics, and a fixed random seed in order to ensure reproducibility. These parameters were selected in order to balance the broader organization of the spectral-temporal feature space with the preservation of local neighborhood, all while aiming to maintain usable density patterns.</w:t>
       </w:r>
     </w:p>
-    <w:p>
-      <w:pPr>
-        <w:pStyle w:val="BodyText"/>
+    <w:bookmarkEnd w:id="27"/>
+    <w:bookmarkStart w:id="28" w:name="clustering"/>
+    <w:p>
+      <w:pPr>
+        <w:pStyle w:val="Heading3"/>
+      </w:pPr>
+      <w:r>
+        <w:rPr>
+          <w:i/>
+          <w:iCs/>
+        </w:rPr>
+        <w:t xml:space="preserve">2. Clustering</w:t>
+      </w:r>
+    </w:p>
+    <w:p>
+      <w:pPr>
+        <w:pStyle w:val="FirstParagraph"/>
       </w:pPr>
       <w:r>
         <w:t xml:space="preserve">HDBSCAN was applied to the resulting two-dimensional UMAP embedding</w:t>
@@ -1119,15 +1139,15 @@
         <w:t xml:space="preserve">. Multiple point thresholds were explored during workflow development to assess clustering sensitivity and flexibility across a range of density requirements. A minimum point threshold of 50 was determined for the final analysis as it emphasized robust recurring density structure while also limiting fragmentation into small local clusters. The resulting cluster assignments were used for all following analyses of spectral-temporal and geographic variation.</w:t>
       </w:r>
     </w:p>
-    <w:bookmarkEnd w:id="27"/>
     <w:bookmarkEnd w:id="28"/>
-    <w:bookmarkStart w:id="29" w:name="X2cfd084ee5e07363125116c62996d3434f57bbc"/>
+    <w:bookmarkEnd w:id="29"/>
+    <w:bookmarkStart w:id="30" w:name="d.-cross-regional-comparison"/>
     <w:p>
       <w:pPr>
         <w:pStyle w:val="Heading2"/>
       </w:pPr>
       <w:r>
-        <w:t xml:space="preserve">D. Comparison of CCE Spectral-Temporal Features with Previously Described Regions</w:t>
+        <w:t xml:space="preserve">D. Cross-Regional Comparison</w:t>
       </w:r>
     </w:p>
     <w:p>
@@ -1141,7 +1161,7 @@
         <w:t xml:space="preserve"> </w:t>
       </w:r>
       <w:r>
-        <w:t xml:space="preserve">Soldevilla et al. (2017)</w:t>
+        <w:t xml:space="preserve">M. S. Soldevilla et al. (2017)</w:t>
       </w:r>
       <w:r>
         <w:t xml:space="preserve">. For this event-level comparison, all retained events from the CCE dataset were treated collectively as a regional dataset, paralleling regional comparison framework by</w:t>
@@ -1150,7 +1170,7 @@
         <w:t xml:space="preserve"> </w:t>
       </w:r>
       <w:r>
-        <w:t xml:space="preserve">Soldevilla et al. (2017)</w:t>
+        <w:t xml:space="preserve">M. S. Soldevilla et al. (2017)</w:t>
       </w:r>
       <w:r>
         <w:t xml:space="preserve"> </w:t>
@@ -1195,7 +1215,7 @@
         <w:t xml:space="preserve"> </w:t>
       </w:r>
       <w:r>
-        <w:t xml:space="preserve">(Soldevilla et al. 2008, 2017)</w:t>
+        <w:t xml:space="preserve">(M. S. Soldevilla et al. 2008, 2017)</w:t>
       </w:r>
       <w:r>
         <w:t xml:space="preserve">. Peak detection was performed using a minimum peak height of 0.15, a minimum peak distance of one frequency bin, and a requirement of one ascending and one descending point surrounding each peak. These less restrictive settings were used to allow detection of closely spaced or less pronounced spectral extrema while retaining the same minimum amplitude threshold. Equivalent parameters were used during notch identification following spectral inversion.</w:t>
@@ -1212,20 +1232,20 @@
         <w:t xml:space="preserve"> </w:t>
       </w:r>
       <w:r>
-        <w:t xml:space="preserve">Soldevilla et al. (2017)</w:t>
+        <w:t xml:space="preserve">M. S. Soldevilla et al. (2017)</w:t>
       </w:r>
       <w:r>
         <w:t xml:space="preserve">, including the Southeast U.S. Continental Shelf, Northeast U.S. Continental Shelf, Gulf of Mexico, Pelagic Pacific, and California Current’s Southern California Bight.</w:t>
       </w:r>
     </w:p>
-    <w:bookmarkEnd w:id="29"/>
-    <w:bookmarkStart w:id="30" w:name="X33a9650a3db98b4712b45fd1a9b893fe62b6b0e"/>
+    <w:bookmarkEnd w:id="30"/>
+    <w:bookmarkStart w:id="31" w:name="e.-click-type-comparison"/>
     <w:p>
       <w:pPr>
         <w:pStyle w:val="Heading2"/>
       </w:pPr>
       <w:r>
-        <w:t xml:space="preserve">E. Click Type Comparison with Previously Described Click Types</w:t>
+        <w:t xml:space="preserve">E. Click Type Comparison</w:t>
       </w:r>
     </w:p>
     <w:p>
@@ -1233,13 +1253,13 @@
         <w:pStyle w:val="FirstParagraph"/>
       </w:pPr>
       <w:r>
-        <w:t xml:space="preserve">In addition to the event-level regional comparison, spectral peaks and notches were quantified from the mean spectra of each click type identified through the spectral-temporal clustering workflow in the present study. This click type-level analysis was used to evaluate whether recurring click types identified in the CCE dataset showed spectral banding patterns similar to the nine Risso’s dolphin click types previously described by</w:t>
-      </w:r>
-      <w:r>
-        <w:t xml:space="preserve"> </w:t>
-      </w:r>
-      <w:r>
-        <w:t xml:space="preserve">Soldevilla et al. (2017)</w:t>
+        <w:t xml:space="preserve">In addition to the event-level regional comparison, spectral peaks and notches were quantified from the centroid spectra identified in the present study. This click type-level analysis was used to evaluate whether recurring click types identified in the CCE dataset showed spectral banding patterns similar to the nine Risso’s dolphin click types previously described by</w:t>
+      </w:r>
+      <w:r>
+        <w:t xml:space="preserve"> </w:t>
+      </w:r>
+      <w:r>
+        <w:t xml:space="preserve">M. S. Soldevilla et al. (2017)</w:t>
       </w:r>
       <w:r>
         <w:t xml:space="preserve"> </w:t>
@@ -1259,7 +1279,7 @@
         <w:t xml:space="preserve"> </w:t>
       </w:r>
       <w:r>
-        <w:t xml:space="preserve">Soldevilla et al. (2017)</w:t>
+        <w:t xml:space="preserve">M. S. Soldevilla et al. (2017)</w:t>
       </w:r>
       <w:r>
         <w:t xml:space="preserve"> </w:t>
@@ -1271,7 +1291,7 @@
         <w:t xml:space="preserve"> </w:t>
       </w:r>
       <w:r>
-        <w:t xml:space="preserve">Soldevilla et al. (2017)</w:t>
+        <w:t xml:space="preserve">M. S. Soldevilla et al. (2017)</w:t>
       </w:r>
       <w:r>
         <w:t xml:space="preserve"> </w:t>
@@ -1280,9 +1300,9 @@
         <w:t xml:space="preserve">click type mean spectra and the present CCE click type mean spectra. The resulting peak and notch frequencies were then used to compare spectral banding patterns between the previously described click types and the click types identified in the present study.</w:t>
       </w:r>
     </w:p>
-    <w:bookmarkEnd w:id="30"/>
     <w:bookmarkEnd w:id="31"/>
-    <w:bookmarkStart w:id="36" w:name="iii.-results"/>
+    <w:bookmarkEnd w:id="32"/>
+    <w:bookmarkStart w:id="57" w:name="iii.-results"/>
     <w:p>
       <w:pPr>
         <w:pStyle w:val="Heading1"/>
@@ -1296,10 +1316,35 @@
         <w:pStyle w:val="FirstParagraph"/>
       </w:pPr>
       <w:r>
-        <w:t xml:space="preserve">Risso’s dolphin echolocation clicks were detected across all three surveys - PASCAL, CCES, and Adrift - with the raw dataset containing 127 candidate acoustic events from 32 drifts. These included 28 events from PASCAL (22.0%), 49 events from CCES (38.6%), and 50 events from Adrift (39.4%). Following event-level review, 79 events were excluded from the dataset due to incompatible recorder type, insufficient number of click detections, recorder failure or data gaps, or multi-species detections. Only one candidate event was removed because it did not exhibit clear Risso’s dolphin spectral banding. The retained dataset included 48 events from 20 drifts, composed of three PASCAL events (6.3%), 24 CCES events (50%), and 21 events from Adrift (43.8%). Following manual click-level cleaning, the retained dataset contained 344,153 clicks, with cleaned click counts ranging from 99 to 80,999 clicks per event. After filtering ICI from 0.01-0.4 s, 214,944 clicks were retained for downstream analysis.</w:t>
-      </w:r>
-    </w:p>
-    <w:bookmarkStart w:id="32" w:name="Xfc8c1db0e6f565f128541a21409f9808eb31779"/>
+        <w:t xml:space="preserve">Risso’s dolphin echolocation clicks were detected across all three surveys - PASCAL, CCES, and Adrift - with the raw dataset containing 127 candidate acoustic events from 32 drifts. These included 28 events from PASCAL (22.0%), 49 events from CCES (38.6%), and 50 events from Adrift (39.4%). Following event-level review, 79 events were excluded from the dataset due to incompatible recorder type, insufficient number of click detections, recorder failure or data gaps, or multi-species detections. Only one candidate event was removed because it did not exhibit clear Risso’s dolphin spectral banding. The retained dataset included 48 events from 20 drifts, composed of three PASCAL events (6.3%), 24 CCES events (50%), and 21 events from Adrift (43.8%). Following manual click-level cleaning, the retained dataset contained 344,153 clicks, with cleaned click counts ranging from 99 to 80,999 clicks per event. After filtering ICI from 0.01-0.4 s, 214,944 clicks were retained for downstream analysis</w:t>
+      </w:r>
+      <w:r>
+        <w:t xml:space="preserve"> </w:t>
+      </w:r>
+      <w:r>
+        <w:rPr>
+          <w:b/>
+          <w:bCs/>
+        </w:rPr>
+        <w:t xml:space="preserve">(retained dataset summary table)</w:t>
+      </w:r>
+      <w:r>
+        <w:t xml:space="preserve">.</w:t>
+      </w:r>
+    </w:p>
+    <w:p>
+      <w:pPr>
+        <w:pStyle w:val="BodyText"/>
+      </w:pPr>
+      <w:r>
+        <w:rPr>
+          <w:b/>
+          <w:bCs/>
+        </w:rPr>
+        <w:t xml:space="preserve">Instering retained dataset summary table</w:t>
+      </w:r>
+    </w:p>
+    <w:bookmarkStart w:id="45" w:name="Xfc8c1db0e6f565f128541a21409f9808eb31779"/>
     <w:p>
       <w:pPr>
         <w:pStyle w:val="Heading2"/>
@@ -1313,9 +1358,99 @@
         <w:pStyle w:val="FirstParagraph"/>
       </w:pPr>
       <w:r>
-        <w:t xml:space="preserve">9,220 clicks from 48 events were included in the spectral-temporal clustering workflow following ICI filtering and sampling of 200 clicks per event. The first 18 principal components accounted for 90.6% of the cumulative spectral variance of the dataset and were used in downstream analysis. These spectral features were combined with the fully weighted scaled log10 ICI feature and projected into a two-dimensional UMAP embedding. HDBSCAN cluster analysis of this UMAP embedding, using a minimum point threshold of 50, led to the identification of nine non-noise clusters which can be interpreted as recurring CCE click types.</w:t>
-      </w:r>
-    </w:p>
+        <w:t xml:space="preserve">9,220 clicks from 48 events were included in the spectral-temporal clustering workflow following ICI filtering and sampling of 200 clicks per event. The first 18 principal components accounted for 90.6% of the cumulative spectral variance of the dataset and were used in downstream analysis. These spectral features were combined with the fully weighted scaled log10 ICI feature and projected into a two-dimensional UMAP embedding. HDBSCAN cluster analysis of this UMAP embedding, using a minimum point threshold of 50, led to the identification of nine non-noise clusters which can be interpreted as recurring CCE click types (</w:t>
+      </w:r>
+      <w:hyperlink w:anchor="fig-umap-click-types">
+        <w:r>
+          <w:rPr>
+            <w:rStyle w:val="Hyperlink"/>
+          </w:rPr>
+          <w:t xml:space="preserve">Figure 1</w:t>
+        </w:r>
+      </w:hyperlink>
+      <w:r>
+        <w:t xml:space="preserve">).</w:t>
+      </w:r>
+    </w:p>
+    <w:tbl>
+      <w:tblPr>
+        <w:tblStyle w:val="Table"/>
+        <w:tblW w:type="pct" w:w="5000"/>
+        <w:tblLayout w:type="fixed"/>
+        <w:tblLook w:firstRow="0" w:lastRow="0" w:firstColumn="0" w:lastColumn="0" w:noHBand="0" w:noVBand="0" w:val="0000"/>
+      </w:tblPr>
+      <w:tblGrid>
+        <w:gridCol w:w="7920"/>
+      </w:tblGrid>
+      <w:tr>
+        <w:tc>
+          <w:tcPr/>
+          <w:bookmarkStart w:id="36" w:name="fig-umap-click-types"/>
+          <w:p>
+            <w:pPr>
+              <w:pStyle w:val="Compact"/>
+              <w:jc w:val="center"/>
+            </w:pPr>
+            <w:r>
+              <w:drawing>
+                <wp:inline>
+                  <wp:extent cx="4800600" cy="3600450"/>
+                  <wp:effectExtent b="0" l="0" r="0" t="0"/>
+                  <wp:docPr descr="" title="" id="34" name="Picture"/>
+                  <a:graphic>
+                    <a:graphicData uri="http://schemas.openxmlformats.org/drawingml/2006/picture">
+                      <pic:pic>
+                        <pic:nvPicPr>
+                          <pic:cNvPr descr="Figures/FULL_umap_clusters_no_noise_18PC_scaledICI_1_minPts50.png" id="35" name="Picture"/>
+                          <pic:cNvPicPr>
+                            <a:picLocks noChangeArrowheads="1" noChangeAspect="1"/>
+                          </pic:cNvPicPr>
+                        </pic:nvPicPr>
+                        <pic:blipFill>
+                          <a:blip r:embed="rId33"/>
+                          <a:stretch>
+                            <a:fillRect/>
+                          </a:stretch>
+                        </pic:blipFill>
+                        <pic:spPr bwMode="auto">
+                          <a:xfrm>
+                            <a:off x="0" y="0"/>
+                            <a:ext cx="4800600" cy="3600450"/>
+                          </a:xfrm>
+                          <a:prstGeom prst="rect">
+                            <a:avLst/>
+                          </a:prstGeom>
+                          <a:noFill/>
+                          <a:ln w="9525">
+                            <a:noFill/>
+                            <a:headEnd/>
+                            <a:tailEnd/>
+                          </a:ln>
+                        </pic:spPr>
+                      </pic:pic>
+                    </a:graphicData>
+                  </a:graphic>
+                </wp:inline>
+              </w:drawing>
+            </w:r>
+          </w:p>
+          <w:p>
+            <w:pPr>
+              <w:jc w:val="center"/>
+            </w:pPr>
+            <w:pPr>
+              <w:jc w:val="start"/>
+              <w:spacing w:before="200"/>
+              <w:pStyle w:val="ImageCaption"/>
+            </w:pPr>
+            <w:r>
+              <w:t xml:space="preserve">Figure 1: Two-dimensional UMAP embedding of 4,501 sampled Risso’s dolphin echolocation clicks assigned by HDBSCAN to nine recurring click types. The embedding was generated from 18 spectral principal components retaining 90% dataset variance and the fully weighted standardized log10 ICI. Colors indicate click-type assignment.</w:t>
+            </w:r>
+          </w:p>
+          <w:bookmarkEnd w:id="36"/>
+        </w:tc>
+      </w:tr>
+    </w:tbl>
     <w:p>
       <w:pPr>
         <w:pStyle w:val="BodyText"/>
@@ -1324,16 +1459,229 @@
         <w:t xml:space="preserve">Of the 9,220 sampled clicks, 4,501 clicks (48.8%) were assigned to the nine click types, while 4,719 (51.2%) were classified by HDBSCAN as low-density or unassigned. Click type 9 was the most prevalent assigned type with 2,745 clicks – 29.8% of all sampled clicks and 61.0% of assigned clicks. The remaining click types were smaller, ranging from 66 clicks in click type 5, to 510 clicks in click type 7. This clustering result indicates that click type 9, the most dominant click type, was prevalent across the sampled dataset, while lower-abundance click types represented smaller, but still meaningful, distinct regions of the spectral-temporal feature space.</w:t>
       </w:r>
     </w:p>
+    <w:tbl>
+      <w:tblPr>
+        <w:tblStyle w:val="Table"/>
+        <w:tblW w:type="pct" w:w="5000"/>
+        <w:tblLayout w:type="fixed"/>
+        <w:tblLook w:firstRow="0" w:lastRow="0" w:firstColumn="0" w:lastColumn="0" w:noHBand="0" w:noVBand="0" w:val="0000"/>
+      </w:tblPr>
+      <w:tblGrid>
+        <w:gridCol w:w="7920"/>
+      </w:tblGrid>
+      <w:tr>
+        <w:tc>
+          <w:tcPr/>
+          <w:bookmarkStart w:id="40" w:name="fig-click-type-ici"/>
+          <w:p>
+            <w:pPr>
+              <w:pStyle w:val="Compact"/>
+              <w:jc w:val="center"/>
+            </w:pPr>
+            <w:r>
+              <w:drawing>
+                <wp:inline>
+                  <wp:extent cx="4267200" cy="2844799"/>
+                  <wp:effectExtent b="0" l="0" r="0" t="0"/>
+                  <wp:docPr descr="" title="" id="38" name="Picture"/>
+                  <a:graphic>
+                    <a:graphicData uri="http://schemas.openxmlformats.org/drawingml/2006/picture">
+                      <pic:pic>
+                        <pic:nvPicPr>
+                          <pic:cNvPr descr="Figures/FULL_ici_boxplot_no_noise_18PC_plus_1x_scaled_logICI_minPts50.png" id="39" name="Picture"/>
+                          <pic:cNvPicPr>
+                            <a:picLocks noChangeArrowheads="1" noChangeAspect="1"/>
+                          </pic:cNvPicPr>
+                        </pic:nvPicPr>
+                        <pic:blipFill>
+                          <a:blip r:embed="rId37"/>
+                          <a:stretch>
+                            <a:fillRect/>
+                          </a:stretch>
+                        </pic:blipFill>
+                        <pic:spPr bwMode="auto">
+                          <a:xfrm>
+                            <a:off x="0" y="0"/>
+                            <a:ext cx="4267200" cy="2844799"/>
+                          </a:xfrm>
+                          <a:prstGeom prst="rect">
+                            <a:avLst/>
+                          </a:prstGeom>
+                          <a:noFill/>
+                          <a:ln w="9525">
+                            <a:noFill/>
+                            <a:headEnd/>
+                            <a:tailEnd/>
+                          </a:ln>
+                        </pic:spPr>
+                      </pic:pic>
+                    </a:graphicData>
+                  </a:graphic>
+                </wp:inline>
+              </w:drawing>
+            </w:r>
+          </w:p>
+          <w:p>
+            <w:pPr>
+              <w:jc w:val="center"/>
+            </w:pPr>
+            <w:pPr>
+              <w:jc w:val="start"/>
+              <w:spacing w:before="200"/>
+              <w:pStyle w:val="ImageCaption"/>
+            </w:pPr>
+            <w:r>
+              <w:t xml:space="preserve">Figure 2: Distribution of ICI among the nine assigned Risso’s dolphin click types. Boxplots show variation in ICI for sampled clicks assigned to each non-noise HDBSCAN cluster.</w:t>
+            </w:r>
+          </w:p>
+          <w:bookmarkEnd w:id="40"/>
+        </w:tc>
+      </w:tr>
+    </w:tbl>
     <w:p>
       <w:pPr>
         <w:pStyle w:val="BodyText"/>
       </w:pPr>
       <w:r>
-        <w:t xml:space="preserve">The identified click types differed in click timing, as well as spectral structure. Median ICI values separated the click types into broadly defined temporal groups; click types 1, 4, 5, 6, and 7 characterized by short median ICIs of approximately 0.016-0.020 s, click types 2, 3, and 8 characterized by intermediate median ICIs of approximately 0.033-0.052 s, and click type 9 characterized by a substantially longer median ICI of 0.170 s. The mean spectra for the nine click types all exhibited the characteristic peak and notch structure of Risso’s dolphin echolocation clicks, but differed in the frequency placement and spacing of these features. Across the identified click types, the first peak ranged from 21.4-22.9 kHz, the second peak ranged from 24.4-25.5 kHz, the third peak ranged from 25.5-33.8 kHz, and the fourth peak ranged from 26.6-37.5 kHz. Notch frequencies also varied across click types, with the first notch occurring between 19.5-23.6 kHz, the second between 23.6-27.8 kHz, and the third between 25.9-35.6 kHz. Click type 7 was spectrally distinct as it exhibited a clear six-banded pattern, with six visible peaks at 22.5, 25.5, 29.6, 33.8, 36.8, and 42.4 kHz, separated by pronounced notches. When combined with the observed ICI patterns, these spectral differences support the interpretation of the nine clusters as recurring spectral-temporal click types.</w:t>
-      </w:r>
-    </w:p>
-    <w:bookmarkEnd w:id="32"/>
-    <w:bookmarkStart w:id="33" w:name="X58c62cfa1a7957e30f0e226059323870addb8a1"/>
+        <w:t xml:space="preserve">The identified click types differed in click timing, as well as spectral structure (</w:t>
+      </w:r>
+      <w:hyperlink w:anchor="fig-click-type-ici">
+        <w:r>
+          <w:rPr>
+            <w:rStyle w:val="Hyperlink"/>
+          </w:rPr>
+          <w:t xml:space="preserve">Figure 2</w:t>
+        </w:r>
+      </w:hyperlink>
+      <w:r>
+        <w:t xml:space="preserve">). Median ICI values separated the click types into broadly defined temporal groups; click types 1, 4, 5, 6, and 7 characterized by short median ICIs of approximately 0.016-0.020 s, click types 2, 3, and 8 characterized by intermediate median ICIs of approximately 0.033-0.052 s, and click type 9 characterized by a substantially longer median ICI of 0.170 s.</w:t>
+      </w:r>
+    </w:p>
+    <w:tbl>
+      <w:tblPr>
+        <w:tblStyle w:val="Table"/>
+        <w:tblW w:type="pct" w:w="5000"/>
+        <w:tblLayout w:type="fixed"/>
+        <w:tblLook w:firstRow="0" w:lastRow="0" w:firstColumn="0" w:lastColumn="0" w:noHBand="0" w:noVBand="0" w:val="0000"/>
+      </w:tblPr>
+      <w:tblGrid>
+        <w:gridCol w:w="7920"/>
+      </w:tblGrid>
+      <w:tr>
+        <w:tc>
+          <w:tcPr/>
+          <w:bookmarkStart w:id="44" w:name="fig-click-type-spectra"/>
+          <w:p>
+            <w:pPr>
+              <w:pStyle w:val="Compact"/>
+              <w:jc w:val="center"/>
+            </w:pPr>
+            <w:r>
+              <w:drawing>
+                <wp:inline>
+                  <wp:extent cx="5334000" cy="4000500"/>
+                  <wp:effectExtent b="0" l="0" r="0" t="0"/>
+                  <wp:docPr descr="" title="" id="42" name="Picture"/>
+                  <a:graphic>
+                    <a:graphicData uri="http://schemas.openxmlformats.org/drawingml/2006/picture">
+                      <pic:pic>
+                        <pic:nvPicPr>
+                          <pic:cNvPr descr="Figures/clean_mean_spectra_SD_faceted_no_noise_18PC_scaledICI_1_minPts50.png" id="43" name="Picture"/>
+                          <pic:cNvPicPr>
+                            <a:picLocks noChangeArrowheads="1" noChangeAspect="1"/>
+                          </pic:cNvPicPr>
+                        </pic:nvPicPr>
+                        <pic:blipFill>
+                          <a:blip r:embed="rId41"/>
+                          <a:stretch>
+                            <a:fillRect/>
+                          </a:stretch>
+                        </pic:blipFill>
+                        <pic:spPr bwMode="auto">
+                          <a:xfrm>
+                            <a:off x="0" y="0"/>
+                            <a:ext cx="5334000" cy="4000500"/>
+                          </a:xfrm>
+                          <a:prstGeom prst="rect">
+                            <a:avLst/>
+                          </a:prstGeom>
+                          <a:noFill/>
+                          <a:ln w="9525">
+                            <a:noFill/>
+                            <a:headEnd/>
+                            <a:tailEnd/>
+                          </a:ln>
+                        </pic:spPr>
+                      </pic:pic>
+                    </a:graphicData>
+                  </a:graphic>
+                </wp:inline>
+              </w:drawing>
+            </w:r>
+          </w:p>
+          <w:p>
+            <w:pPr>
+              <w:jc w:val="center"/>
+            </w:pPr>
+            <w:pPr>
+              <w:jc w:val="start"/>
+              <w:spacing w:before="200"/>
+              <w:pStyle w:val="ImageCaption"/>
+            </w:pPr>
+            <w:r>
+              <w:t xml:space="preserve">Figure 3: Mean min–max normalized centroid spectra of the nine assigned Risso’s dolphin click types across 19–50 kHz with variability.</w:t>
+            </w:r>
+          </w:p>
+          <w:bookmarkEnd w:id="44"/>
+        </w:tc>
+      </w:tr>
+    </w:tbl>
+    <w:p>
+      <w:pPr>
+        <w:pStyle w:val="BodyText"/>
+      </w:pPr>
+      <w:r>
+        <w:rPr>
+          <w:b/>
+          <w:bCs/>
+        </w:rPr>
+        <w:t xml:space="preserve">Inserting concatenated spectrograms of the nine CCE clusters</w:t>
+      </w:r>
+    </w:p>
+    <w:p>
+      <w:pPr>
+        <w:pStyle w:val="BodyText"/>
+      </w:pPr>
+      <w:r>
+        <w:t xml:space="preserve">The mean spectra for the nine click types all exhibited the characteristic peak and notch structure of Risso’s dolphin echolocation clicks, but differed in the frequency placement and spacing of these features (</w:t>
+      </w:r>
+      <w:hyperlink w:anchor="fig-click-type-spectra">
+        <w:r>
+          <w:rPr>
+            <w:rStyle w:val="Hyperlink"/>
+          </w:rPr>
+          <w:t xml:space="preserve">Figure 3</w:t>
+        </w:r>
+      </w:hyperlink>
+      <w:r>
+        <w:t xml:space="preserve">)</w:t>
+      </w:r>
+      <w:r>
+        <w:t xml:space="preserve"> </w:t>
+      </w:r>
+      <w:r>
+        <w:rPr>
+          <w:b/>
+          <w:bCs/>
+        </w:rPr>
+        <w:t xml:space="preserve">(concatenated spectrogram figure)</w:t>
+      </w:r>
+      <w:r>
+        <w:t xml:space="preserve">. Across the identified click types, the first peak ranged from 21.4-22.9 kHz, the second peak ranged from 24.4-25.5 kHz, the third peak ranged from 25.5-33.8 kHz, and the fourth peak ranged from 26.6-37.5 kHz. Notch frequencies also varied across click types, with the first notch occurring between 19.5-23.6 kHz, the second between 23.6-27.8 kHz, and the third between 25.9-35.6 kHz. Click type 7 was spectrally distinct as it exhibited a clear six-banded pattern, with six visible peaks at 22.5, 25.5, 29.6, 33.8, 36.8, and 42.4 kHz, separated by pronounced notches. When combined with the observed ICI patterns, these spectral differences support the interpretation of the nine clusters as recurring spectral-temporal click types.</w:t>
+      </w:r>
+    </w:p>
+    <w:bookmarkEnd w:id="45"/>
+    <w:bookmarkStart w:id="50" w:name="X58c62cfa1a7957e30f0e226059323870addb8a1"/>
     <w:p>
       <w:pPr>
         <w:pStyle w:val="Heading2"/>
@@ -1355,9 +1703,99 @@
         <w:pStyle w:val="BodyText"/>
       </w:pPr>
       <w:r>
-        <w:t xml:space="preserve">The most consistently represented click type across the CCE dataset was click type 9. Click type 9 occurred in 47 of 48 events and all 20 retained drifts. It was also the dominant click type in 37 events. In events in which click type 9 was present, it accounted for 3.4-100% of clicks, with a median event-level contribution of 66.0%. In examining drift-level structure, click type 9 was the dominant click type in 17 of 20 drifts, indicating that this click type was common throughout the retained dataset, as opposed to restricted to a small number of events or locations.</w:t>
-      </w:r>
-    </w:p>
+        <w:t xml:space="preserve">The most consistently represented click type across the CCE dataset was click type 9 (</w:t>
+      </w:r>
+      <w:hyperlink w:anchor="fig-event-composition">
+        <w:r>
+          <w:rPr>
+            <w:rStyle w:val="Hyperlink"/>
+          </w:rPr>
+          <w:t xml:space="preserve">Figure 4</w:t>
+        </w:r>
+      </w:hyperlink>
+      <w:r>
+        <w:t xml:space="preserve">). Click type 9 occurred in 47 of 48 events and all 20 retained drifts. It was also the dominant click type in 37 events. In events in which click type 9 was present, it accounted for 3.4-100% of clicks, with a median event-level contribution of 66.0%. In examining drift-level structure, click type 9 was the dominant click type in 17 of 20 drifts, indicating that this click type was common throughout the retained dataset, as opposed to restricted to a small number of events or locations.</w:t>
+      </w:r>
+    </w:p>
+    <w:tbl>
+      <w:tblPr>
+        <w:tblStyle w:val="Table"/>
+        <w:tblW w:type="pct" w:w="5000"/>
+        <w:tblLayout w:type="fixed"/>
+        <w:tblLook w:firstRow="0" w:lastRow="0" w:firstColumn="0" w:lastColumn="0" w:noHBand="0" w:noVBand="0" w:val="0000"/>
+      </w:tblPr>
+      <w:tblGrid>
+        <w:gridCol w:w="7920"/>
+      </w:tblGrid>
+      <w:tr>
+        <w:tc>
+          <w:tcPr/>
+          <w:bookmarkStart w:id="49" w:name="fig-event-composition"/>
+          <w:p>
+            <w:pPr>
+              <w:pStyle w:val="Compact"/>
+              <w:jc w:val="center"/>
+            </w:pPr>
+            <w:r>
+              <w:drawing>
+                <wp:inline>
+                  <wp:extent cx="5334000" cy="4572000"/>
+                  <wp:effectExtent b="0" l="0" r="0" t="0"/>
+                  <wp:docPr descr="" title="" id="47" name="Picture"/>
+                  <a:graphic>
+                    <a:graphicData uri="http://schemas.openxmlformats.org/drawingml/2006/picture">
+                      <pic:pic>
+                        <pic:nvPicPr>
+                          <pic:cNvPr descr="Figures/event_composition_combined.png" id="48" name="Picture"/>
+                          <pic:cNvPicPr>
+                            <a:picLocks noChangeArrowheads="1" noChangeAspect="1"/>
+                          </pic:cNvPicPr>
+                        </pic:nvPicPr>
+                        <pic:blipFill>
+                          <a:blip r:embed="rId46"/>
+                          <a:stretch>
+                            <a:fillRect/>
+                          </a:stretch>
+                        </pic:blipFill>
+                        <pic:spPr bwMode="auto">
+                          <a:xfrm>
+                            <a:off x="0" y="0"/>
+                            <a:ext cx="5334000" cy="4572000"/>
+                          </a:xfrm>
+                          <a:prstGeom prst="rect">
+                            <a:avLst/>
+                          </a:prstGeom>
+                          <a:noFill/>
+                          <a:ln w="9525">
+                            <a:noFill/>
+                            <a:headEnd/>
+                            <a:tailEnd/>
+                          </a:ln>
+                        </pic:spPr>
+                      </pic:pic>
+                    </a:graphicData>
+                  </a:graphic>
+                </wp:inline>
+              </w:drawing>
+            </w:r>
+          </w:p>
+          <w:p>
+            <w:pPr>
+              <w:jc w:val="center"/>
+            </w:pPr>
+            <w:pPr>
+              <w:jc w:val="start"/>
+              <w:spacing w:before="200"/>
+              <w:pStyle w:val="ImageCaption"/>
+            </w:pPr>
+            <w:r>
+              <w:t xml:space="preserve">Figure 4: Event-level composition of the nine assigned Risso’s dolphin click types across the 48 retained acoustic events. Bars show the relative proportion of assigned, non-noise clicks belonging to each click type. The upper panel presents events ordered by longitude, while the lower panel presents events ordered by latitude.</w:t>
+            </w:r>
+          </w:p>
+          <w:bookmarkEnd w:id="49"/>
+        </w:tc>
+      </w:tr>
+    </w:tbl>
     <w:p>
       <w:pPr>
         <w:pStyle w:val="BodyText"/>
@@ -1379,7 +1817,11 @@
         <w:pStyle w:val="BodyText"/>
       </w:pPr>
       <w:r>
-        <w:t xml:space="preserve">Spatially, all retained events ranged from approximately 33.3-45.3°N and 121.4-129.3°W. Survey-level click type prevalence varied, with PASCAL events all dominated by click type 9, CCES events dispalying greatest dominant click type diversity – click types 1, 2, 4, 7, and 9 – and Adrift events dominated exclusively by both click types 7 and 9.</w:t>
+        <w:rPr>
+          <w:b/>
+          <w:bCs/>
+        </w:rPr>
+        <w:t xml:space="preserve">Inserting pie chart map of CCE events.</w:t>
       </w:r>
     </w:p>
     <w:p>
@@ -1387,20 +1829,41 @@
         <w:pStyle w:val="BodyText"/>
       </w:pPr>
       <w:r>
+        <w:t xml:space="preserve">Spatially, all retained events ranged from approximately 33.3-45.3°N and 121.4-129.3°W</w:t>
+      </w:r>
+      <w:r>
+        <w:t xml:space="preserve"> </w:t>
+      </w:r>
+      <w:r>
+        <w:rPr>
+          <w:b/>
+          <w:bCs/>
+        </w:rPr>
+        <w:t xml:space="preserve">(pie chart map)</w:t>
+      </w:r>
+      <w:r>
+        <w:t xml:space="preserve">. Survey-level click type prevalence varied, with PASCAL events all dominated by click type 9, CCES events dispalying greatest dominant click type diversity – click types 1, 2, 4, 7, and 9 – and Adrift events dominated exclusively by both click types 7 and 9.</w:t>
+      </w:r>
+    </w:p>
+    <w:p>
+      <w:pPr>
+        <w:pStyle w:val="BodyText"/>
+      </w:pPr>
+      <w:r>
         <w:t xml:space="preserve">Diel period was also summarized for all retained events, with most events occurring at night, aligning with findings from previous studies of Risso’s dolphins and other melon-headed cetaceans</w:t>
       </w:r>
       <w:r>
         <w:t xml:space="preserve"> </w:t>
       </w:r>
       <w:r>
-        <w:t xml:space="preserve">(Soldevilla, Wiggins, and Hildebrand 2010; Baumann-Pickering et al. 2015)</w:t>
+        <w:t xml:space="preserve">(M. S. Soldevilla, Wiggins, and Hildebrand 2010; Baumann-Pickering et al. 2015)</w:t>
       </w:r>
       <w:r>
         <w:t xml:space="preserve">. Of 48 retained events, 43 occurred during nighttime periods and five occurred during daytime periods. Click type 9 dominated both day and nighttime events.</w:t>
       </w:r>
     </w:p>
-    <w:bookmarkEnd w:id="33"/>
-    <w:bookmarkStart w:id="34" w:name="X825e88265ebdf1416f97ec3174b36dea9a5155c"/>
+    <w:bookmarkEnd w:id="50"/>
+    <w:bookmarkStart w:id="55" w:name="X825e88265ebdf1416f97ec3174b36dea9a5155c"/>
     <w:p>
       <w:pPr>
         <w:pStyle w:val="Heading2"/>
@@ -1420,12 +1883,100 @@
         <w:t xml:space="preserve"> </w:t>
       </w:r>
       <w:r>
-        <w:t xml:space="preserve">Soldevilla et al. (2017)</w:t>
+        <w:t xml:space="preserve">M. S. Soldevilla et al. (2017)</w:t>
       </w:r>
       <w:r>
         <w:t xml:space="preserve">, event-level mean spectra were examined. Across all 48 retained events, the first four spectral peaks occurred at mean frequencies of 22.0 ± 1.4, 25.7 ± 2.5, 30.1 ± 3.0, and 33.6 ± 3.4 kHz, respectively. The first three spectral notches occurred at mean frequencies of 22.9 ± 2.3, 27.1 ± 3.6, and 31.2 ± 4.1 kHz, respectively.</w:t>
       </w:r>
     </w:p>
+    <w:tbl>
+      <w:tblPr>
+        <w:tblStyle w:val="Table"/>
+        <w:tblW w:type="pct" w:w="5000"/>
+        <w:tblLayout w:type="fixed"/>
+        <w:tblLook w:firstRow="0" w:lastRow="0" w:firstColumn="0" w:lastColumn="0" w:noHBand="0" w:noVBand="0" w:val="0000"/>
+      </w:tblPr>
+      <w:tblGrid>
+        <w:gridCol w:w="7920"/>
+      </w:tblGrid>
+      <w:tr>
+        <w:tc>
+          <w:tcPr/>
+          <w:bookmarkStart w:id="54" w:name="fig-regional-peak-notch"/>
+          <w:p>
+            <w:pPr>
+              <w:pStyle w:val="Compact"/>
+              <w:jc w:val="center"/>
+            </w:pPr>
+            <w:r>
+              <w:drawing>
+                <wp:inline>
+                  <wp:extent cx="5334000" cy="1397000"/>
+                  <wp:effectExtent b="0" l="0" r="0" t="0"/>
+                  <wp:docPr descr="" title="" id="52" name="Picture"/>
+                  <a:graphic>
+                    <a:graphicData uri="http://schemas.openxmlformats.org/drawingml/2006/picture">
+                      <pic:pic>
+                        <pic:nvPicPr>
+                          <pic:cNvPr descr="Figures/regional_peak_notch_combined.png" id="53" name="Picture"/>
+                          <pic:cNvPicPr>
+                            <a:picLocks noChangeArrowheads="1" noChangeAspect="1"/>
+                          </pic:cNvPicPr>
+                        </pic:nvPicPr>
+                        <pic:blipFill>
+                          <a:blip r:embed="rId51"/>
+                          <a:stretch>
+                            <a:fillRect/>
+                          </a:stretch>
+                        </pic:blipFill>
+                        <pic:spPr bwMode="auto">
+                          <a:xfrm>
+                            <a:off x="0" y="0"/>
+                            <a:ext cx="5334000" cy="1397000"/>
+                          </a:xfrm>
+                          <a:prstGeom prst="rect">
+                            <a:avLst/>
+                          </a:prstGeom>
+                          <a:noFill/>
+                          <a:ln w="9525">
+                            <a:noFill/>
+                            <a:headEnd/>
+                            <a:tailEnd/>
+                          </a:ln>
+                        </pic:spPr>
+                      </pic:pic>
+                    </a:graphicData>
+                  </a:graphic>
+                </wp:inline>
+              </w:drawing>
+            </w:r>
+          </w:p>
+          <w:p>
+            <w:pPr>
+              <w:jc w:val="center"/>
+            </w:pPr>
+            <w:pPr>
+              <w:jc w:val="start"/>
+              <w:spacing w:before="200"/>
+              <w:pStyle w:val="ImageCaption"/>
+            </w:pPr>
+            <w:r>
+              <w:t xml:space="preserve">Figure 5: Comparison of event-level spectral peak and notch frequencies in the present California Current Ecosystem dataset with regional values reported by</w:t>
+            </w:r>
+            <w:r>
+              <w:t xml:space="preserve"> </w:t>
+            </w:r>
+            <w:r>
+              <w:t xml:space="preserve">M. S. Soldevilla et al. (2017)</w:t>
+            </w:r>
+            <w:r>
+              <w:t xml:space="preserve">. The left panel shows mean frequencies of the first four spectral peaks, and the right panel shows mean frequencies of the first three spectral notches. Points represent regional mean frequencies, and error bars represent associated variation.</w:t>
+            </w:r>
+          </w:p>
+          <w:bookmarkEnd w:id="54"/>
+        </w:tc>
+      </w:tr>
+    </w:tbl>
     <w:p>
       <w:pPr>
         <w:pStyle w:val="BodyText"/>
@@ -1437,10 +1988,21 @@
         <w:t xml:space="preserve"> </w:t>
       </w:r>
       <w:r>
-        <w:t xml:space="preserve">Soldevilla et al. (2017)</w:t>
-      </w:r>
-      <w:r>
-        <w:t xml:space="preserve">, the lower peak and notch positions in the present CCE datatset were broadly similar to published regional summaries. Peaks 1 and 2 fell within the range of previously reported LME regional means, which ranged from 21.8-24.5 kHz for peak 1 and 24.8-27.3 for peak 2. Notch 2 also fit within the previously reported LME regional mean range of 27.0-29.4 kHz. Peak 3 and notch 1 were slightly lover than the previously reported LME regional mean ranges, with Peak 3 averaging 30.1 kHz compared with the published LME regional means of 30.4-33.5 kHz, and Notch 1 averaging 22.9 kHz compared with published LME regional means of 23.4-25.9 kHz.</w:t>
+        <w:t xml:space="preserve">M. S. Soldevilla et al. (2017)</w:t>
+      </w:r>
+      <w:r>
+        <w:t xml:space="preserve">, the lower peak and notch positions in the present CCE dataset were broadly similar to published regional summaries (</w:t>
+      </w:r>
+      <w:hyperlink w:anchor="fig-regional-peak-notch">
+        <w:r>
+          <w:rPr>
+            <w:rStyle w:val="Hyperlink"/>
+          </w:rPr>
+          <w:t xml:space="preserve">Figure 5</w:t>
+        </w:r>
+      </w:hyperlink>
+      <w:r>
+        <w:t xml:space="preserve">). Peaks 1 and 2 fell within the range of previously reported LME regional means, which ranged from 21.8-24.5 kHz for peak 1 and 24.8-27.3 for peak 2. Notch 2 also fit within the previously reported LME regional mean range of 27.0-29.4 kHz. Peak 3 and notch 1 were slightly lover than the previously reported LME regional mean ranges, with Peak 3 averaging 30.1 kHz compared with the published LME regional means of 30.4-33.5 kHz, and Notch 1 averaging 22.9 kHz compared with published LME regional means of 23.4-25.9 kHz.</w:t>
       </w:r>
     </w:p>
     <w:p>
@@ -1454,13 +2016,24 @@
         <w:t xml:space="preserve"> </w:t>
       </w:r>
       <w:r>
-        <w:t xml:space="preserve">Soldevilla et al. (2017)</w:t>
-      </w:r>
-      <w:r>
-        <w:t xml:space="preserve"> </w:t>
-      </w:r>
-      <w:r>
-        <w:t xml:space="preserve">occurred in the higher-frequency spectral features. In the present dataset, peak 4 averaged 33.6 ± 3.4 kHz, lower than all previously reported means for peak 4, which ranged from 36.0-39.3 kHz. Similarly, notch 3 averaged 31.2 ± 4.1 kHz, lower than documented LME regional means for notch 3, which ranged from 32.5-36.2 kHz.</w:t>
+        <w:t xml:space="preserve">M. S. Soldevilla et al. (2017)</w:t>
+      </w:r>
+      <w:r>
+        <w:t xml:space="preserve"> </w:t>
+      </w:r>
+      <w:r>
+        <w:t xml:space="preserve">occurred in the higher-frequency spectral features (</w:t>
+      </w:r>
+      <w:hyperlink w:anchor="fig-regional-peak-notch">
+        <w:r>
+          <w:rPr>
+            <w:rStyle w:val="Hyperlink"/>
+          </w:rPr>
+          <w:t xml:space="preserve">Figure 5</w:t>
+        </w:r>
+      </w:hyperlink>
+      <w:r>
+        <w:t xml:space="preserve">). In the present dataset, peak 4 averaged 33.6 ± 3.4 kHz, lower than all previously reported means for peak 4, which ranged from 36.0-39.3 kHz. Similarly, notch 3 averaged 31.2 ± 4.1 kHz, lower than documented LME regional means for notch 3, which ranged from 32.5-36.2 kHz.</w:t>
       </w:r>
     </w:p>
     <w:p>
@@ -1474,17 +2047,17 @@
         <w:t xml:space="preserve"> </w:t>
       </w:r>
       <w:r>
-        <w:t xml:space="preserve">Soldevilla et al. (2017)</w:t>
-      </w:r>
-      <w:r>
-        <w:t xml:space="preserve"> </w:t>
-      </w:r>
-      <w:r>
-        <w:t xml:space="preserve">showed that the present CCE datatset was more similar to the previously described California Current (CC) region than to the Pelagic Pacific (PPac) region, but differed from both in the higher frequency features. With reference to the CC region, the first two peak and notches in the present CCE dataset were relatively similar; Peak 1 differed by 0.2 kHz, Peak 2 by 0.9 kHz, notch 1 differed by 0.5 kHz, and notch 2 differed by 0.1 kHz. However, peaks 3 and 4, as well as notch 3, were lower in the CCE datatset by 1.1, 4.3, and 3.3 kHz respectively. In comparing the PPac region, all peak and notch frequencies in the current dataset occurred at lower mean frequencies. Differences in peak frequencies ranged from 0.9-2.4 kHz, with the largest difference occurring at peak 4. Notch frequency differences ranged from 1.6-2.5 kHz. From this comparison, it can be inferred that the retained CCE events from the current study displayed lower-frequency banding than events observed in the PPac region and shared more similarity with the CC, while still exhibiting lower high-frequency spectral feature frequencies than both US Pacific / West Coast regions.</w:t>
-      </w:r>
-    </w:p>
-    <w:bookmarkEnd w:id="34"/>
-    <w:bookmarkStart w:id="35" w:name="X747556305aa4195cc9f6f4231d92ae904b12eba"/>
+        <w:t xml:space="preserve">M. S. Soldevilla et al. (2017)</w:t>
+      </w:r>
+      <w:r>
+        <w:t xml:space="preserve"> </w:t>
+      </w:r>
+      <w:r>
+        <w:t xml:space="preserve">showed that the present CCE dataset was more similar to the previously described California Current (CC) region than to the Pelagic Pacific (PPac) region, but differed from both in the higher frequency features. With reference to the CC region, the first two peak and notches in the present CCE dataset were relatively similar; Peak 1 differed by 0.2 kHz, Peak 2 by 0.9 kHz, notch 1 differed by 0.5 kHz, and notch 2 differed by 0.1 kHz. However, peaks 3 and 4, as well as notch 3, were lower in the CCE dataset by 1.1, 4.3, and 3.3 kHz respectively. In comparing the PPac region, all peak and notch frequencies in the current dataset occurred at lower mean frequencies. Differences in peak frequencies ranged from 0.9-2.4 kHz, with the largest difference occurring at peak 4. Notch frequency differences ranged from 1.6-2.5 kHz. From this comparison, it can be inferred that the retained CCE events from the current study displayed lower-frequency banding than events observed in the PPac region and shared more similarity with the CC, while still exhibiting lower high-frequency spectral feature frequencies than both US Pacific / West Coast regions.</w:t>
+      </w:r>
+    </w:p>
+    <w:bookmarkEnd w:id="55"/>
+    <w:bookmarkStart w:id="56" w:name="X747556305aa4195cc9f6f4231d92ae904b12eba"/>
     <w:p>
       <w:pPr>
         <w:pStyle w:val="Heading2"/>
@@ -1504,7 +2077,7 @@
         <w:t xml:space="preserve"> </w:t>
       </w:r>
       <w:r>
-        <w:t xml:space="preserve">Soldevilla et al. (2017)</w:t>
+        <w:t xml:space="preserve">M. S. Soldevilla et al. (2017)</w:t>
       </w:r>
       <w:r>
         <w:t xml:space="preserve">. This comparison worked to evaluate whether recurring CCE click types identified through the present spectral-temporal clustering workflow correlated to previously identified Risso’s click types. Two click types from the CCE showed especially strong similarity; CCE click type 9 most closely resembled</w:t>
@@ -1513,7 +2086,7 @@
         <w:t xml:space="preserve"> </w:t>
       </w:r>
       <w:r>
-        <w:t xml:space="preserve">Soldevilla et al. (2017)</w:t>
+        <w:t xml:space="preserve">M. S. Soldevilla et al. (2017)</w:t>
       </w:r>
       <w:r>
         <w:t xml:space="preserve"> </w:t>
@@ -1525,13 +2098,26 @@
         <w:t xml:space="preserve"> </w:t>
       </w:r>
       <w:r>
-        <w:t xml:space="preserve">Soldevilla et al. (2017)</w:t>
-      </w:r>
-      <w:r>
-        <w:t xml:space="preserve"> </w:t>
-      </w:r>
-      <w:r>
-        <w:t xml:space="preserve">click type 4.</w:t>
+        <w:t xml:space="preserve">M. S. Soldevilla et al. (2017)</w:t>
+      </w:r>
+      <w:r>
+        <w:t xml:space="preserve"> </w:t>
+      </w:r>
+      <w:r>
+        <w:t xml:space="preserve">click type 4</w:t>
+      </w:r>
+      <w:r>
+        <w:t xml:space="preserve"> </w:t>
+      </w:r>
+      <w:r>
+        <w:rPr>
+          <w:b/>
+          <w:bCs/>
+        </w:rPr>
+        <w:t xml:space="preserve">(overlayed centroid spectra figure)</w:t>
+      </w:r>
+      <w:r>
+        <w:t xml:space="preserve">.</w:t>
       </w:r>
     </w:p>
     <w:p>
@@ -1539,13 +2125,25 @@
         <w:pStyle w:val="BodyText"/>
       </w:pPr>
       <w:r>
+        <w:rPr>
+          <w:b/>
+          <w:bCs/>
+        </w:rPr>
+        <w:t xml:space="preserve">Inserting two-frame overlayed CCE cluster centroid spectra + Soldevilla cluster centroid spectra visual and caption</w:t>
+      </w:r>
+    </w:p>
+    <w:p>
+      <w:pPr>
+        <w:pStyle w:val="BodyText"/>
+      </w:pPr>
+      <w:r>
         <w:t xml:space="preserve">In comparing the CCE click type 9 and</w:t>
       </w:r>
       <w:r>
         <w:t xml:space="preserve"> </w:t>
       </w:r>
       <w:r>
-        <w:t xml:space="preserve">Soldevilla et al. (2017)</w:t>
+        <w:t xml:space="preserve">M. S. Soldevilla et al. (2017)</w:t>
       </w:r>
       <w:r>
         <w:t xml:space="preserve"> </w:t>
@@ -1557,7 +2155,7 @@
         <w:t xml:space="preserve"> </w:t>
       </w:r>
       <w:r>
-        <w:t xml:space="preserve">Soldevilla et al. (2017)</w:t>
+        <w:t xml:space="preserve">M. S. Soldevilla et al. (2017)</w:t>
       </w:r>
       <w:r>
         <w:t xml:space="preserve"> </w:t>
@@ -1569,7 +2167,7 @@
         <w:t xml:space="preserve"> </w:t>
       </w:r>
       <w:r>
-        <w:t xml:space="preserve">Soldevilla et al. (2017)</w:t>
+        <w:t xml:space="preserve">M. S. Soldevilla et al. (2017)</w:t>
       </w:r>
       <w:r>
         <w:t xml:space="preserve"> </w:t>
@@ -1589,7 +2187,7 @@
         <w:t xml:space="preserve"> </w:t>
       </w:r>
       <w:r>
-        <w:t xml:space="preserve">Soldevilla et al. (2017)</w:t>
+        <w:t xml:space="preserve">M. S. Soldevilla et al. (2017)</w:t>
       </w:r>
       <w:r>
         <w:t xml:space="preserve"> </w:t>
@@ -1601,7 +2199,7 @@
         <w:t xml:space="preserve"> </w:t>
       </w:r>
       <w:r>
-        <w:t xml:space="preserve">Soldevilla et al. (2017)</w:t>
+        <w:t xml:space="preserve">M. S. Soldevilla et al. (2017)</w:t>
       </w:r>
       <w:r>
         <w:t xml:space="preserve"> </w:t>
@@ -1613,7 +2211,7 @@
         <w:t xml:space="preserve"> </w:t>
       </w:r>
       <w:r>
-        <w:t xml:space="preserve">Soldevilla et al. (2017)</w:t>
+        <w:t xml:space="preserve">M. S. Soldevilla et al. (2017)</w:t>
       </w:r>
       <w:r>
         <w:t xml:space="preserve"> </w:t>
@@ -1633,7 +2231,7 @@
         <w:t xml:space="preserve"> </w:t>
       </w:r>
       <w:r>
-        <w:t xml:space="preserve">Soldevilla et al. (2017)</w:t>
+        <w:t xml:space="preserve">M. S. Soldevilla et al. (2017)</w:t>
       </w:r>
       <w:r>
         <w:t xml:space="preserve"> </w:t>
@@ -1645,7 +2243,7 @@
         <w:t xml:space="preserve"> </w:t>
       </w:r>
       <w:r>
-        <w:t xml:space="preserve">Soldevilla et al. (2017)</w:t>
+        <w:t xml:space="preserve">M. S. Soldevilla et al. (2017)</w:t>
       </w:r>
       <w:r>
         <w:t xml:space="preserve"> </w:t>
@@ -1654,9 +2252,9 @@
         <w:t xml:space="preserve">click types shared the expected spectral banding structure, but frequency values of spectral features in other click types differed in placement, spacing, or relative prominence. These results reveal that the CCE dataset included click types correlating to previously described click types in the CC and PPac, while also containing additional spectral-temporal variation not fully captured by simple correspondence with previously described studies.</w:t>
       </w:r>
     </w:p>
-    <w:bookmarkEnd w:id="35"/>
-    <w:bookmarkEnd w:id="36"/>
-    <w:bookmarkStart w:id="37" w:name="iv.-discussion"/>
+    <w:bookmarkEnd w:id="56"/>
+    <w:bookmarkEnd w:id="57"/>
+    <w:bookmarkStart w:id="59" w:name="iv.-discussion"/>
     <w:p>
       <w:pPr>
         <w:pStyle w:val="Heading1"/>
@@ -1665,16 +2263,89 @@
         <w:t xml:space="preserve">IV. Discussion</w:t>
       </w:r>
     </w:p>
+    <w:bookmarkStart w:id="58" w:name="X9d390d32ecc036e0781186c13dfaa8b317b2a1c"/>
+    <w:p>
+      <w:pPr>
+        <w:pStyle w:val="Heading2"/>
+      </w:pPr>
+      <w:r>
+        <w:t xml:space="preserve">A. Principal Findings and Study Contribution</w:t>
+      </w:r>
+    </w:p>
     <w:p>
       <w:pPr>
         <w:pStyle w:val="FirstParagraph"/>
       </w:pPr>
       <w:r>
-        <w:t xml:space="preserve">Soldevilla et al. 2017 used the following sections: Species Identification, Geographic Variation, Within-encounter variability, Geographical variation and seasonal movements, Automated extraction and classification)</w:t>
-      </w:r>
-    </w:p>
-    <w:bookmarkEnd w:id="37"/>
-    <w:bookmarkStart w:id="38" w:name="v.-conclusions"/>
+        <w:t xml:space="preserve">This study acts as the first broad characterization of geographic and spectral-temporal variation in Risso’s dolphin echolocation clicks across the CCE, extending prior research focused primarily on the Southern California Bight and other distinct geographic regions</w:t>
+      </w:r>
+      <w:r>
+        <w:t xml:space="preserve"> </w:t>
+      </w:r>
+      <w:r>
+        <w:t xml:space="preserve">(M. S. Soldevilla et al. 2017)</w:t>
+      </w:r>
+      <w:r>
+        <w:t xml:space="preserve">. Throughout the retained dataset, the characteristic Risso’s spectral banding pattern was evident, supporting the continued value of this feature for species identification in PAM</w:t>
+      </w:r>
+      <w:r>
+        <w:t xml:space="preserve"> </w:t>
+      </w:r>
+      <w:r>
+        <w:t xml:space="preserve">(M. Soldevilla et al. 2011)</w:t>
+      </w:r>
+      <w:r>
+        <w:t xml:space="preserve">. However, the results of this study showed that Risso’s clicks within the CCE were not confined to a single uniform spectral pattern, but instead composed of nine recurring click types differing in both spectral structure and ICI as determined by the combined PCA, UMAP, and HDBSCAN workflow.</w:t>
+      </w:r>
+    </w:p>
+    <w:p>
+      <w:pPr>
+        <w:pStyle w:val="BodyText"/>
+      </w:pPr>
+      <w:r>
+        <w:t xml:space="preserve">The spatial distribution of the nine identified click types revealed both widely shared and more geographically structured patterns. Click type 9 – the most prevalent click type – was found across nearly all retained events and every sampled drift, suggesting the presence of a widespred spectral-temporal form throughout the CCE. This finding was further supported as click type 9’s spectral peak and notch structure also closely resembled click type 1 identified by</w:t>
+      </w:r>
+      <w:r>
+        <w:t xml:space="preserve"> </w:t>
+      </w:r>
+      <w:r>
+        <w:t xml:space="preserve">M. S. Soldevilla et al. (2017)</w:t>
+      </w:r>
+      <w:r>
+        <w:t xml:space="preserve">, one of the low-frequency click types within the group of click types that described encounters in the Southern California Bight. Other click types were identified less frequently of occurred in more localized patterns of dominance. In particular, click type 7 – the second most prevalent click type – exhibited a clear and persistent six-banded spectral pattern present in both concatenated spectrograms and LTSAs. This pattern was not only defined by the detection of more than four spectral peaks, but instead by the consistent presence of six distinct bands which made it visually notable within the dataset.</w:t>
+      </w:r>
+    </w:p>
+    <w:p>
+      <w:pPr>
+        <w:pStyle w:val="BodyText"/>
+      </w:pPr>
+      <w:r>
+        <w:t xml:space="preserve">Comparison of this study’s click types and regional spectral characteristics with those identified by</w:t>
+      </w:r>
+      <w:r>
+        <w:t xml:space="preserve"> </w:t>
+      </w:r>
+      <w:r>
+        <w:t xml:space="preserve">M. S. Soldevilla et al. (2017)</w:t>
+      </w:r>
+      <w:r>
+        <w:t xml:space="preserve"> </w:t>
+      </w:r>
+      <w:r>
+        <w:t xml:space="preserve">offered evidence of both continuity and additional variation within the CCE. CCE click types 9 and 6 parallel two previously described click types, indicating continuity in the spectral structures identified in the present spectral-temporal workflow and those identified through an independent dataset and clustering methodology. At the regional level, the 48 retained CCE events were overall more similar to the previously described CC region than to the PPac region, although the higher frequency peaks and notched were, on average, lower frequency than those reported for either region. Additional CCE click types did not have a clear one-to-one match with a previously described click type which suggests that spectra-temporal variation across the greater CCE is not fully represented by existing regional characterizations.</w:t>
+      </w:r>
+    </w:p>
+    <w:p>
+      <w:pPr>
+        <w:pStyle w:val="BodyText"/>
+      </w:pPr>
+      <w:r>
+        <w:t xml:space="preserve">Collectively, these findings expand the current understanding of acoustic diversity of Risso’s dolphin echolocation clicks within the CCE and establish a baseline for evaluation of whether recurring click types display persistent geographic or temporal structure. The identified patterns cannot yet be interpreted as direct evidence of population differentiation due to the possible influence of factors such as animal behavior, morphology, prey, individual variation, sound attenuation, and recording orientation. Instead, these results demonstrate recurring and potentiallly geographically valuable acoustic variation occurs within the broadly managed CA-OR-WA Risso’s stock, providing a foundation for investigation into biological and management significance.</w:t>
+      </w:r>
+    </w:p>
+    <w:bookmarkEnd w:id="58"/>
+    <w:bookmarkEnd w:id="59"/>
+    <w:bookmarkStart w:id="132" w:name="v.-conclusions"/>
     <w:p>
       <w:pPr>
         <w:pStyle w:val="Heading1"/>
@@ -1683,15 +2354,8 @@
         <w:t xml:space="preserve">V. Conclusions</w:t>
       </w:r>
     </w:p>
-    <w:bookmarkEnd w:id="38"/>
-    <w:bookmarkStart w:id="109" w:name="section"/>
-    <w:p>
-      <w:pPr>
-        <w:pStyle w:val="Heading1"/>
-      </w:pPr>
-    </w:p>
-    <w:bookmarkStart w:id="108" w:name="refs"/>
-    <w:bookmarkStart w:id="40" w:name="ref-alexander2025"/>
+    <w:bookmarkStart w:id="131" w:name="refs"/>
+    <w:bookmarkStart w:id="61" w:name="ref-alexander2025"/>
     <w:p>
       <w:pPr>
         <w:pStyle w:val="Bibliography"/>
@@ -1708,7 +2372,7 @@
       <w:r>
         <w:t xml:space="preserve"> </w:t>
       </w:r>
-      <w:hyperlink r:id="rId39">
+      <w:hyperlink r:id="rId60">
         <w:r>
           <w:rPr>
             <w:rStyle w:val="Hyperlink"/>
@@ -1720,8 +2384,8 @@
         <w:t xml:space="preserve">.</w:t>
       </w:r>
     </w:p>
-    <w:bookmarkEnd w:id="40"/>
-    <w:bookmarkStart w:id="42" w:name="ref-andrews2015"/>
+    <w:bookmarkEnd w:id="61"/>
+    <w:bookmarkStart w:id="63" w:name="ref-andrews2015"/>
     <w:p>
       <w:pPr>
         <w:pStyle w:val="Bibliography"/>
@@ -1754,7 +2418,7 @@
       <w:r>
         <w:t xml:space="preserve"> </w:t>
       </w:r>
-      <w:hyperlink r:id="rId41">
+      <w:hyperlink r:id="rId62">
         <w:r>
           <w:rPr>
             <w:rStyle w:val="Hyperlink"/>
@@ -1766,8 +2430,8 @@
         <w:t xml:space="preserve">.</w:t>
       </w:r>
     </w:p>
-    <w:bookmarkEnd w:id="42"/>
-    <w:bookmarkStart w:id="44" w:name="ref-baird2009"/>
+    <w:bookmarkEnd w:id="63"/>
+    <w:bookmarkStart w:id="65" w:name="ref-baird2009"/>
     <w:p>
       <w:pPr>
         <w:pStyle w:val="Bibliography"/>
@@ -1790,7 +2454,7 @@
       <w:r>
         <w:t xml:space="preserve"> </w:t>
       </w:r>
-      <w:hyperlink r:id="rId43">
+      <w:hyperlink r:id="rId64">
         <w:r>
           <w:rPr>
             <w:rStyle w:val="Hyperlink"/>
@@ -1802,8 +2466,8 @@
         <w:t xml:space="preserve">.</w:t>
       </w:r>
     </w:p>
-    <w:bookmarkEnd w:id="44"/>
-    <w:bookmarkStart w:id="45" w:name="ref-barlow2007"/>
+    <w:bookmarkEnd w:id="65"/>
+    <w:bookmarkStart w:id="66" w:name="ref-barlow2007"/>
     <w:p>
       <w:pPr>
         <w:pStyle w:val="Bibliography"/>
@@ -1855,8 +2519,8 @@
         <w:t xml:space="preserve">105 (October).</w:t>
       </w:r>
     </w:p>
-    <w:bookmarkEnd w:id="45"/>
-    <w:bookmarkStart w:id="47" w:name="ref-baumann-pickering2015"/>
+    <w:bookmarkEnd w:id="66"/>
+    <w:bookmarkStart w:id="68" w:name="ref-baumann-pickering2015"/>
     <w:p>
       <w:pPr>
         <w:pStyle w:val="Bibliography"/>
@@ -1889,7 +2553,7 @@
       <w:r>
         <w:t xml:space="preserve"> </w:t>
       </w:r>
-      <w:hyperlink r:id="rId46">
+      <w:hyperlink r:id="rId67">
         <w:r>
           <w:rPr>
             <w:rStyle w:val="Hyperlink"/>
@@ -1901,8 +2565,8 @@
         <w:t xml:space="preserve">.</w:t>
       </w:r>
     </w:p>
-    <w:bookmarkEnd w:id="47"/>
-    <w:bookmarkStart w:id="49" w:name="ref-best2023"/>
+    <w:bookmarkEnd w:id="68"/>
+    <w:bookmarkStart w:id="70" w:name="ref-best2023"/>
     <w:p>
       <w:pPr>
         <w:pStyle w:val="Bibliography"/>
@@ -1935,7 +2599,7 @@
       <w:r>
         <w:t xml:space="preserve"> </w:t>
       </w:r>
-      <w:hyperlink r:id="rId48">
+      <w:hyperlink r:id="rId69">
         <w:r>
           <w:rPr>
             <w:rStyle w:val="Hyperlink"/>
@@ -1947,8 +2611,8 @@
         <w:t xml:space="preserve">.</w:t>
       </w:r>
     </w:p>
-    <w:bookmarkEnd w:id="49"/>
-    <w:bookmarkStart w:id="51" w:name="ref-borchers2011"/>
+    <w:bookmarkEnd w:id="70"/>
+    <w:bookmarkStart w:id="72" w:name="ref-borchers2011"/>
     <w:p>
       <w:pPr>
         <w:pStyle w:val="Bibliography"/>
@@ -1972,7 +2636,7 @@
       <w:r>
         <w:t xml:space="preserve"> </w:t>
       </w:r>
-      <w:hyperlink r:id="rId50">
+      <w:hyperlink r:id="rId71">
         <w:r>
           <w:rPr>
             <w:rStyle w:val="Hyperlink"/>
@@ -1984,8 +2648,8 @@
         <w:t xml:space="preserve">.</w:t>
       </w:r>
     </w:p>
-    <w:bookmarkEnd w:id="51"/>
-    <w:bookmarkStart w:id="53" w:name="ref-carretta2024"/>
+    <w:bookmarkEnd w:id="72"/>
+    <w:bookmarkStart w:id="74" w:name="ref-carretta2024"/>
     <w:p>
       <w:pPr>
         <w:pStyle w:val="Bibliography"/>
@@ -2002,7 +2666,7 @@
       <w:r>
         <w:t xml:space="preserve"> </w:t>
       </w:r>
-      <w:hyperlink r:id="rId52">
+      <w:hyperlink r:id="rId73">
         <w:r>
           <w:rPr>
             <w:rStyle w:val="Hyperlink"/>
@@ -2014,8 +2678,8 @@
         <w:t xml:space="preserve">.</w:t>
       </w:r>
     </w:p>
-    <w:bookmarkEnd w:id="53"/>
-    <w:bookmarkStart w:id="55" w:name="ref-cranford1996"/>
+    <w:bookmarkEnd w:id="74"/>
+    <w:bookmarkStart w:id="76" w:name="ref-cranford1996"/>
     <w:p>
       <w:pPr>
         <w:pStyle w:val="Bibliography"/>
@@ -2048,7 +2712,7 @@
       <w:r>
         <w:t xml:space="preserve"> </w:t>
       </w:r>
-      <w:hyperlink r:id="rId54">
+      <w:hyperlink r:id="rId75">
         <w:r>
           <w:rPr>
             <w:rStyle w:val="Hyperlink"/>
@@ -2060,8 +2724,8 @@
         <w:t xml:space="preserve">.</w:t>
       </w:r>
     </w:p>
-    <w:bookmarkEnd w:id="55"/>
-    <w:bookmarkStart w:id="57" w:name="ref-forney1998"/>
+    <w:bookmarkEnd w:id="76"/>
+    <w:bookmarkStart w:id="78" w:name="ref-forney1998"/>
     <w:p>
       <w:pPr>
         <w:pStyle w:val="Bibliography"/>
@@ -2097,7 +2761,7 @@
       <w:r>
         <w:t xml:space="preserve"> </w:t>
       </w:r>
-      <w:hyperlink r:id="rId56">
+      <w:hyperlink r:id="rId77">
         <w:r>
           <w:rPr>
             <w:rStyle w:val="Hyperlink"/>
@@ -2109,8 +2773,8 @@
         <w:t xml:space="preserve">.</w:t>
       </w:r>
     </w:p>
-    <w:bookmarkEnd w:id="57"/>
-    <w:bookmarkStart w:id="59" w:name="ref-frasier2024"/>
+    <w:bookmarkEnd w:id="78"/>
+    <w:bookmarkStart w:id="80" w:name="ref-frasier2024"/>
     <w:p>
       <w:pPr>
         <w:pStyle w:val="Bibliography"/>
@@ -2134,7 +2798,7 @@
       <w:r>
         <w:t xml:space="preserve"> </w:t>
       </w:r>
-      <w:hyperlink r:id="rId58">
+      <w:hyperlink r:id="rId79">
         <w:r>
           <w:rPr>
             <w:rStyle w:val="Hyperlink"/>
@@ -2146,8 +2810,8 @@
         <w:t xml:space="preserve">.</w:t>
       </w:r>
     </w:p>
-    <w:bookmarkEnd w:id="59"/>
-    <w:bookmarkStart w:id="61" w:name="ref-gillespie2008"/>
+    <w:bookmarkEnd w:id="80"/>
+    <w:bookmarkStart w:id="82" w:name="ref-gillespie2008"/>
     <w:p>
       <w:pPr>
         <w:pStyle w:val="Bibliography"/>
@@ -2170,7 +2834,7 @@
       <w:r>
         <w:t xml:space="preserve"> </w:t>
       </w:r>
-      <w:hyperlink r:id="rId60">
+      <w:hyperlink r:id="rId81">
         <w:r>
           <w:rPr>
             <w:rStyle w:val="Hyperlink"/>
@@ -2182,8 +2846,8 @@
         <w:t xml:space="preserve">.</w:t>
       </w:r>
     </w:p>
-    <w:bookmarkEnd w:id="61"/>
-    <w:bookmarkStart w:id="63" w:name="ref-gillespie2019"/>
+    <w:bookmarkEnd w:id="82"/>
+    <w:bookmarkStart w:id="84" w:name="ref-gillespie2019"/>
     <w:p>
       <w:pPr>
         <w:pStyle w:val="Bibliography"/>
@@ -2216,7 +2880,7 @@
       <w:r>
         <w:t xml:space="preserve"> </w:t>
       </w:r>
-      <w:hyperlink r:id="rId62">
+      <w:hyperlink r:id="rId83">
         <w:r>
           <w:rPr>
             <w:rStyle w:val="Hyperlink"/>
@@ -2228,8 +2892,8 @@
         <w:t xml:space="preserve">.</w:t>
       </w:r>
     </w:p>
-    <w:bookmarkEnd w:id="63"/>
-    <w:bookmarkStart w:id="65" w:name="ref-grech2011"/>
+    <w:bookmarkEnd w:id="84"/>
+    <w:bookmarkStart w:id="86" w:name="ref-grech2011"/>
     <w:p>
       <w:pPr>
         <w:pStyle w:val="Bibliography"/>
@@ -2262,7 +2926,7 @@
       <w:r>
         <w:t xml:space="preserve"> </w:t>
       </w:r>
-      <w:hyperlink r:id="rId64">
+      <w:hyperlink r:id="rId85">
         <w:r>
           <w:rPr>
             <w:rStyle w:val="Hyperlink"/>
@@ -2274,8 +2938,8 @@
         <w:t xml:space="preserve">.</w:t>
       </w:r>
     </w:p>
-    <w:bookmarkEnd w:id="65"/>
-    <w:bookmarkStart w:id="67" w:name="ref-jefferson2017"/>
+    <w:bookmarkEnd w:id="86"/>
+    <w:bookmarkStart w:id="88" w:name="ref-jefferson2017"/>
     <w:p>
       <w:pPr>
         <w:pStyle w:val="Bibliography"/>
@@ -2298,7 +2962,7 @@
       <w:r>
         <w:t xml:space="preserve"> </w:t>
       </w:r>
-      <w:hyperlink r:id="rId66">
+      <w:hyperlink r:id="rId87">
         <w:r>
           <w:rPr>
             <w:rStyle w:val="Hyperlink"/>
@@ -2310,8 +2974,8 @@
         <w:t xml:space="preserve">.</w:t>
       </w:r>
     </w:p>
-    <w:bookmarkEnd w:id="67"/>
-    <w:bookmarkStart w:id="69" w:name="ref-jolliffe2002"/>
+    <w:bookmarkEnd w:id="88"/>
+    <w:bookmarkStart w:id="90" w:name="ref-jolliffe2002"/>
     <w:p>
       <w:pPr>
         <w:pStyle w:val="Bibliography"/>
@@ -2335,7 +2999,7 @@
       <w:r>
         <w:t xml:space="preserve"> </w:t>
       </w:r>
-      <w:hyperlink r:id="rId68">
+      <w:hyperlink r:id="rId89">
         <w:r>
           <w:rPr>
             <w:rStyle w:val="Hyperlink"/>
@@ -2347,8 +3011,8 @@
         <w:t xml:space="preserve">.</w:t>
       </w:r>
     </w:p>
-    <w:bookmarkEnd w:id="69"/>
-    <w:bookmarkStart w:id="71" w:name="ref-keating2018"/>
+    <w:bookmarkEnd w:id="90"/>
+    <w:bookmarkStart w:id="92" w:name="ref-keating2018"/>
     <w:p>
       <w:pPr>
         <w:pStyle w:val="Bibliography"/>
@@ -2371,7 +3035,7 @@
       <w:r>
         <w:t xml:space="preserve"> </w:t>
       </w:r>
-      <w:hyperlink r:id="rId70">
+      <w:hyperlink r:id="rId91">
         <w:r>
           <w:rPr>
             <w:rStyle w:val="Hyperlink"/>
@@ -2383,8 +3047,8 @@
         <w:t xml:space="preserve">.</w:t>
       </w:r>
     </w:p>
-    <w:bookmarkEnd w:id="71"/>
-    <w:bookmarkStart w:id="73" w:name="ref-madsen2004"/>
+    <w:bookmarkEnd w:id="92"/>
+    <w:bookmarkStart w:id="94" w:name="ref-madsen2004"/>
     <w:p>
       <w:pPr>
         <w:pStyle w:val="Bibliography"/>
@@ -2417,7 +3081,7 @@
       <w:r>
         <w:t xml:space="preserve"> </w:t>
       </w:r>
-      <w:hyperlink r:id="rId72">
+      <w:hyperlink r:id="rId93">
         <w:r>
           <w:rPr>
             <w:rStyle w:val="Hyperlink"/>
@@ -2429,8 +3093,8 @@
         <w:t xml:space="preserve">.</w:t>
       </w:r>
     </w:p>
-    <w:bookmarkEnd w:id="73"/>
-    <w:bookmarkStart w:id="75" w:name="ref-martien2019"/>
+    <w:bookmarkEnd w:id="94"/>
+    <w:bookmarkStart w:id="96" w:name="ref-martien2019"/>
     <w:p>
       <w:pPr>
         <w:pStyle w:val="Bibliography"/>
@@ -2453,7 +3117,7 @@
       <w:r>
         <w:t xml:space="preserve"> </w:t>
       </w:r>
-      <w:hyperlink r:id="rId74">
+      <w:hyperlink r:id="rId95">
         <w:r>
           <w:rPr>
             <w:rStyle w:val="Hyperlink"/>
@@ -2465,8 +3129,8 @@
         <w:t xml:space="preserve">.</w:t>
       </w:r>
     </w:p>
-    <w:bookmarkEnd w:id="75"/>
-    <w:bookmarkStart w:id="77" w:name="ref-mcclatchie2025"/>
+    <w:bookmarkEnd w:id="96"/>
+    <w:bookmarkStart w:id="98" w:name="ref-mcclatchie2025"/>
     <w:p>
       <w:pPr>
         <w:pStyle w:val="Bibliography"/>
@@ -2490,7 +3154,7 @@
       <w:r>
         <w:t xml:space="preserve"> </w:t>
       </w:r>
-      <w:hyperlink r:id="rId76">
+      <w:hyperlink r:id="rId97">
         <w:r>
           <w:rPr>
             <w:rStyle w:val="Hyperlink"/>
@@ -2502,8 +3166,8 @@
         <w:t xml:space="preserve">.</w:t>
       </w:r>
     </w:p>
-    <w:bookmarkEnd w:id="77"/>
-    <w:bookmarkStart w:id="79" w:name="ref-mcinnes2017"/>
+    <w:bookmarkEnd w:id="98"/>
+    <w:bookmarkStart w:id="100" w:name="ref-mcinnes2017"/>
     <w:p>
       <w:pPr>
         <w:pStyle w:val="Bibliography"/>
@@ -2536,7 +3200,7 @@
       <w:r>
         <w:t xml:space="preserve"> </w:t>
       </w:r>
-      <w:hyperlink r:id="rId78">
+      <w:hyperlink r:id="rId99">
         <w:r>
           <w:rPr>
             <w:rStyle w:val="Hyperlink"/>
@@ -2548,8 +3212,8 @@
         <w:t xml:space="preserve">.</w:t>
       </w:r>
     </w:p>
-    <w:bookmarkEnd w:id="79"/>
-    <w:bookmarkStart w:id="81" w:name="ref-mcinnes2020"/>
+    <w:bookmarkEnd w:id="100"/>
+    <w:bookmarkStart w:id="102" w:name="ref-mcinnes2020"/>
     <w:p>
       <w:pPr>
         <w:pStyle w:val="Bibliography"/>
@@ -2566,7 +3230,7 @@
       <w:r>
         <w:t xml:space="preserve"> </w:t>
       </w:r>
-      <w:hyperlink r:id="rId80">
+      <w:hyperlink r:id="rId101">
         <w:r>
           <w:rPr>
             <w:rStyle w:val="Hyperlink"/>
@@ -2578,8 +3242,8 @@
         <w:t xml:space="preserve">.</w:t>
       </w:r>
     </w:p>
-    <w:bookmarkEnd w:id="81"/>
-    <w:bookmarkStart w:id="83" w:name="ref-mckenna2012"/>
+    <w:bookmarkEnd w:id="102"/>
+    <w:bookmarkStart w:id="104" w:name="ref-mckenna2012"/>
     <w:p>
       <w:pPr>
         <w:pStyle w:val="Bibliography"/>
@@ -2612,7 +3276,7 @@
       <w:r>
         <w:t xml:space="preserve"> </w:t>
       </w:r>
-      <w:hyperlink r:id="rId82">
+      <w:hyperlink r:id="rId103">
         <w:r>
           <w:rPr>
             <w:rStyle w:val="Hyperlink"/>
@@ -2624,8 +3288,8 @@
         <w:t xml:space="preserve">.</w:t>
       </w:r>
     </w:p>
-    <w:bookmarkEnd w:id="83"/>
-    <w:bookmarkStart w:id="84" w:name="ref-mellinger2003"/>
+    <w:bookmarkEnd w:id="104"/>
+    <w:bookmarkStart w:id="105" w:name="ref-mellinger2003"/>
     <w:p>
       <w:pPr>
         <w:pStyle w:val="Bibliography"/>
@@ -2640,8 +3304,8 @@
         <w:t xml:space="preserve">“Future Directions for Acoustic Marine Mammal Surveys: Stock Assessment and Habitat Use.”</w:t>
       </w:r>
     </w:p>
-    <w:bookmarkEnd w:id="84"/>
-    <w:bookmarkStart w:id="86" w:name="ref-paparrizos2015"/>
+    <w:bookmarkEnd w:id="105"/>
+    <w:bookmarkStart w:id="107" w:name="ref-paparrizos2015"/>
     <w:p>
       <w:pPr>
         <w:pStyle w:val="Bibliography"/>
@@ -2664,7 +3328,7 @@
       <w:r>
         <w:t xml:space="preserve"> </w:t>
       </w:r>
-      <w:hyperlink r:id="rId85">
+      <w:hyperlink r:id="rId106">
         <w:r>
           <w:rPr>
             <w:rStyle w:val="Hyperlink"/>
@@ -2676,8 +3340,8 @@
         <w:t xml:space="preserve">.</w:t>
       </w:r>
     </w:p>
-    <w:bookmarkEnd w:id="86"/>
-    <w:bookmarkStart w:id="87" w:name="ref-patro2015"/>
+    <w:bookmarkEnd w:id="107"/>
+    <w:bookmarkStart w:id="108" w:name="ref-patro2015"/>
     <w:p>
       <w:pPr>
         <w:pStyle w:val="Bibliography"/>
@@ -2692,8 +3356,8 @@
         <w:t xml:space="preserve">“Normalization: A Preprocessing Stage.”</w:t>
       </w:r>
     </w:p>
-    <w:bookmarkEnd w:id="87"/>
-    <w:bookmarkStart w:id="89" w:name="ref-picone1993"/>
+    <w:bookmarkEnd w:id="108"/>
+    <w:bookmarkStart w:id="110" w:name="ref-picone1993"/>
     <w:p>
       <w:pPr>
         <w:pStyle w:val="Bibliography"/>
@@ -2726,7 +3390,7 @@
       <w:r>
         <w:t xml:space="preserve"> </w:t>
       </w:r>
-      <w:hyperlink r:id="rId88">
+      <w:hyperlink r:id="rId109">
         <w:r>
           <w:rPr>
             <w:rStyle w:val="Hyperlink"/>
@@ -2738,8 +3402,8 @@
         <w:t xml:space="preserve">.</w:t>
       </w:r>
     </w:p>
-    <w:bookmarkEnd w:id="89"/>
-    <w:bookmarkStart w:id="91" w:name="ref-rabiner1993"/>
+    <w:bookmarkEnd w:id="110"/>
+    <w:bookmarkStart w:id="112" w:name="ref-rabiner1993"/>
     <w:p>
       <w:pPr>
         <w:pStyle w:val="Bibliography"/>
@@ -2762,7 +3426,7 @@
       <w:r>
         <w:t xml:space="preserve"> </w:t>
       </w:r>
-      <w:hyperlink r:id="rId90">
+      <w:hyperlink r:id="rId111">
         <w:r>
           <w:rPr>
             <w:rStyle w:val="Hyperlink"/>
@@ -2774,8 +3438,8 @@
         <w:t xml:space="preserve">.</w:t>
       </w:r>
     </w:p>
-    <w:bookmarkEnd w:id="91"/>
-    <w:bookmarkStart w:id="93" w:name="ref-rabiner1975"/>
+    <w:bookmarkEnd w:id="112"/>
+    <w:bookmarkStart w:id="114" w:name="ref-rabiner1975"/>
     <w:p>
       <w:pPr>
         <w:pStyle w:val="Bibliography"/>
@@ -2808,7 +3472,7 @@
       <w:r>
         <w:t xml:space="preserve"> </w:t>
       </w:r>
-      <w:hyperlink r:id="rId92">
+      <w:hyperlink r:id="rId113">
         <w:r>
           <w:rPr>
             <w:rStyle w:val="Hyperlink"/>
@@ -2820,8 +3484,8 @@
         <w:t xml:space="preserve">.</w:t>
       </w:r>
     </w:p>
-    <w:bookmarkEnd w:id="93"/>
-    <w:bookmarkStart w:id="94" w:name="ref-rankin2025"/>
+    <w:bookmarkEnd w:id="114"/>
+    <w:bookmarkStart w:id="115" w:name="ref-rankin2025"/>
     <w:p>
       <w:pPr>
         <w:pStyle w:val="Bibliography"/>
@@ -2836,8 +3500,8 @@
         <w:t xml:space="preserve">“Adrift in the California Current Survey: Passive Acoustic Monitoring in the California Current Using Drifting Recorders.”</w:t>
       </w:r>
     </w:p>
-    <w:bookmarkEnd w:id="94"/>
-    <w:bookmarkStart w:id="96" w:name="ref-sakai2026"/>
+    <w:bookmarkEnd w:id="115"/>
+    <w:bookmarkStart w:id="117" w:name="ref-sakai2026"/>
     <w:p>
       <w:pPr>
         <w:pStyle w:val="Bibliography"/>
@@ -2861,7 +3525,7 @@
       <w:r>
         <w:t xml:space="preserve"> </w:t>
       </w:r>
-      <w:hyperlink r:id="rId95">
+      <w:hyperlink r:id="rId116">
         <w:r>
           <w:rPr>
             <w:rStyle w:val="Hyperlink"/>
@@ -2873,8 +3537,8 @@
         <w:t xml:space="preserve">.</w:t>
       </w:r>
     </w:p>
-    <w:bookmarkEnd w:id="96"/>
-    <w:bookmarkStart w:id="97" w:name="ref-simonis2020"/>
+    <w:bookmarkEnd w:id="117"/>
+    <w:bookmarkStart w:id="118" w:name="ref-simonis2020"/>
     <w:p>
       <w:pPr>
         <w:pStyle w:val="Bibliography"/>
@@ -2895,8 +3559,8 @@
         <w:t xml:space="preserve">NOAA-TM-NMFS-SWFSC-630,.</w:t>
       </w:r>
     </w:p>
-    <w:bookmarkEnd w:id="97"/>
-    <w:bookmarkStart w:id="99" w:name="ref-smith2020"/>
+    <w:bookmarkEnd w:id="118"/>
+    <w:bookmarkStart w:id="120" w:name="ref-smith2020"/>
     <w:p>
       <w:pPr>
         <w:pStyle w:val="Bibliography"/>
@@ -2929,7 +3593,7 @@
       <w:r>
         <w:t xml:space="preserve"> </w:t>
       </w:r>
-      <w:hyperlink r:id="rId98">
+      <w:hyperlink r:id="rId119">
         <w:r>
           <w:rPr>
             <w:rStyle w:val="Hyperlink"/>
@@ -2941,8 +3605,8 @@
         <w:t xml:space="preserve">.</w:t>
       </w:r>
     </w:p>
-    <w:bookmarkEnd w:id="99"/>
-    <w:bookmarkStart w:id="101" w:name="ref-soldevilla2017"/>
+    <w:bookmarkEnd w:id="120"/>
+    <w:bookmarkStart w:id="122" w:name="ref-soldevilla2017"/>
     <w:p>
       <w:pPr>
         <w:pStyle w:val="Bibliography"/>
@@ -2975,7 +3639,7 @@
       <w:r>
         <w:t xml:space="preserve"> </w:t>
       </w:r>
-      <w:hyperlink r:id="rId100">
+      <w:hyperlink r:id="rId121">
         <w:r>
           <w:rPr>
             <w:rStyle w:val="Hyperlink"/>
@@ -2987,8 +3651,8 @@
         <w:t xml:space="preserve">.</w:t>
       </w:r>
     </w:p>
-    <w:bookmarkEnd w:id="101"/>
-    <w:bookmarkStart w:id="103" w:name="ref-soldevilla2008"/>
+    <w:bookmarkEnd w:id="122"/>
+    <w:bookmarkStart w:id="124" w:name="ref-soldevilla2008"/>
     <w:p>
       <w:pPr>
         <w:pStyle w:val="Bibliography"/>
@@ -3027,7 +3691,7 @@
       <w:r>
         <w:t xml:space="preserve"> </w:t>
       </w:r>
-      <w:hyperlink r:id="rId102">
+      <w:hyperlink r:id="rId123">
         <w:r>
           <w:rPr>
             <w:rStyle w:val="Hyperlink"/>
@@ -3039,8 +3703,8 @@
         <w:t xml:space="preserve">.</w:t>
       </w:r>
     </w:p>
-    <w:bookmarkEnd w:id="103"/>
-    <w:bookmarkStart w:id="105" w:name="ref-soldevilla2010"/>
+    <w:bookmarkEnd w:id="124"/>
+    <w:bookmarkStart w:id="126" w:name="ref-soldevilla2010"/>
     <w:p>
       <w:pPr>
         <w:pStyle w:val="Bibliography"/>
@@ -3073,7 +3737,7 @@
       <w:r>
         <w:t xml:space="preserve"> </w:t>
       </w:r>
-      <w:hyperlink r:id="rId104">
+      <w:hyperlink r:id="rId125">
         <w:r>
           <w:rPr>
             <w:rStyle w:val="Hyperlink"/>
@@ -3085,8 +3749,60 @@
         <w:t xml:space="preserve">.</w:t>
       </w:r>
     </w:p>
-    <w:bookmarkEnd w:id="105"/>
-    <w:bookmarkStart w:id="107" w:name="ref-vanparijs2023"/>
+    <w:bookmarkEnd w:id="126"/>
+    <w:bookmarkStart w:id="128" w:name="ref-soldevilla2011"/>
+    <w:p>
+      <w:pPr>
+        <w:pStyle w:val="Bibliography"/>
+      </w:pPr>
+      <w:r>
+        <w:t xml:space="preserve">Soldevilla, Ms, Sm Wiggins, Ja Hildebrand, Em Oleson, and Mc Ferguson. 2011.</w:t>
+      </w:r>
+      <w:r>
+        <w:t xml:space="preserve"> </w:t>
+      </w:r>
+      <w:r>
+        <w:t xml:space="preserve">“Risso</w:t>
+      </w:r>
+      <w:r>
+        <w:t xml:space="preserve">’</w:t>
+      </w:r>
+      <w:r>
+        <w:t xml:space="preserve">s and Pacific White-Sided Dolphin Habitat Modeling from Passive Acoustic Monitoring.”</w:t>
+      </w:r>
+      <w:r>
+        <w:t xml:space="preserve"> </w:t>
+      </w:r>
+      <w:r>
+        <w:rPr>
+          <w:i/>
+          <w:iCs/>
+        </w:rPr>
+        <w:t xml:space="preserve">Marine Ecology Progress Series</w:t>
+      </w:r>
+      <w:r>
+        <w:t xml:space="preserve"> </w:t>
+      </w:r>
+      <w:r>
+        <w:t xml:space="preserve">423 (February): 247–60.</w:t>
+      </w:r>
+      <w:r>
+        <w:t xml:space="preserve"> </w:t>
+      </w:r>
+      <w:hyperlink r:id="rId127">
+        <w:r>
+          <w:rPr>
+            <w:rStyle w:val="Hyperlink"/>
+          </w:rPr>
+          <w:t xml:space="preserve">https://doi.org/10.3354/meps08927</w:t>
+        </w:r>
+      </w:hyperlink>
+      <w:r>
+        <w:t xml:space="preserve">.</w:t>
+      </w:r>
+    </w:p>
+    <w:bookmarkEnd w:id="128"/>
+    <w:bookmarkStart w:id="130" w:name="ref-vanparijs2023"/>
     <w:p>
       <w:pPr>
         <w:pStyle w:val="Bibliography"/>
@@ -3116,7 +3832,7 @@
       <w:r>
         <w:t xml:space="preserve"> </w:t>
       </w:r>
-      <w:hyperlink r:id="rId106">
+      <w:hyperlink r:id="rId129">
         <w:r>
           <w:rPr>
             <w:rStyle w:val="Hyperlink"/>
@@ -3128,9 +3844,9 @@
         <w:t xml:space="preserve">.</w:t>
       </w:r>
     </w:p>
-    <w:bookmarkEnd w:id="107"/>
-    <w:bookmarkEnd w:id="108"/>
-    <w:bookmarkEnd w:id="109"/>
+    <w:bookmarkEnd w:id="130"/>
+    <w:bookmarkEnd w:id="131"/>
+    <w:bookmarkEnd w:id="132"/>
     <w:sectPr/>
   </w:body>
 </w:document>

</xml_diff>